<commit_message>
Make notes for 28/228
</commit_message>
<xml_diff>
--- a/section28_applicationProgrammingInterfaces/section28_APINotes.docx
+++ b/section28_applicationProgrammingInterfaces/section28_APINotes.docx
@@ -5761,6 +5761,2395 @@
       <w:pPr>
         <w:rPr>
           <w:rFonts w:ascii="Times New Roman" w:hAnsi="Times New Roman" w:cs="Times New Roman"/>
+          <w:b/>
+          <w:bCs/>
+          <w:sz w:val="28"/>
+          <w:szCs w:val="28"/>
+        </w:rPr>
+      </w:pPr>
+      <w:r>
+        <w:rPr>
+          <w:rFonts w:ascii="Times New Roman" w:hAnsi="Times New Roman" w:cs="Times New Roman"/>
+          <w:b/>
+          <w:bCs/>
+          <w:sz w:val="28"/>
+          <w:szCs w:val="28"/>
+        </w:rPr>
+        <w:t>228. API Authentication and Authorisation</w:t>
+      </w:r>
+    </w:p>
+    <w:p>
+      <w:pPr>
+        <w:pStyle w:val="ListParagraph"/>
+        <w:numPr>
+          <w:ilvl w:val="0"/>
+          <w:numId w:val="5"/>
+        </w:numPr>
+        <w:rPr>
+          <w:rFonts w:ascii="Times New Roman" w:hAnsi="Times New Roman" w:cs="Times New Roman"/>
+          <w:sz w:val="28"/>
+          <w:szCs w:val="28"/>
+        </w:rPr>
+      </w:pPr>
+      <w:r>
+        <w:rPr>
+          <w:rFonts w:ascii="Times New Roman" w:hAnsi="Times New Roman" w:cs="Times New Roman"/>
+          <w:sz w:val="28"/>
+          <w:szCs w:val="28"/>
+        </w:rPr>
+        <w:t>API authentication is the process of verifying the identity of an application or user attempting to access an API.</w:t>
+      </w:r>
+    </w:p>
+    <w:p>
+      <w:pPr>
+        <w:pStyle w:val="ListParagraph"/>
+        <w:numPr>
+          <w:ilvl w:val="0"/>
+          <w:numId w:val="5"/>
+        </w:numPr>
+        <w:rPr>
+          <w:rFonts w:ascii="Times New Roman" w:hAnsi="Times New Roman" w:cs="Times New Roman"/>
+          <w:sz w:val="28"/>
+          <w:szCs w:val="28"/>
+        </w:rPr>
+      </w:pPr>
+      <w:r>
+        <w:rPr>
+          <w:rFonts w:ascii="Times New Roman" w:hAnsi="Times New Roman" w:cs="Times New Roman"/>
+          <w:sz w:val="28"/>
+          <w:szCs w:val="28"/>
+        </w:rPr>
+        <w:t>This ensures that only authorized users or applications can interact with the API, protecting sensitive data and functionalities from unauthorized access.</w:t>
+      </w:r>
+    </w:p>
+    <w:p>
+      <w:pPr>
+        <w:pStyle w:val="ListParagraph"/>
+        <w:numPr>
+          <w:ilvl w:val="0"/>
+          <w:numId w:val="5"/>
+        </w:numPr>
+        <w:rPr>
+          <w:rFonts w:ascii="Times New Roman" w:hAnsi="Times New Roman" w:cs="Times New Roman"/>
+          <w:sz w:val="28"/>
+          <w:szCs w:val="28"/>
+        </w:rPr>
+      </w:pPr>
+      <w:r>
+        <w:rPr>
+          <w:rFonts w:ascii="Times New Roman" w:hAnsi="Times New Roman" w:cs="Times New Roman"/>
+          <w:sz w:val="28"/>
+          <w:szCs w:val="28"/>
+        </w:rPr>
+        <w:t>T</w:t>
+      </w:r>
+      <w:r>
+        <w:rPr>
+          <w:rFonts w:ascii="Times New Roman" w:hAnsi="Times New Roman" w:cs="Times New Roman"/>
+          <w:sz w:val="28"/>
+          <w:szCs w:val="28"/>
+        </w:rPr>
+        <w:t>here are several methods of API authentication, each with its own use cases and security implications. Here are some common methods:</w:t>
+      </w:r>
+    </w:p>
+    <w:p>
+      <w:pPr>
+        <w:pStyle w:val="ListParagraph"/>
+        <w:numPr>
+          <w:ilvl w:val="1"/>
+          <w:numId w:val="5"/>
+        </w:numPr>
+        <w:rPr>
+          <w:rFonts w:ascii="Times New Roman" w:hAnsi="Times New Roman" w:cs="Times New Roman"/>
+          <w:sz w:val="28"/>
+          <w:szCs w:val="28"/>
+        </w:rPr>
+      </w:pPr>
+      <w:r>
+        <w:rPr>
+          <w:rFonts w:ascii="Times New Roman" w:hAnsi="Times New Roman" w:cs="Times New Roman"/>
+          <w:sz w:val="28"/>
+          <w:szCs w:val="28"/>
+        </w:rPr>
+        <w:t>No authentication (rate limit</w:t>
+      </w:r>
+      <w:r>
+        <w:rPr>
+          <w:rFonts w:ascii="Times New Roman" w:hAnsi="Times New Roman" w:cs="Times New Roman"/>
+          <w:sz w:val="28"/>
+          <w:szCs w:val="28"/>
+        </w:rPr>
+        <w:t>ing</w:t>
+      </w:r>
+      <w:r>
+        <w:rPr>
+          <w:rFonts w:ascii="Times New Roman" w:hAnsi="Times New Roman" w:cs="Times New Roman"/>
+          <w:sz w:val="28"/>
+          <w:szCs w:val="28"/>
+        </w:rPr>
+        <w:t>)</w:t>
+      </w:r>
+      <w:r>
+        <w:rPr>
+          <w:rFonts w:ascii="Times New Roman" w:hAnsi="Times New Roman" w:cs="Times New Roman"/>
+          <w:sz w:val="28"/>
+          <w:szCs w:val="28"/>
+        </w:rPr>
+        <w:t>:</w:t>
+      </w:r>
+    </w:p>
+    <w:p>
+      <w:pPr>
+        <w:pStyle w:val="ListParagraph"/>
+        <w:numPr>
+          <w:ilvl w:val="2"/>
+          <w:numId w:val="5"/>
+        </w:numPr>
+        <w:rPr>
+          <w:rFonts w:ascii="Times New Roman" w:hAnsi="Times New Roman" w:cs="Times New Roman"/>
+          <w:sz w:val="28"/>
+          <w:szCs w:val="28"/>
+        </w:rPr>
+      </w:pPr>
+      <w:r>
+        <w:rPr>
+          <w:rFonts w:ascii="Times New Roman" w:hAnsi="Times New Roman" w:cs="Times New Roman"/>
+          <w:sz w:val="28"/>
+          <w:szCs w:val="28"/>
+        </w:rPr>
+        <w:t>Uses requests/</w:t>
+      </w:r>
+      <w:proofErr w:type="spellStart"/>
+      <w:r>
+        <w:rPr>
+          <w:rFonts w:ascii="Times New Roman" w:hAnsi="Times New Roman" w:cs="Times New Roman"/>
+          <w:sz w:val="28"/>
+          <w:szCs w:val="28"/>
+        </w:rPr>
+        <w:t>timeUnit</w:t>
+      </w:r>
+      <w:proofErr w:type="spellEnd"/>
+      <w:r>
+        <w:rPr>
+          <w:rFonts w:ascii="Times New Roman" w:hAnsi="Times New Roman" w:cs="Times New Roman"/>
+          <w:sz w:val="28"/>
+          <w:szCs w:val="28"/>
+        </w:rPr>
+        <w:t>(s).</w:t>
+      </w:r>
+    </w:p>
+    <w:p>
+      <w:pPr>
+        <w:pStyle w:val="ListParagraph"/>
+        <w:numPr>
+          <w:ilvl w:val="2"/>
+          <w:numId w:val="5"/>
+        </w:numPr>
+        <w:rPr>
+          <w:rFonts w:ascii="Times New Roman" w:hAnsi="Times New Roman" w:cs="Times New Roman"/>
+          <w:sz w:val="28"/>
+          <w:szCs w:val="28"/>
+        </w:rPr>
+      </w:pPr>
+      <w:r>
+        <w:rPr>
+          <w:rFonts w:ascii="Times New Roman" w:hAnsi="Times New Roman" w:cs="Times New Roman"/>
+          <w:sz w:val="28"/>
+          <w:szCs w:val="28"/>
+        </w:rPr>
+        <w:t>E.g. 100 requests/15 minutes</w:t>
+      </w:r>
+    </w:p>
+    <w:p>
+      <w:pPr>
+        <w:shd w:val="clear" w:color="auto" w:fill="1F1F1F"/>
+        <w:spacing w:after="0" w:line="360" w:lineRule="atLeast"/>
+        <w:rPr>
+          <w:rFonts w:ascii="Consolas" w:eastAsia="Times New Roman" w:hAnsi="Consolas" w:cs="Times New Roman"/>
+          <w:color w:val="CCCCCC"/>
+          <w:kern w:val="0"/>
+          <w:sz w:val="27"/>
+          <w:szCs w:val="27"/>
+          <w:lang w:eastAsia="en-IN"/>
+          <w14:ligatures w14:val="none"/>
+        </w:rPr>
+      </w:pPr>
+      <w:proofErr w:type="spellStart"/>
+      <w:r>
+        <w:rPr>
+          <w:rFonts w:ascii="Consolas" w:eastAsia="Times New Roman" w:hAnsi="Consolas" w:cs="Times New Roman"/>
+          <w:color w:val="569CD6"/>
+          <w:kern w:val="0"/>
+          <w:sz w:val="27"/>
+          <w:szCs w:val="27"/>
+          <w:lang w:eastAsia="en-IN"/>
+          <w14:ligatures w14:val="none"/>
+        </w:rPr>
+        <w:t>const</w:t>
+      </w:r>
+      <w:proofErr w:type="spellEnd"/>
+      <w:r>
+        <w:rPr>
+          <w:rFonts w:ascii="Consolas" w:eastAsia="Times New Roman" w:hAnsi="Consolas" w:cs="Times New Roman"/>
+          <w:color w:val="CCCCCC"/>
+          <w:kern w:val="0"/>
+          <w:sz w:val="27"/>
+          <w:szCs w:val="27"/>
+          <w:lang w:eastAsia="en-IN"/>
+          <w14:ligatures w14:val="none"/>
+        </w:rPr>
+        <w:t xml:space="preserve"> </w:t>
+      </w:r>
+      <w:r>
+        <w:rPr>
+          <w:rFonts w:ascii="Consolas" w:eastAsia="Times New Roman" w:hAnsi="Consolas" w:cs="Times New Roman"/>
+          <w:color w:val="4FC1FF"/>
+          <w:kern w:val="0"/>
+          <w:sz w:val="27"/>
+          <w:szCs w:val="27"/>
+          <w:lang w:eastAsia="en-IN"/>
+          <w14:ligatures w14:val="none"/>
+        </w:rPr>
+        <w:t>result</w:t>
+      </w:r>
+      <w:r>
+        <w:rPr>
+          <w:rFonts w:ascii="Consolas" w:eastAsia="Times New Roman" w:hAnsi="Consolas" w:cs="Times New Roman"/>
+          <w:color w:val="CCCCCC"/>
+          <w:kern w:val="0"/>
+          <w:sz w:val="27"/>
+          <w:szCs w:val="27"/>
+          <w:lang w:eastAsia="en-IN"/>
+          <w14:ligatures w14:val="none"/>
+        </w:rPr>
+        <w:t xml:space="preserve"> </w:t>
+      </w:r>
+      <w:r>
+        <w:rPr>
+          <w:rFonts w:ascii="Consolas" w:eastAsia="Times New Roman" w:hAnsi="Consolas" w:cs="Times New Roman"/>
+          <w:color w:val="D4D4D4"/>
+          <w:kern w:val="0"/>
+          <w:sz w:val="27"/>
+          <w:szCs w:val="27"/>
+          <w:lang w:eastAsia="en-IN"/>
+          <w14:ligatures w14:val="none"/>
+        </w:rPr>
+        <w:t>=</w:t>
+      </w:r>
+      <w:r>
+        <w:rPr>
+          <w:rFonts w:ascii="Consolas" w:eastAsia="Times New Roman" w:hAnsi="Consolas" w:cs="Times New Roman"/>
+          <w:color w:val="CCCCCC"/>
+          <w:kern w:val="0"/>
+          <w:sz w:val="27"/>
+          <w:szCs w:val="27"/>
+          <w:lang w:eastAsia="en-IN"/>
+          <w14:ligatures w14:val="none"/>
+        </w:rPr>
+        <w:t xml:space="preserve"> </w:t>
+      </w:r>
+      <w:r>
+        <w:rPr>
+          <w:rFonts w:ascii="Consolas" w:eastAsia="Times New Roman" w:hAnsi="Consolas" w:cs="Times New Roman"/>
+          <w:color w:val="C586C0"/>
+          <w:kern w:val="0"/>
+          <w:sz w:val="27"/>
+          <w:szCs w:val="27"/>
+          <w:lang w:eastAsia="en-IN"/>
+          <w14:ligatures w14:val="none"/>
+        </w:rPr>
+        <w:t>await</w:t>
+      </w:r>
+      <w:r>
+        <w:rPr>
+          <w:rFonts w:ascii="Consolas" w:eastAsia="Times New Roman" w:hAnsi="Consolas" w:cs="Times New Roman"/>
+          <w:color w:val="CCCCCC"/>
+          <w:kern w:val="0"/>
+          <w:sz w:val="27"/>
+          <w:szCs w:val="27"/>
+          <w:lang w:eastAsia="en-IN"/>
+          <w14:ligatures w14:val="none"/>
+        </w:rPr>
+        <w:t xml:space="preserve"> </w:t>
+      </w:r>
+      <w:proofErr w:type="spellStart"/>
+      <w:r>
+        <w:rPr>
+          <w:rFonts w:ascii="Consolas" w:eastAsia="Times New Roman" w:hAnsi="Consolas" w:cs="Times New Roman"/>
+          <w:color w:val="4FC1FF"/>
+          <w:kern w:val="0"/>
+          <w:sz w:val="27"/>
+          <w:szCs w:val="27"/>
+          <w:lang w:eastAsia="en-IN"/>
+          <w14:ligatures w14:val="none"/>
+        </w:rPr>
+        <w:t>axios</w:t>
+      </w:r>
+      <w:r>
+        <w:rPr>
+          <w:rFonts w:ascii="Consolas" w:eastAsia="Times New Roman" w:hAnsi="Consolas" w:cs="Times New Roman"/>
+          <w:color w:val="CCCCCC"/>
+          <w:kern w:val="0"/>
+          <w:sz w:val="27"/>
+          <w:szCs w:val="27"/>
+          <w:lang w:eastAsia="en-IN"/>
+          <w14:ligatures w14:val="none"/>
+        </w:rPr>
+        <w:t>.</w:t>
+      </w:r>
+      <w:r>
+        <w:rPr>
+          <w:rFonts w:ascii="Consolas" w:eastAsia="Times New Roman" w:hAnsi="Consolas" w:cs="Times New Roman"/>
+          <w:color w:val="DCDCAA"/>
+          <w:kern w:val="0"/>
+          <w:sz w:val="27"/>
+          <w:szCs w:val="27"/>
+          <w:lang w:eastAsia="en-IN"/>
+          <w14:ligatures w14:val="none"/>
+        </w:rPr>
+        <w:t>get</w:t>
+      </w:r>
+      <w:proofErr w:type="spellEnd"/>
+      <w:r>
+        <w:rPr>
+          <w:rFonts w:ascii="Consolas" w:eastAsia="Times New Roman" w:hAnsi="Consolas" w:cs="Times New Roman"/>
+          <w:color w:val="CCCCCC"/>
+          <w:kern w:val="0"/>
+          <w:sz w:val="27"/>
+          <w:szCs w:val="27"/>
+          <w:lang w:eastAsia="en-IN"/>
+          <w14:ligatures w14:val="none"/>
+        </w:rPr>
+        <w:t>(</w:t>
+      </w:r>
+      <w:r>
+        <w:rPr>
+          <w:rFonts w:ascii="Consolas" w:eastAsia="Times New Roman" w:hAnsi="Consolas" w:cs="Times New Roman"/>
+          <w:color w:val="CE9178"/>
+          <w:kern w:val="0"/>
+          <w:sz w:val="27"/>
+          <w:szCs w:val="27"/>
+          <w:lang w:eastAsia="en-IN"/>
+          <w14:ligatures w14:val="none"/>
+        </w:rPr>
+        <w:t>`</w:t>
+      </w:r>
+      <w:r>
+        <w:rPr>
+          <w:rFonts w:ascii="Consolas" w:eastAsia="Times New Roman" w:hAnsi="Consolas" w:cs="Times New Roman"/>
+          <w:color w:val="569CD6"/>
+          <w:kern w:val="0"/>
+          <w:sz w:val="27"/>
+          <w:szCs w:val="27"/>
+          <w:lang w:eastAsia="en-IN"/>
+          <w14:ligatures w14:val="none"/>
+        </w:rPr>
+        <w:t>${</w:t>
+      </w:r>
+      <w:r>
+        <w:rPr>
+          <w:rFonts w:ascii="Consolas" w:eastAsia="Times New Roman" w:hAnsi="Consolas" w:cs="Times New Roman"/>
+          <w:color w:val="4FC1FF"/>
+          <w:kern w:val="0"/>
+          <w:sz w:val="27"/>
+          <w:szCs w:val="27"/>
+          <w:lang w:eastAsia="en-IN"/>
+          <w14:ligatures w14:val="none"/>
+        </w:rPr>
+        <w:t>API_URL</w:t>
+      </w:r>
+      <w:r>
+        <w:rPr>
+          <w:rFonts w:ascii="Consolas" w:eastAsia="Times New Roman" w:hAnsi="Consolas" w:cs="Times New Roman"/>
+          <w:color w:val="569CD6"/>
+          <w:kern w:val="0"/>
+          <w:sz w:val="27"/>
+          <w:szCs w:val="27"/>
+          <w:lang w:eastAsia="en-IN"/>
+          <w14:ligatures w14:val="none"/>
+        </w:rPr>
+        <w:t>}</w:t>
+      </w:r>
+      <w:r>
+        <w:rPr>
+          <w:rFonts w:ascii="Consolas" w:eastAsia="Times New Roman" w:hAnsi="Consolas" w:cs="Times New Roman"/>
+          <w:color w:val="CE9178"/>
+          <w:kern w:val="0"/>
+          <w:sz w:val="27"/>
+          <w:szCs w:val="27"/>
+          <w:lang w:eastAsia="en-IN"/>
+          <w14:ligatures w14:val="none"/>
+        </w:rPr>
+        <w:t>/random`</w:t>
+      </w:r>
+      <w:r>
+        <w:rPr>
+          <w:rFonts w:ascii="Consolas" w:eastAsia="Times New Roman" w:hAnsi="Consolas" w:cs="Times New Roman"/>
+          <w:color w:val="CCCCCC"/>
+          <w:kern w:val="0"/>
+          <w:sz w:val="27"/>
+          <w:szCs w:val="27"/>
+          <w:lang w:eastAsia="en-IN"/>
+          <w14:ligatures w14:val="none"/>
+        </w:rPr>
+        <w:t>)</w:t>
+      </w:r>
+      <w:r>
+        <w:rPr>
+          <w:rFonts w:ascii="Consolas" w:eastAsia="Times New Roman" w:hAnsi="Consolas" w:cs="Times New Roman"/>
+          <w:color w:val="CCCCCC"/>
+          <w:kern w:val="0"/>
+          <w:sz w:val="27"/>
+          <w:szCs w:val="27"/>
+          <w:lang w:eastAsia="en-IN"/>
+          <w14:ligatures w14:val="none"/>
+        </w:rPr>
+        <w:t>;</w:t>
+      </w:r>
+    </w:p>
+    <w:p>
+      <w:pPr>
+        <w:pStyle w:val="ListParagraph"/>
+        <w:numPr>
+          <w:ilvl w:val="1"/>
+          <w:numId w:val="5"/>
+        </w:numPr>
+        <w:rPr>
+          <w:rFonts w:ascii="Times New Roman" w:hAnsi="Times New Roman" w:cs="Times New Roman"/>
+          <w:sz w:val="28"/>
+          <w:szCs w:val="28"/>
+        </w:rPr>
+      </w:pPr>
+      <w:r>
+        <w:rPr>
+          <w:rFonts w:ascii="Times New Roman" w:hAnsi="Times New Roman" w:cs="Times New Roman"/>
+          <w:sz w:val="28"/>
+          <w:szCs w:val="28"/>
+        </w:rPr>
+        <w:t>Basic authentication</w:t>
+      </w:r>
+    </w:p>
+    <w:p>
+      <w:pPr>
+        <w:pStyle w:val="ListParagraph"/>
+        <w:numPr>
+          <w:ilvl w:val="2"/>
+          <w:numId w:val="5"/>
+        </w:numPr>
+        <w:rPr>
+          <w:rFonts w:ascii="Times New Roman" w:hAnsi="Times New Roman" w:cs="Times New Roman"/>
+          <w:sz w:val="28"/>
+          <w:szCs w:val="28"/>
+        </w:rPr>
+      </w:pPr>
+      <w:r>
+        <w:rPr>
+          <w:rFonts w:ascii="Times New Roman" w:hAnsi="Times New Roman" w:cs="Times New Roman"/>
+          <w:sz w:val="28"/>
+          <w:szCs w:val="28"/>
+        </w:rPr>
+        <w:t>Uses a username and password.</w:t>
+      </w:r>
+    </w:p>
+    <w:p>
+      <w:pPr>
+        <w:pStyle w:val="ListParagraph"/>
+        <w:numPr>
+          <w:ilvl w:val="2"/>
+          <w:numId w:val="5"/>
+        </w:numPr>
+        <w:rPr>
+          <w:rFonts w:ascii="Times New Roman" w:hAnsi="Times New Roman" w:cs="Times New Roman"/>
+          <w:sz w:val="28"/>
+          <w:szCs w:val="28"/>
+        </w:rPr>
+      </w:pPr>
+      <w:r>
+        <w:rPr>
+          <w:rFonts w:ascii="Times New Roman" w:hAnsi="Times New Roman" w:cs="Times New Roman"/>
+          <w:sz w:val="28"/>
+          <w:szCs w:val="28"/>
+        </w:rPr>
+        <w:t>We provide these credentials while getting response from API.</w:t>
+      </w:r>
+    </w:p>
+    <w:p>
+      <w:pPr>
+        <w:pStyle w:val="ListParagraph"/>
+        <w:numPr>
+          <w:ilvl w:val="2"/>
+          <w:numId w:val="5"/>
+        </w:numPr>
+        <w:rPr>
+          <w:rFonts w:ascii="Times New Roman" w:hAnsi="Times New Roman" w:cs="Times New Roman"/>
+          <w:sz w:val="28"/>
+          <w:szCs w:val="28"/>
+        </w:rPr>
+      </w:pPr>
+      <w:r>
+        <w:rPr>
+          <w:rFonts w:ascii="Times New Roman" w:hAnsi="Times New Roman" w:cs="Times New Roman"/>
+          <w:sz w:val="28"/>
+          <w:szCs w:val="28"/>
+        </w:rPr>
+        <w:t xml:space="preserve">Uses Base64 encoding. </w:t>
+      </w:r>
+    </w:p>
+    <w:p>
+      <w:pPr>
+        <w:pStyle w:val="ListParagraph"/>
+        <w:numPr>
+          <w:ilvl w:val="2"/>
+          <w:numId w:val="5"/>
+        </w:numPr>
+        <w:rPr>
+          <w:rFonts w:ascii="Courier New" w:hAnsi="Courier New" w:cs="Courier New"/>
+          <w:sz w:val="28"/>
+          <w:szCs w:val="28"/>
+        </w:rPr>
+      </w:pPr>
+      <w:r>
+        <w:rPr>
+          <w:rFonts w:ascii="Courier New" w:hAnsi="Courier New" w:cs="Courier New"/>
+          <w:sz w:val="28"/>
+          <w:szCs w:val="28"/>
+        </w:rPr>
+        <w:t>{</w:t>
+      </w:r>
+      <w:r>
+        <w:rPr>
+          <w:rFonts w:ascii="Courier New" w:hAnsi="Courier New" w:cs="Courier New"/>
+          <w:sz w:val="28"/>
+          <w:szCs w:val="28"/>
+        </w:rPr>
+        <w:br/>
+        <w:t xml:space="preserve">    username: </w:t>
+      </w:r>
+      <w:r>
+        <w:rPr>
+          <w:rFonts w:ascii="Courier New" w:hAnsi="Courier New" w:cs="Courier New"/>
+          <w:sz w:val="28"/>
+          <w:szCs w:val="28"/>
+        </w:rPr>
+        <w:br/>
+        <w:t xml:space="preserve">    </w:t>
+      </w:r>
+      <w:r>
+        <w:rPr>
+          <w:rFonts w:ascii="Courier New" w:hAnsi="Courier New" w:cs="Courier New"/>
+          <w:sz w:val="28"/>
+          <w:szCs w:val="28"/>
+        </w:rPr>
+        <w:t>password:</w:t>
+      </w:r>
+      <w:r>
+        <w:rPr>
+          <w:rFonts w:ascii="Courier New" w:hAnsi="Courier New" w:cs="Courier New"/>
+          <w:sz w:val="28"/>
+          <w:szCs w:val="28"/>
+        </w:rPr>
+        <w:br/>
+        <w:t>}</w:t>
+      </w:r>
+    </w:p>
+    <w:p>
+      <w:pPr>
+        <w:shd w:val="clear" w:color="auto" w:fill="1F1F1F"/>
+        <w:spacing w:after="0" w:line="360" w:lineRule="atLeast"/>
+        <w:rPr>
+          <w:rFonts w:ascii="Consolas" w:eastAsia="Times New Roman" w:hAnsi="Consolas" w:cs="Times New Roman"/>
+          <w:color w:val="CCCCCC"/>
+          <w:kern w:val="0"/>
+          <w:sz w:val="27"/>
+          <w:szCs w:val="27"/>
+          <w:lang w:eastAsia="en-IN"/>
+          <w14:ligatures w14:val="none"/>
+        </w:rPr>
+      </w:pPr>
+      <w:proofErr w:type="spellStart"/>
+      <w:r>
+        <w:rPr>
+          <w:rFonts w:ascii="Consolas" w:eastAsia="Times New Roman" w:hAnsi="Consolas" w:cs="Times New Roman"/>
+          <w:color w:val="569CD6"/>
+          <w:kern w:val="0"/>
+          <w:sz w:val="27"/>
+          <w:szCs w:val="27"/>
+          <w:lang w:eastAsia="en-IN"/>
+          <w14:ligatures w14:val="none"/>
+        </w:rPr>
+        <w:t>const</w:t>
+      </w:r>
+      <w:proofErr w:type="spellEnd"/>
+      <w:r>
+        <w:rPr>
+          <w:rFonts w:ascii="Consolas" w:eastAsia="Times New Roman" w:hAnsi="Consolas" w:cs="Times New Roman"/>
+          <w:color w:val="CCCCCC"/>
+          <w:kern w:val="0"/>
+          <w:sz w:val="27"/>
+          <w:szCs w:val="27"/>
+          <w:lang w:eastAsia="en-IN"/>
+          <w14:ligatures w14:val="none"/>
+        </w:rPr>
+        <w:t xml:space="preserve"> </w:t>
+      </w:r>
+      <w:r>
+        <w:rPr>
+          <w:rFonts w:ascii="Consolas" w:eastAsia="Times New Roman" w:hAnsi="Consolas" w:cs="Times New Roman"/>
+          <w:color w:val="4FC1FF"/>
+          <w:kern w:val="0"/>
+          <w:sz w:val="27"/>
+          <w:szCs w:val="27"/>
+          <w:lang w:eastAsia="en-IN"/>
+          <w14:ligatures w14:val="none"/>
+        </w:rPr>
+        <w:t>result</w:t>
+      </w:r>
+      <w:r>
+        <w:rPr>
+          <w:rFonts w:ascii="Consolas" w:eastAsia="Times New Roman" w:hAnsi="Consolas" w:cs="Times New Roman"/>
+          <w:color w:val="CCCCCC"/>
+          <w:kern w:val="0"/>
+          <w:sz w:val="27"/>
+          <w:szCs w:val="27"/>
+          <w:lang w:eastAsia="en-IN"/>
+          <w14:ligatures w14:val="none"/>
+        </w:rPr>
+        <w:t xml:space="preserve"> </w:t>
+      </w:r>
+      <w:r>
+        <w:rPr>
+          <w:rFonts w:ascii="Consolas" w:eastAsia="Times New Roman" w:hAnsi="Consolas" w:cs="Times New Roman"/>
+          <w:color w:val="D4D4D4"/>
+          <w:kern w:val="0"/>
+          <w:sz w:val="27"/>
+          <w:szCs w:val="27"/>
+          <w:lang w:eastAsia="en-IN"/>
+          <w14:ligatures w14:val="none"/>
+        </w:rPr>
+        <w:t>=</w:t>
+      </w:r>
+      <w:r>
+        <w:rPr>
+          <w:rFonts w:ascii="Consolas" w:eastAsia="Times New Roman" w:hAnsi="Consolas" w:cs="Times New Roman"/>
+          <w:color w:val="CCCCCC"/>
+          <w:kern w:val="0"/>
+          <w:sz w:val="27"/>
+          <w:szCs w:val="27"/>
+          <w:lang w:eastAsia="en-IN"/>
+          <w14:ligatures w14:val="none"/>
+        </w:rPr>
+        <w:t xml:space="preserve"> </w:t>
+      </w:r>
+      <w:r>
+        <w:rPr>
+          <w:rFonts w:ascii="Consolas" w:eastAsia="Times New Roman" w:hAnsi="Consolas" w:cs="Times New Roman"/>
+          <w:color w:val="C586C0"/>
+          <w:kern w:val="0"/>
+          <w:sz w:val="27"/>
+          <w:szCs w:val="27"/>
+          <w:lang w:eastAsia="en-IN"/>
+          <w14:ligatures w14:val="none"/>
+        </w:rPr>
+        <w:t>await</w:t>
+      </w:r>
+      <w:r>
+        <w:rPr>
+          <w:rFonts w:ascii="Consolas" w:eastAsia="Times New Roman" w:hAnsi="Consolas" w:cs="Times New Roman"/>
+          <w:color w:val="CCCCCC"/>
+          <w:kern w:val="0"/>
+          <w:sz w:val="27"/>
+          <w:szCs w:val="27"/>
+          <w:lang w:eastAsia="en-IN"/>
+          <w14:ligatures w14:val="none"/>
+        </w:rPr>
+        <w:t xml:space="preserve"> </w:t>
+      </w:r>
+      <w:proofErr w:type="spellStart"/>
+      <w:r>
+        <w:rPr>
+          <w:rFonts w:ascii="Consolas" w:eastAsia="Times New Roman" w:hAnsi="Consolas" w:cs="Times New Roman"/>
+          <w:color w:val="4FC1FF"/>
+          <w:kern w:val="0"/>
+          <w:sz w:val="27"/>
+          <w:szCs w:val="27"/>
+          <w:lang w:eastAsia="en-IN"/>
+          <w14:ligatures w14:val="none"/>
+        </w:rPr>
+        <w:t>axios</w:t>
+      </w:r>
+      <w:r>
+        <w:rPr>
+          <w:rFonts w:ascii="Consolas" w:eastAsia="Times New Roman" w:hAnsi="Consolas" w:cs="Times New Roman"/>
+          <w:color w:val="CCCCCC"/>
+          <w:kern w:val="0"/>
+          <w:sz w:val="27"/>
+          <w:szCs w:val="27"/>
+          <w:lang w:eastAsia="en-IN"/>
+          <w14:ligatures w14:val="none"/>
+        </w:rPr>
+        <w:t>.</w:t>
+      </w:r>
+      <w:r>
+        <w:rPr>
+          <w:rFonts w:ascii="Consolas" w:eastAsia="Times New Roman" w:hAnsi="Consolas" w:cs="Times New Roman"/>
+          <w:color w:val="DCDCAA"/>
+          <w:kern w:val="0"/>
+          <w:sz w:val="27"/>
+          <w:szCs w:val="27"/>
+          <w:lang w:eastAsia="en-IN"/>
+          <w14:ligatures w14:val="none"/>
+        </w:rPr>
+        <w:t>get</w:t>
+      </w:r>
+      <w:proofErr w:type="spellEnd"/>
+      <w:r>
+        <w:rPr>
+          <w:rFonts w:ascii="Consolas" w:eastAsia="Times New Roman" w:hAnsi="Consolas" w:cs="Times New Roman"/>
+          <w:color w:val="CCCCCC"/>
+          <w:kern w:val="0"/>
+          <w:sz w:val="27"/>
+          <w:szCs w:val="27"/>
+          <w:lang w:eastAsia="en-IN"/>
+          <w14:ligatures w14:val="none"/>
+        </w:rPr>
+        <w:t>(</w:t>
+      </w:r>
+      <w:r>
+        <w:rPr>
+          <w:rFonts w:ascii="Consolas" w:eastAsia="Times New Roman" w:hAnsi="Consolas" w:cs="Times New Roman"/>
+          <w:color w:val="CE9178"/>
+          <w:kern w:val="0"/>
+          <w:sz w:val="27"/>
+          <w:szCs w:val="27"/>
+          <w:lang w:eastAsia="en-IN"/>
+          <w14:ligatures w14:val="none"/>
+        </w:rPr>
+        <w:t>`</w:t>
+      </w:r>
+      <w:r>
+        <w:rPr>
+          <w:rFonts w:ascii="Consolas" w:eastAsia="Times New Roman" w:hAnsi="Consolas" w:cs="Times New Roman"/>
+          <w:color w:val="569CD6"/>
+          <w:kern w:val="0"/>
+          <w:sz w:val="27"/>
+          <w:szCs w:val="27"/>
+          <w:lang w:eastAsia="en-IN"/>
+          <w14:ligatures w14:val="none"/>
+        </w:rPr>
+        <w:t>${</w:t>
+      </w:r>
+      <w:r>
+        <w:rPr>
+          <w:rFonts w:ascii="Consolas" w:eastAsia="Times New Roman" w:hAnsi="Consolas" w:cs="Times New Roman"/>
+          <w:color w:val="4FC1FF"/>
+          <w:kern w:val="0"/>
+          <w:sz w:val="27"/>
+          <w:szCs w:val="27"/>
+          <w:lang w:eastAsia="en-IN"/>
+          <w14:ligatures w14:val="none"/>
+        </w:rPr>
+        <w:t>API_URL</w:t>
+      </w:r>
+      <w:r>
+        <w:rPr>
+          <w:rFonts w:ascii="Consolas" w:eastAsia="Times New Roman" w:hAnsi="Consolas" w:cs="Times New Roman"/>
+          <w:color w:val="569CD6"/>
+          <w:kern w:val="0"/>
+          <w:sz w:val="27"/>
+          <w:szCs w:val="27"/>
+          <w:lang w:eastAsia="en-IN"/>
+          <w14:ligatures w14:val="none"/>
+        </w:rPr>
+        <w:t>}</w:t>
+      </w:r>
+      <w:r>
+        <w:rPr>
+          <w:rFonts w:ascii="Consolas" w:eastAsia="Times New Roman" w:hAnsi="Consolas" w:cs="Times New Roman"/>
+          <w:color w:val="CE9178"/>
+          <w:kern w:val="0"/>
+          <w:sz w:val="27"/>
+          <w:szCs w:val="27"/>
+          <w:lang w:eastAsia="en-IN"/>
+          <w14:ligatures w14:val="none"/>
+        </w:rPr>
+        <w:t>/</w:t>
+      </w:r>
+      <w:proofErr w:type="spellStart"/>
+      <w:r>
+        <w:rPr>
+          <w:rFonts w:ascii="Consolas" w:eastAsia="Times New Roman" w:hAnsi="Consolas" w:cs="Times New Roman"/>
+          <w:color w:val="CE9178"/>
+          <w:kern w:val="0"/>
+          <w:sz w:val="27"/>
+          <w:szCs w:val="27"/>
+          <w:lang w:eastAsia="en-IN"/>
+          <w14:ligatures w14:val="none"/>
+        </w:rPr>
+        <w:t>all?page</w:t>
+      </w:r>
+      <w:proofErr w:type="spellEnd"/>
+      <w:r>
+        <w:rPr>
+          <w:rFonts w:ascii="Consolas" w:eastAsia="Times New Roman" w:hAnsi="Consolas" w:cs="Times New Roman"/>
+          <w:color w:val="CE9178"/>
+          <w:kern w:val="0"/>
+          <w:sz w:val="27"/>
+          <w:szCs w:val="27"/>
+          <w:lang w:eastAsia="en-IN"/>
+          <w14:ligatures w14:val="none"/>
+        </w:rPr>
+        <w:t>=2`</w:t>
+      </w:r>
+      <w:r>
+        <w:rPr>
+          <w:rFonts w:ascii="Consolas" w:eastAsia="Times New Roman" w:hAnsi="Consolas" w:cs="Times New Roman"/>
+          <w:color w:val="CCCCCC"/>
+          <w:kern w:val="0"/>
+          <w:sz w:val="27"/>
+          <w:szCs w:val="27"/>
+          <w:lang w:eastAsia="en-IN"/>
+          <w14:ligatures w14:val="none"/>
+        </w:rPr>
+        <w:t xml:space="preserve">, { </w:t>
+      </w:r>
+    </w:p>
+    <w:p>
+      <w:pPr>
+        <w:shd w:val="clear" w:color="auto" w:fill="1F1F1F"/>
+        <w:spacing w:after="0" w:line="360" w:lineRule="atLeast"/>
+        <w:rPr>
+          <w:rFonts w:ascii="Consolas" w:eastAsia="Times New Roman" w:hAnsi="Consolas" w:cs="Times New Roman"/>
+          <w:color w:val="CCCCCC"/>
+          <w:kern w:val="0"/>
+          <w:sz w:val="27"/>
+          <w:szCs w:val="27"/>
+          <w:lang w:eastAsia="en-IN"/>
+          <w14:ligatures w14:val="none"/>
+        </w:rPr>
+      </w:pPr>
+      <w:r>
+        <w:rPr>
+          <w:rFonts w:ascii="Consolas" w:eastAsia="Times New Roman" w:hAnsi="Consolas" w:cs="Times New Roman"/>
+          <w:color w:val="CCCCCC"/>
+          <w:kern w:val="0"/>
+          <w:sz w:val="27"/>
+          <w:szCs w:val="27"/>
+          <w:lang w:eastAsia="en-IN"/>
+          <w14:ligatures w14:val="none"/>
+        </w:rPr>
+        <w:t xml:space="preserve">    </w:t>
+      </w:r>
+      <w:r>
+        <w:rPr>
+          <w:rFonts w:ascii="Consolas" w:eastAsia="Times New Roman" w:hAnsi="Consolas" w:cs="Times New Roman"/>
+          <w:color w:val="9CDCFE"/>
+          <w:kern w:val="0"/>
+          <w:sz w:val="27"/>
+          <w:szCs w:val="27"/>
+          <w:lang w:eastAsia="en-IN"/>
+          <w14:ligatures w14:val="none"/>
+        </w:rPr>
+        <w:t>auth:</w:t>
+      </w:r>
+      <w:r>
+        <w:rPr>
+          <w:rFonts w:ascii="Consolas" w:eastAsia="Times New Roman" w:hAnsi="Consolas" w:cs="Times New Roman"/>
+          <w:color w:val="CCCCCC"/>
+          <w:kern w:val="0"/>
+          <w:sz w:val="27"/>
+          <w:szCs w:val="27"/>
+          <w:lang w:eastAsia="en-IN"/>
+          <w14:ligatures w14:val="none"/>
+        </w:rPr>
+        <w:t xml:space="preserve"> {</w:t>
+      </w:r>
+    </w:p>
+    <w:p>
+      <w:pPr>
+        <w:shd w:val="clear" w:color="auto" w:fill="1F1F1F"/>
+        <w:spacing w:after="0" w:line="360" w:lineRule="atLeast"/>
+        <w:rPr>
+          <w:rFonts w:ascii="Consolas" w:eastAsia="Times New Roman" w:hAnsi="Consolas" w:cs="Times New Roman"/>
+          <w:color w:val="CCCCCC"/>
+          <w:kern w:val="0"/>
+          <w:sz w:val="27"/>
+          <w:szCs w:val="27"/>
+          <w:lang w:eastAsia="en-IN"/>
+          <w14:ligatures w14:val="none"/>
+        </w:rPr>
+      </w:pPr>
+      <w:r>
+        <w:rPr>
+          <w:rFonts w:ascii="Consolas" w:eastAsia="Times New Roman" w:hAnsi="Consolas" w:cs="Times New Roman"/>
+          <w:color w:val="CCCCCC"/>
+          <w:kern w:val="0"/>
+          <w:sz w:val="27"/>
+          <w:szCs w:val="27"/>
+          <w:lang w:eastAsia="en-IN"/>
+          <w14:ligatures w14:val="none"/>
+        </w:rPr>
+        <w:t xml:space="preserve">    </w:t>
+      </w:r>
+      <w:r>
+        <w:rPr>
+          <w:rFonts w:ascii="Consolas" w:eastAsia="Times New Roman" w:hAnsi="Consolas" w:cs="Times New Roman"/>
+          <w:color w:val="CCCCCC"/>
+          <w:kern w:val="0"/>
+          <w:sz w:val="27"/>
+          <w:szCs w:val="27"/>
+          <w:lang w:eastAsia="en-IN"/>
+          <w14:ligatures w14:val="none"/>
+        </w:rPr>
+        <w:t xml:space="preserve">    </w:t>
+      </w:r>
+      <w:r>
+        <w:rPr>
+          <w:rFonts w:ascii="Consolas" w:eastAsia="Times New Roman" w:hAnsi="Consolas" w:cs="Times New Roman"/>
+          <w:color w:val="9CDCFE"/>
+          <w:kern w:val="0"/>
+          <w:sz w:val="27"/>
+          <w:szCs w:val="27"/>
+          <w:lang w:eastAsia="en-IN"/>
+          <w14:ligatures w14:val="none"/>
+        </w:rPr>
+        <w:t>username:</w:t>
+      </w:r>
+      <w:r>
+        <w:rPr>
+          <w:rFonts w:ascii="Consolas" w:eastAsia="Times New Roman" w:hAnsi="Consolas" w:cs="Times New Roman"/>
+          <w:color w:val="CCCCCC"/>
+          <w:kern w:val="0"/>
+          <w:sz w:val="27"/>
+          <w:szCs w:val="27"/>
+          <w:lang w:eastAsia="en-IN"/>
+          <w14:ligatures w14:val="none"/>
+        </w:rPr>
+        <w:t xml:space="preserve"> </w:t>
+      </w:r>
+      <w:proofErr w:type="spellStart"/>
+      <w:r>
+        <w:rPr>
+          <w:rFonts w:ascii="Consolas" w:eastAsia="Times New Roman" w:hAnsi="Consolas" w:cs="Times New Roman"/>
+          <w:color w:val="4FC1FF"/>
+          <w:kern w:val="0"/>
+          <w:sz w:val="27"/>
+          <w:szCs w:val="27"/>
+          <w:lang w:eastAsia="en-IN"/>
+          <w14:ligatures w14:val="none"/>
+        </w:rPr>
+        <w:t>yourUsername</w:t>
+      </w:r>
+      <w:proofErr w:type="spellEnd"/>
+      <w:r>
+        <w:rPr>
+          <w:rFonts w:ascii="Consolas" w:eastAsia="Times New Roman" w:hAnsi="Consolas" w:cs="Times New Roman"/>
+          <w:color w:val="CCCCCC"/>
+          <w:kern w:val="0"/>
+          <w:sz w:val="27"/>
+          <w:szCs w:val="27"/>
+          <w:lang w:eastAsia="en-IN"/>
+          <w14:ligatures w14:val="none"/>
+        </w:rPr>
+        <w:t>,</w:t>
+      </w:r>
+    </w:p>
+    <w:p>
+      <w:pPr>
+        <w:shd w:val="clear" w:color="auto" w:fill="1F1F1F"/>
+        <w:spacing w:after="0" w:line="360" w:lineRule="atLeast"/>
+        <w:rPr>
+          <w:rFonts w:ascii="Consolas" w:eastAsia="Times New Roman" w:hAnsi="Consolas" w:cs="Times New Roman"/>
+          <w:color w:val="CCCCCC"/>
+          <w:kern w:val="0"/>
+          <w:sz w:val="27"/>
+          <w:szCs w:val="27"/>
+          <w:lang w:eastAsia="en-IN"/>
+          <w14:ligatures w14:val="none"/>
+        </w:rPr>
+      </w:pPr>
+      <w:r>
+        <w:rPr>
+          <w:rFonts w:ascii="Consolas" w:eastAsia="Times New Roman" w:hAnsi="Consolas" w:cs="Times New Roman"/>
+          <w:color w:val="CCCCCC"/>
+          <w:kern w:val="0"/>
+          <w:sz w:val="27"/>
+          <w:szCs w:val="27"/>
+          <w:lang w:eastAsia="en-IN"/>
+          <w14:ligatures w14:val="none"/>
+        </w:rPr>
+        <w:t xml:space="preserve">        </w:t>
+      </w:r>
+      <w:r>
+        <w:rPr>
+          <w:rFonts w:ascii="Consolas" w:eastAsia="Times New Roman" w:hAnsi="Consolas" w:cs="Times New Roman"/>
+          <w:color w:val="9CDCFE"/>
+          <w:kern w:val="0"/>
+          <w:sz w:val="27"/>
+          <w:szCs w:val="27"/>
+          <w:lang w:eastAsia="en-IN"/>
+          <w14:ligatures w14:val="none"/>
+        </w:rPr>
+        <w:t>password:</w:t>
+      </w:r>
+      <w:r>
+        <w:rPr>
+          <w:rFonts w:ascii="Consolas" w:eastAsia="Times New Roman" w:hAnsi="Consolas" w:cs="Times New Roman"/>
+          <w:color w:val="CCCCCC"/>
+          <w:kern w:val="0"/>
+          <w:sz w:val="27"/>
+          <w:szCs w:val="27"/>
+          <w:lang w:eastAsia="en-IN"/>
+          <w14:ligatures w14:val="none"/>
+        </w:rPr>
+        <w:t xml:space="preserve"> </w:t>
+      </w:r>
+      <w:proofErr w:type="spellStart"/>
+      <w:r>
+        <w:rPr>
+          <w:rFonts w:ascii="Consolas" w:eastAsia="Times New Roman" w:hAnsi="Consolas" w:cs="Times New Roman"/>
+          <w:color w:val="4FC1FF"/>
+          <w:kern w:val="0"/>
+          <w:sz w:val="27"/>
+          <w:szCs w:val="27"/>
+          <w:lang w:eastAsia="en-IN"/>
+          <w14:ligatures w14:val="none"/>
+        </w:rPr>
+        <w:t>yourPassword</w:t>
+      </w:r>
+      <w:proofErr w:type="spellEnd"/>
+    </w:p>
+    <w:p>
+      <w:pPr>
+        <w:shd w:val="clear" w:color="auto" w:fill="1F1F1F"/>
+        <w:spacing w:after="0" w:line="360" w:lineRule="atLeast"/>
+        <w:rPr>
+          <w:rFonts w:ascii="Consolas" w:eastAsia="Times New Roman" w:hAnsi="Consolas" w:cs="Times New Roman"/>
+          <w:color w:val="CCCCCC"/>
+          <w:kern w:val="0"/>
+          <w:sz w:val="27"/>
+          <w:szCs w:val="27"/>
+          <w:lang w:eastAsia="en-IN"/>
+          <w14:ligatures w14:val="none"/>
+        </w:rPr>
+      </w:pPr>
+      <w:r>
+        <w:rPr>
+          <w:rFonts w:ascii="Consolas" w:eastAsia="Times New Roman" w:hAnsi="Consolas" w:cs="Times New Roman"/>
+          <w:color w:val="CCCCCC"/>
+          <w:kern w:val="0"/>
+          <w:sz w:val="27"/>
+          <w:szCs w:val="27"/>
+          <w:lang w:eastAsia="en-IN"/>
+          <w14:ligatures w14:val="none"/>
+        </w:rPr>
+        <w:t>   </w:t>
+      </w:r>
+      <w:r>
+        <w:rPr>
+          <w:rFonts w:ascii="Consolas" w:eastAsia="Times New Roman" w:hAnsi="Consolas" w:cs="Times New Roman"/>
+          <w:color w:val="CCCCCC"/>
+          <w:kern w:val="0"/>
+          <w:sz w:val="27"/>
+          <w:szCs w:val="27"/>
+          <w:lang w:eastAsia="en-IN"/>
+          <w14:ligatures w14:val="none"/>
+        </w:rPr>
+        <w:t xml:space="preserve"> </w:t>
+      </w:r>
+      <w:r>
+        <w:rPr>
+          <w:rFonts w:ascii="Consolas" w:eastAsia="Times New Roman" w:hAnsi="Consolas" w:cs="Times New Roman"/>
+          <w:color w:val="CCCCCC"/>
+          <w:kern w:val="0"/>
+          <w:sz w:val="27"/>
+          <w:szCs w:val="27"/>
+          <w:lang w:eastAsia="en-IN"/>
+          <w14:ligatures w14:val="none"/>
+        </w:rPr>
+        <w:t>}</w:t>
+      </w:r>
+    </w:p>
+    <w:p>
+      <w:pPr>
+        <w:shd w:val="clear" w:color="auto" w:fill="1F1F1F"/>
+        <w:spacing w:after="0" w:line="360" w:lineRule="atLeast"/>
+        <w:rPr>
+          <w:rFonts w:ascii="Consolas" w:eastAsia="Times New Roman" w:hAnsi="Consolas" w:cs="Times New Roman"/>
+          <w:color w:val="CCCCCC"/>
+          <w:kern w:val="0"/>
+          <w:sz w:val="27"/>
+          <w:szCs w:val="27"/>
+          <w:lang w:eastAsia="en-IN"/>
+          <w14:ligatures w14:val="none"/>
+        </w:rPr>
+      </w:pPr>
+      <w:r>
+        <w:rPr>
+          <w:rFonts w:ascii="Consolas" w:eastAsia="Times New Roman" w:hAnsi="Consolas" w:cs="Times New Roman"/>
+          <w:color w:val="CCCCCC"/>
+          <w:kern w:val="0"/>
+          <w:sz w:val="27"/>
+          <w:szCs w:val="27"/>
+          <w:lang w:eastAsia="en-IN"/>
+          <w14:ligatures w14:val="none"/>
+        </w:rPr>
+        <w:t>});</w:t>
+      </w:r>
+    </w:p>
+    <w:p>
+      <w:pPr>
+        <w:pStyle w:val="ListParagraph"/>
+        <w:numPr>
+          <w:ilvl w:val="1"/>
+          <w:numId w:val="5"/>
+        </w:numPr>
+        <w:rPr>
+          <w:rFonts w:ascii="Times New Roman" w:hAnsi="Times New Roman" w:cs="Times New Roman"/>
+          <w:sz w:val="28"/>
+          <w:szCs w:val="28"/>
+        </w:rPr>
+      </w:pPr>
+      <w:r>
+        <w:rPr>
+          <w:rFonts w:ascii="Times New Roman" w:hAnsi="Times New Roman" w:cs="Times New Roman"/>
+          <w:sz w:val="28"/>
+          <w:szCs w:val="28"/>
+        </w:rPr>
+        <w:t>API key authorisation</w:t>
+      </w:r>
+      <w:r>
+        <w:rPr>
+          <w:rFonts w:ascii="Times New Roman" w:hAnsi="Times New Roman" w:cs="Times New Roman"/>
+          <w:sz w:val="28"/>
+          <w:szCs w:val="28"/>
+        </w:rPr>
+        <w:t>:</w:t>
+      </w:r>
+    </w:p>
+    <w:p>
+      <w:pPr>
+        <w:pStyle w:val="ListParagraph"/>
+        <w:numPr>
+          <w:ilvl w:val="2"/>
+          <w:numId w:val="5"/>
+        </w:numPr>
+        <w:rPr>
+          <w:rFonts w:ascii="Times New Roman" w:hAnsi="Times New Roman" w:cs="Times New Roman"/>
+          <w:sz w:val="28"/>
+          <w:szCs w:val="28"/>
+        </w:rPr>
+      </w:pPr>
+      <w:r>
+        <w:rPr>
+          <w:rFonts w:ascii="Times New Roman" w:hAnsi="Times New Roman" w:cs="Times New Roman"/>
+          <w:b/>
+          <w:bCs/>
+          <w:sz w:val="28"/>
+          <w:szCs w:val="28"/>
+        </w:rPr>
+        <w:lastRenderedPageBreak/>
+        <w:t>Authentication</w:t>
+      </w:r>
+      <w:r>
+        <w:rPr>
+          <w:rFonts w:ascii="Times New Roman" w:hAnsi="Times New Roman" w:cs="Times New Roman"/>
+          <w:sz w:val="28"/>
+          <w:szCs w:val="28"/>
+        </w:rPr>
+        <w:t xml:space="preserve"> is the process of verifying the identity of a user or application, ensuring they are who they claim to be. </w:t>
+      </w:r>
+      <w:r>
+        <w:rPr>
+          <w:rFonts w:ascii="Times New Roman" w:hAnsi="Times New Roman" w:cs="Times New Roman"/>
+          <w:sz w:val="28"/>
+          <w:szCs w:val="28"/>
+        </w:rPr>
+        <w:br/>
+      </w:r>
+      <w:r>
+        <w:rPr>
+          <w:rFonts w:ascii="Times New Roman" w:hAnsi="Times New Roman" w:cs="Times New Roman"/>
+          <w:b/>
+          <w:bCs/>
+          <w:sz w:val="28"/>
+          <w:szCs w:val="28"/>
+        </w:rPr>
+        <w:t>Authorization</w:t>
+      </w:r>
+      <w:r>
+        <w:rPr>
+          <w:rFonts w:ascii="Times New Roman" w:hAnsi="Times New Roman" w:cs="Times New Roman"/>
+          <w:sz w:val="28"/>
+          <w:szCs w:val="28"/>
+        </w:rPr>
+        <w:t xml:space="preserve"> determines what an authenticated user or application is allowed to do, granting or denying permissions to access resources or perform actions.</w:t>
+      </w:r>
+    </w:p>
+    <w:p>
+      <w:pPr>
+        <w:pStyle w:val="ListParagraph"/>
+        <w:numPr>
+          <w:ilvl w:val="2"/>
+          <w:numId w:val="5"/>
+        </w:numPr>
+        <w:rPr>
+          <w:rFonts w:ascii="Times New Roman" w:hAnsi="Times New Roman" w:cs="Times New Roman"/>
+          <w:sz w:val="28"/>
+          <w:szCs w:val="28"/>
+        </w:rPr>
+      </w:pPr>
+      <w:r>
+        <w:rPr>
+          <w:rFonts w:ascii="Times New Roman" w:hAnsi="Times New Roman" w:cs="Times New Roman"/>
+          <w:sz w:val="28"/>
+          <w:szCs w:val="28"/>
+        </w:rPr>
+        <w:t>API key authorization is a method of securing API access by requiring a unique key to accompany each API request. This key acts as a token of authentication and authorization, verifying that the request originates from a legitimate source.</w:t>
+      </w:r>
+      <w:r>
+        <w:rPr>
+          <w:rFonts w:ascii="Times New Roman" w:hAnsi="Times New Roman" w:cs="Times New Roman"/>
+          <w:sz w:val="28"/>
+          <w:szCs w:val="28"/>
+        </w:rPr>
+        <w:t>\</w:t>
+      </w:r>
+    </w:p>
+    <w:p>
+      <w:pPr>
+        <w:pStyle w:val="ListParagraph"/>
+        <w:numPr>
+          <w:ilvl w:val="2"/>
+          <w:numId w:val="5"/>
+        </w:numPr>
+        <w:rPr>
+          <w:rFonts w:ascii="Courier New" w:hAnsi="Courier New" w:cs="Courier New"/>
+          <w:sz w:val="28"/>
+          <w:szCs w:val="28"/>
+        </w:rPr>
+      </w:pPr>
+      <w:proofErr w:type="spellStart"/>
+      <w:r>
+        <w:rPr>
+          <w:rFonts w:ascii="Courier New" w:hAnsi="Courier New" w:cs="Courier New"/>
+          <w:sz w:val="28"/>
+          <w:szCs w:val="28"/>
+        </w:rPr>
+        <w:t>baseURL</w:t>
+      </w:r>
+      <w:proofErr w:type="spellEnd"/>
+      <w:r>
+        <w:rPr>
+          <w:rFonts w:ascii="Courier New" w:hAnsi="Courier New" w:cs="Courier New"/>
+          <w:sz w:val="28"/>
+          <w:szCs w:val="28"/>
+        </w:rPr>
+        <w:t>/</w:t>
+      </w:r>
+      <w:proofErr w:type="spellStart"/>
+      <w:r>
+        <w:rPr>
+          <w:rFonts w:ascii="Courier New" w:hAnsi="Courier New" w:cs="Courier New"/>
+          <w:sz w:val="28"/>
+          <w:szCs w:val="28"/>
+        </w:rPr>
+        <w:t>endpoint&amp;apiKey</w:t>
+      </w:r>
+      <w:proofErr w:type="spellEnd"/>
+      <w:r>
+        <w:rPr>
+          <w:rFonts w:ascii="Courier New" w:hAnsi="Courier New" w:cs="Courier New"/>
+          <w:sz w:val="28"/>
+          <w:szCs w:val="28"/>
+        </w:rPr>
+        <w:t>=</w:t>
+      </w:r>
+      <w:proofErr w:type="spellStart"/>
+      <w:r>
+        <w:rPr>
+          <w:rFonts w:ascii="Courier New" w:hAnsi="Courier New" w:cs="Courier New"/>
+          <w:sz w:val="28"/>
+          <w:szCs w:val="28"/>
+        </w:rPr>
+        <w:t>xxxx</w:t>
+      </w:r>
+      <w:proofErr w:type="spellEnd"/>
+    </w:p>
+    <w:p>
+      <w:pPr>
+        <w:shd w:val="clear" w:color="auto" w:fill="1F1F1F"/>
+        <w:spacing w:after="0" w:line="360" w:lineRule="atLeast"/>
+        <w:rPr>
+          <w:rFonts w:ascii="Consolas" w:eastAsia="Times New Roman" w:hAnsi="Consolas" w:cs="Times New Roman"/>
+          <w:color w:val="CCCCCC"/>
+          <w:kern w:val="0"/>
+          <w:sz w:val="27"/>
+          <w:szCs w:val="27"/>
+          <w:lang w:eastAsia="en-IN"/>
+          <w14:ligatures w14:val="none"/>
+        </w:rPr>
+      </w:pPr>
+      <w:proofErr w:type="spellStart"/>
+      <w:r>
+        <w:rPr>
+          <w:rFonts w:ascii="Consolas" w:eastAsia="Times New Roman" w:hAnsi="Consolas" w:cs="Times New Roman"/>
+          <w:color w:val="569CD6"/>
+          <w:kern w:val="0"/>
+          <w:sz w:val="27"/>
+          <w:szCs w:val="27"/>
+          <w:lang w:eastAsia="en-IN"/>
+          <w14:ligatures w14:val="none"/>
+        </w:rPr>
+        <w:t>const</w:t>
+      </w:r>
+      <w:proofErr w:type="spellEnd"/>
+      <w:r>
+        <w:rPr>
+          <w:rFonts w:ascii="Consolas" w:eastAsia="Times New Roman" w:hAnsi="Consolas" w:cs="Times New Roman"/>
+          <w:color w:val="CCCCCC"/>
+          <w:kern w:val="0"/>
+          <w:sz w:val="27"/>
+          <w:szCs w:val="27"/>
+          <w:lang w:eastAsia="en-IN"/>
+          <w14:ligatures w14:val="none"/>
+        </w:rPr>
+        <w:t xml:space="preserve"> </w:t>
+      </w:r>
+      <w:r>
+        <w:rPr>
+          <w:rFonts w:ascii="Consolas" w:eastAsia="Times New Roman" w:hAnsi="Consolas" w:cs="Times New Roman"/>
+          <w:color w:val="4FC1FF"/>
+          <w:kern w:val="0"/>
+          <w:sz w:val="27"/>
+          <w:szCs w:val="27"/>
+          <w:lang w:eastAsia="en-IN"/>
+          <w14:ligatures w14:val="none"/>
+        </w:rPr>
+        <w:t>result</w:t>
+      </w:r>
+      <w:r>
+        <w:rPr>
+          <w:rFonts w:ascii="Consolas" w:eastAsia="Times New Roman" w:hAnsi="Consolas" w:cs="Times New Roman"/>
+          <w:color w:val="CCCCCC"/>
+          <w:kern w:val="0"/>
+          <w:sz w:val="27"/>
+          <w:szCs w:val="27"/>
+          <w:lang w:eastAsia="en-IN"/>
+          <w14:ligatures w14:val="none"/>
+        </w:rPr>
+        <w:t xml:space="preserve"> </w:t>
+      </w:r>
+      <w:r>
+        <w:rPr>
+          <w:rFonts w:ascii="Consolas" w:eastAsia="Times New Roman" w:hAnsi="Consolas" w:cs="Times New Roman"/>
+          <w:color w:val="D4D4D4"/>
+          <w:kern w:val="0"/>
+          <w:sz w:val="27"/>
+          <w:szCs w:val="27"/>
+          <w:lang w:eastAsia="en-IN"/>
+          <w14:ligatures w14:val="none"/>
+        </w:rPr>
+        <w:t>=</w:t>
+      </w:r>
+      <w:r>
+        <w:rPr>
+          <w:rFonts w:ascii="Consolas" w:eastAsia="Times New Roman" w:hAnsi="Consolas" w:cs="Times New Roman"/>
+          <w:color w:val="CCCCCC"/>
+          <w:kern w:val="0"/>
+          <w:sz w:val="27"/>
+          <w:szCs w:val="27"/>
+          <w:lang w:eastAsia="en-IN"/>
+          <w14:ligatures w14:val="none"/>
+        </w:rPr>
+        <w:t xml:space="preserve"> </w:t>
+      </w:r>
+      <w:r>
+        <w:rPr>
+          <w:rFonts w:ascii="Consolas" w:eastAsia="Times New Roman" w:hAnsi="Consolas" w:cs="Times New Roman"/>
+          <w:color w:val="C586C0"/>
+          <w:kern w:val="0"/>
+          <w:sz w:val="27"/>
+          <w:szCs w:val="27"/>
+          <w:lang w:eastAsia="en-IN"/>
+          <w14:ligatures w14:val="none"/>
+        </w:rPr>
+        <w:t>await</w:t>
+      </w:r>
+      <w:r>
+        <w:rPr>
+          <w:rFonts w:ascii="Consolas" w:eastAsia="Times New Roman" w:hAnsi="Consolas" w:cs="Times New Roman"/>
+          <w:color w:val="CCCCCC"/>
+          <w:kern w:val="0"/>
+          <w:sz w:val="27"/>
+          <w:szCs w:val="27"/>
+          <w:lang w:eastAsia="en-IN"/>
+          <w14:ligatures w14:val="none"/>
+        </w:rPr>
+        <w:t xml:space="preserve"> </w:t>
+      </w:r>
+      <w:proofErr w:type="spellStart"/>
+      <w:r>
+        <w:rPr>
+          <w:rFonts w:ascii="Consolas" w:eastAsia="Times New Roman" w:hAnsi="Consolas" w:cs="Times New Roman"/>
+          <w:color w:val="4FC1FF"/>
+          <w:kern w:val="0"/>
+          <w:sz w:val="27"/>
+          <w:szCs w:val="27"/>
+          <w:lang w:eastAsia="en-IN"/>
+          <w14:ligatures w14:val="none"/>
+        </w:rPr>
+        <w:t>axios</w:t>
+      </w:r>
+      <w:r>
+        <w:rPr>
+          <w:rFonts w:ascii="Consolas" w:eastAsia="Times New Roman" w:hAnsi="Consolas" w:cs="Times New Roman"/>
+          <w:color w:val="CCCCCC"/>
+          <w:kern w:val="0"/>
+          <w:sz w:val="27"/>
+          <w:szCs w:val="27"/>
+          <w:lang w:eastAsia="en-IN"/>
+          <w14:ligatures w14:val="none"/>
+        </w:rPr>
+        <w:t>.</w:t>
+      </w:r>
+      <w:r>
+        <w:rPr>
+          <w:rFonts w:ascii="Consolas" w:eastAsia="Times New Roman" w:hAnsi="Consolas" w:cs="Times New Roman"/>
+          <w:color w:val="DCDCAA"/>
+          <w:kern w:val="0"/>
+          <w:sz w:val="27"/>
+          <w:szCs w:val="27"/>
+          <w:lang w:eastAsia="en-IN"/>
+          <w14:ligatures w14:val="none"/>
+        </w:rPr>
+        <w:t>get</w:t>
+      </w:r>
+      <w:proofErr w:type="spellEnd"/>
+      <w:r>
+        <w:rPr>
+          <w:rFonts w:ascii="Consolas" w:eastAsia="Times New Roman" w:hAnsi="Consolas" w:cs="Times New Roman"/>
+          <w:color w:val="CCCCCC"/>
+          <w:kern w:val="0"/>
+          <w:sz w:val="27"/>
+          <w:szCs w:val="27"/>
+          <w:lang w:eastAsia="en-IN"/>
+          <w14:ligatures w14:val="none"/>
+        </w:rPr>
+        <w:t>(</w:t>
+      </w:r>
+      <w:r>
+        <w:rPr>
+          <w:rFonts w:ascii="Consolas" w:eastAsia="Times New Roman" w:hAnsi="Consolas" w:cs="Times New Roman"/>
+          <w:color w:val="CE9178"/>
+          <w:kern w:val="0"/>
+          <w:sz w:val="27"/>
+          <w:szCs w:val="27"/>
+          <w:lang w:eastAsia="en-IN"/>
+          <w14:ligatures w14:val="none"/>
+        </w:rPr>
+        <w:t>`</w:t>
+      </w:r>
+      <w:r>
+        <w:rPr>
+          <w:rFonts w:ascii="Consolas" w:eastAsia="Times New Roman" w:hAnsi="Consolas" w:cs="Times New Roman"/>
+          <w:color w:val="569CD6"/>
+          <w:kern w:val="0"/>
+          <w:sz w:val="27"/>
+          <w:szCs w:val="27"/>
+          <w:lang w:eastAsia="en-IN"/>
+          <w14:ligatures w14:val="none"/>
+        </w:rPr>
+        <w:t>${</w:t>
+      </w:r>
+      <w:r>
+        <w:rPr>
+          <w:rFonts w:ascii="Consolas" w:eastAsia="Times New Roman" w:hAnsi="Consolas" w:cs="Times New Roman"/>
+          <w:color w:val="4FC1FF"/>
+          <w:kern w:val="0"/>
+          <w:sz w:val="27"/>
+          <w:szCs w:val="27"/>
+          <w:lang w:eastAsia="en-IN"/>
+          <w14:ligatures w14:val="none"/>
+        </w:rPr>
+        <w:t>API_URL</w:t>
+      </w:r>
+      <w:r>
+        <w:rPr>
+          <w:rFonts w:ascii="Consolas" w:eastAsia="Times New Roman" w:hAnsi="Consolas" w:cs="Times New Roman"/>
+          <w:color w:val="569CD6"/>
+          <w:kern w:val="0"/>
+          <w:sz w:val="27"/>
+          <w:szCs w:val="27"/>
+          <w:lang w:eastAsia="en-IN"/>
+          <w14:ligatures w14:val="none"/>
+        </w:rPr>
+        <w:t>}</w:t>
+      </w:r>
+      <w:r>
+        <w:rPr>
+          <w:rFonts w:ascii="Consolas" w:eastAsia="Times New Roman" w:hAnsi="Consolas" w:cs="Times New Roman"/>
+          <w:color w:val="CE9178"/>
+          <w:kern w:val="0"/>
+          <w:sz w:val="27"/>
+          <w:szCs w:val="27"/>
+          <w:lang w:eastAsia="en-IN"/>
+          <w14:ligatures w14:val="none"/>
+        </w:rPr>
+        <w:t>/filter`</w:t>
+      </w:r>
+      <w:r>
+        <w:rPr>
+          <w:rFonts w:ascii="Consolas" w:eastAsia="Times New Roman" w:hAnsi="Consolas" w:cs="Times New Roman"/>
+          <w:color w:val="CCCCCC"/>
+          <w:kern w:val="0"/>
+          <w:sz w:val="27"/>
+          <w:szCs w:val="27"/>
+          <w:lang w:eastAsia="en-IN"/>
+          <w14:ligatures w14:val="none"/>
+        </w:rPr>
+        <w:t>, {</w:t>
+      </w:r>
+    </w:p>
+    <w:p>
+      <w:pPr>
+        <w:shd w:val="clear" w:color="auto" w:fill="1F1F1F"/>
+        <w:spacing w:after="0" w:line="360" w:lineRule="atLeast"/>
+        <w:rPr>
+          <w:rFonts w:ascii="Consolas" w:eastAsia="Times New Roman" w:hAnsi="Consolas" w:cs="Times New Roman"/>
+          <w:color w:val="CCCCCC"/>
+          <w:kern w:val="0"/>
+          <w:sz w:val="27"/>
+          <w:szCs w:val="27"/>
+          <w:lang w:eastAsia="en-IN"/>
+          <w14:ligatures w14:val="none"/>
+        </w:rPr>
+      </w:pPr>
+      <w:r>
+        <w:rPr>
+          <w:rFonts w:ascii="Consolas" w:eastAsia="Times New Roman" w:hAnsi="Consolas" w:cs="Times New Roman"/>
+          <w:color w:val="CCCCCC"/>
+          <w:kern w:val="0"/>
+          <w:sz w:val="27"/>
+          <w:szCs w:val="27"/>
+          <w:lang w:eastAsia="en-IN"/>
+          <w14:ligatures w14:val="none"/>
+        </w:rPr>
+        <w:t xml:space="preserve">    </w:t>
+      </w:r>
+      <w:r>
+        <w:rPr>
+          <w:rFonts w:ascii="Consolas" w:eastAsia="Times New Roman" w:hAnsi="Consolas" w:cs="Times New Roman"/>
+          <w:color w:val="9CDCFE"/>
+          <w:kern w:val="0"/>
+          <w:sz w:val="27"/>
+          <w:szCs w:val="27"/>
+          <w:lang w:eastAsia="en-IN"/>
+          <w14:ligatures w14:val="none"/>
+        </w:rPr>
+        <w:t>params:</w:t>
+      </w:r>
+      <w:r>
+        <w:rPr>
+          <w:rFonts w:ascii="Consolas" w:eastAsia="Times New Roman" w:hAnsi="Consolas" w:cs="Times New Roman"/>
+          <w:color w:val="CCCCCC"/>
+          <w:kern w:val="0"/>
+          <w:sz w:val="27"/>
+          <w:szCs w:val="27"/>
+          <w:lang w:eastAsia="en-IN"/>
+          <w14:ligatures w14:val="none"/>
+        </w:rPr>
+        <w:t xml:space="preserve"> {</w:t>
+      </w:r>
+    </w:p>
+    <w:p>
+      <w:pPr>
+        <w:shd w:val="clear" w:color="auto" w:fill="1F1F1F"/>
+        <w:spacing w:after="0" w:line="360" w:lineRule="atLeast"/>
+        <w:rPr>
+          <w:rFonts w:ascii="Consolas" w:eastAsia="Times New Roman" w:hAnsi="Consolas" w:cs="Times New Roman"/>
+          <w:color w:val="CCCCCC"/>
+          <w:kern w:val="0"/>
+          <w:sz w:val="27"/>
+          <w:szCs w:val="27"/>
+          <w:lang w:eastAsia="en-IN"/>
+          <w14:ligatures w14:val="none"/>
+        </w:rPr>
+      </w:pPr>
+      <w:r>
+        <w:rPr>
+          <w:rFonts w:ascii="Consolas" w:eastAsia="Times New Roman" w:hAnsi="Consolas" w:cs="Times New Roman"/>
+          <w:color w:val="CCCCCC"/>
+          <w:kern w:val="0"/>
+          <w:sz w:val="27"/>
+          <w:szCs w:val="27"/>
+          <w:lang w:eastAsia="en-IN"/>
+          <w14:ligatures w14:val="none"/>
+        </w:rPr>
+        <w:t xml:space="preserve">    </w:t>
+      </w:r>
+      <w:r>
+        <w:rPr>
+          <w:rFonts w:ascii="Consolas" w:eastAsia="Times New Roman" w:hAnsi="Consolas" w:cs="Times New Roman"/>
+          <w:color w:val="CCCCCC"/>
+          <w:kern w:val="0"/>
+          <w:sz w:val="27"/>
+          <w:szCs w:val="27"/>
+          <w:lang w:eastAsia="en-IN"/>
+          <w14:ligatures w14:val="none"/>
+        </w:rPr>
+        <w:t xml:space="preserve">    </w:t>
+      </w:r>
+      <w:r>
+        <w:rPr>
+          <w:rFonts w:ascii="Consolas" w:eastAsia="Times New Roman" w:hAnsi="Consolas" w:cs="Times New Roman"/>
+          <w:color w:val="9CDCFE"/>
+          <w:kern w:val="0"/>
+          <w:sz w:val="27"/>
+          <w:szCs w:val="27"/>
+          <w:lang w:eastAsia="en-IN"/>
+          <w14:ligatures w14:val="none"/>
+        </w:rPr>
+        <w:t>score:</w:t>
+      </w:r>
+      <w:r>
+        <w:rPr>
+          <w:rFonts w:ascii="Consolas" w:eastAsia="Times New Roman" w:hAnsi="Consolas" w:cs="Times New Roman"/>
+          <w:color w:val="CCCCCC"/>
+          <w:kern w:val="0"/>
+          <w:sz w:val="27"/>
+          <w:szCs w:val="27"/>
+          <w:lang w:eastAsia="en-IN"/>
+          <w14:ligatures w14:val="none"/>
+        </w:rPr>
+        <w:t xml:space="preserve"> </w:t>
+      </w:r>
+      <w:r>
+        <w:rPr>
+          <w:rFonts w:ascii="Consolas" w:eastAsia="Times New Roman" w:hAnsi="Consolas" w:cs="Times New Roman"/>
+          <w:color w:val="B5CEA8"/>
+          <w:kern w:val="0"/>
+          <w:sz w:val="27"/>
+          <w:szCs w:val="27"/>
+          <w:lang w:eastAsia="en-IN"/>
+          <w14:ligatures w14:val="none"/>
+        </w:rPr>
+        <w:t>5</w:t>
+      </w:r>
+      <w:r>
+        <w:rPr>
+          <w:rFonts w:ascii="Consolas" w:eastAsia="Times New Roman" w:hAnsi="Consolas" w:cs="Times New Roman"/>
+          <w:color w:val="CCCCCC"/>
+          <w:kern w:val="0"/>
+          <w:sz w:val="27"/>
+          <w:szCs w:val="27"/>
+          <w:lang w:eastAsia="en-IN"/>
+          <w14:ligatures w14:val="none"/>
+        </w:rPr>
+        <w:t>,</w:t>
+      </w:r>
+    </w:p>
+    <w:p>
+      <w:pPr>
+        <w:shd w:val="clear" w:color="auto" w:fill="1F1F1F"/>
+        <w:spacing w:after="0" w:line="360" w:lineRule="atLeast"/>
+        <w:rPr>
+          <w:rFonts w:ascii="Consolas" w:eastAsia="Times New Roman" w:hAnsi="Consolas" w:cs="Times New Roman"/>
+          <w:color w:val="CCCCCC"/>
+          <w:kern w:val="0"/>
+          <w:sz w:val="27"/>
+          <w:szCs w:val="27"/>
+          <w:lang w:eastAsia="en-IN"/>
+          <w14:ligatures w14:val="none"/>
+        </w:rPr>
+      </w:pPr>
+      <w:r>
+        <w:rPr>
+          <w:rFonts w:ascii="Consolas" w:eastAsia="Times New Roman" w:hAnsi="Consolas" w:cs="Times New Roman"/>
+          <w:color w:val="CCCCCC"/>
+          <w:kern w:val="0"/>
+          <w:sz w:val="27"/>
+          <w:szCs w:val="27"/>
+          <w:lang w:eastAsia="en-IN"/>
+          <w14:ligatures w14:val="none"/>
+        </w:rPr>
+        <w:t xml:space="preserve">        </w:t>
+      </w:r>
+      <w:proofErr w:type="spellStart"/>
+      <w:r>
+        <w:rPr>
+          <w:rFonts w:ascii="Consolas" w:eastAsia="Times New Roman" w:hAnsi="Consolas" w:cs="Times New Roman"/>
+          <w:color w:val="9CDCFE"/>
+          <w:kern w:val="0"/>
+          <w:sz w:val="27"/>
+          <w:szCs w:val="27"/>
+          <w:lang w:eastAsia="en-IN"/>
+          <w14:ligatures w14:val="none"/>
+        </w:rPr>
+        <w:t>apiKey</w:t>
+      </w:r>
+      <w:proofErr w:type="spellEnd"/>
+      <w:r>
+        <w:rPr>
+          <w:rFonts w:ascii="Consolas" w:eastAsia="Times New Roman" w:hAnsi="Consolas" w:cs="Times New Roman"/>
+          <w:color w:val="9CDCFE"/>
+          <w:kern w:val="0"/>
+          <w:sz w:val="27"/>
+          <w:szCs w:val="27"/>
+          <w:lang w:eastAsia="en-IN"/>
+          <w14:ligatures w14:val="none"/>
+        </w:rPr>
+        <w:t>:</w:t>
+      </w:r>
+      <w:r>
+        <w:rPr>
+          <w:rFonts w:ascii="Consolas" w:eastAsia="Times New Roman" w:hAnsi="Consolas" w:cs="Times New Roman"/>
+          <w:color w:val="CCCCCC"/>
+          <w:kern w:val="0"/>
+          <w:sz w:val="27"/>
+          <w:szCs w:val="27"/>
+          <w:lang w:eastAsia="en-IN"/>
+          <w14:ligatures w14:val="none"/>
+        </w:rPr>
+        <w:t xml:space="preserve"> </w:t>
+      </w:r>
+      <w:proofErr w:type="spellStart"/>
+      <w:r>
+        <w:rPr>
+          <w:rFonts w:ascii="Consolas" w:eastAsia="Times New Roman" w:hAnsi="Consolas" w:cs="Times New Roman"/>
+          <w:color w:val="4FC1FF"/>
+          <w:kern w:val="0"/>
+          <w:sz w:val="27"/>
+          <w:szCs w:val="27"/>
+          <w:lang w:eastAsia="en-IN"/>
+          <w14:ligatures w14:val="none"/>
+        </w:rPr>
+        <w:t>yourAPIKey</w:t>
+      </w:r>
+      <w:proofErr w:type="spellEnd"/>
+    </w:p>
+    <w:p>
+      <w:pPr>
+        <w:shd w:val="clear" w:color="auto" w:fill="1F1F1F"/>
+        <w:spacing w:after="0" w:line="360" w:lineRule="atLeast"/>
+        <w:rPr>
+          <w:rFonts w:ascii="Consolas" w:eastAsia="Times New Roman" w:hAnsi="Consolas" w:cs="Times New Roman"/>
+          <w:color w:val="CCCCCC"/>
+          <w:kern w:val="0"/>
+          <w:sz w:val="27"/>
+          <w:szCs w:val="27"/>
+          <w:lang w:eastAsia="en-IN"/>
+          <w14:ligatures w14:val="none"/>
+        </w:rPr>
+      </w:pPr>
+      <w:r>
+        <w:rPr>
+          <w:rFonts w:ascii="Consolas" w:eastAsia="Times New Roman" w:hAnsi="Consolas" w:cs="Times New Roman"/>
+          <w:color w:val="CCCCCC"/>
+          <w:kern w:val="0"/>
+          <w:sz w:val="27"/>
+          <w:szCs w:val="27"/>
+          <w:lang w:eastAsia="en-IN"/>
+          <w14:ligatures w14:val="none"/>
+        </w:rPr>
+        <w:t>    }</w:t>
+      </w:r>
+    </w:p>
+    <w:p>
+      <w:pPr>
+        <w:shd w:val="clear" w:color="auto" w:fill="1F1F1F"/>
+        <w:spacing w:after="0" w:line="360" w:lineRule="atLeast"/>
+        <w:rPr>
+          <w:rFonts w:ascii="Consolas" w:eastAsia="Times New Roman" w:hAnsi="Consolas" w:cs="Times New Roman"/>
+          <w:color w:val="CCCCCC"/>
+          <w:kern w:val="0"/>
+          <w:sz w:val="27"/>
+          <w:szCs w:val="27"/>
+          <w:lang w:eastAsia="en-IN"/>
+          <w14:ligatures w14:val="none"/>
+        </w:rPr>
+      </w:pPr>
+      <w:r>
+        <w:rPr>
+          <w:rFonts w:ascii="Consolas" w:eastAsia="Times New Roman" w:hAnsi="Consolas" w:cs="Times New Roman"/>
+          <w:color w:val="CCCCCC"/>
+          <w:kern w:val="0"/>
+          <w:sz w:val="27"/>
+          <w:szCs w:val="27"/>
+          <w:lang w:eastAsia="en-IN"/>
+          <w14:ligatures w14:val="none"/>
+        </w:rPr>
+        <w:t>});</w:t>
+      </w:r>
+    </w:p>
+    <w:p>
+      <w:pPr>
+        <w:pStyle w:val="ListParagraph"/>
+        <w:numPr>
+          <w:ilvl w:val="1"/>
+          <w:numId w:val="5"/>
+        </w:numPr>
+        <w:rPr>
+          <w:rFonts w:ascii="Times New Roman" w:hAnsi="Times New Roman" w:cs="Times New Roman"/>
+          <w:sz w:val="28"/>
+          <w:szCs w:val="28"/>
+        </w:rPr>
+      </w:pPr>
+      <w:r>
+        <w:rPr>
+          <w:rFonts w:ascii="Times New Roman" w:hAnsi="Times New Roman" w:cs="Times New Roman"/>
+          <w:sz w:val="28"/>
+          <w:szCs w:val="28"/>
+        </w:rPr>
+        <w:t>Token based authentication</w:t>
+      </w:r>
+    </w:p>
+    <w:p>
+      <w:pPr>
+        <w:pStyle w:val="ListParagraph"/>
+        <w:numPr>
+          <w:ilvl w:val="2"/>
+          <w:numId w:val="5"/>
+        </w:numPr>
+        <w:rPr>
+          <w:rFonts w:ascii="Times New Roman" w:hAnsi="Times New Roman" w:cs="Times New Roman"/>
+          <w:sz w:val="28"/>
+          <w:szCs w:val="28"/>
+        </w:rPr>
+      </w:pPr>
+      <w:r>
+        <w:rPr>
+          <w:rFonts w:ascii="Times New Roman" w:hAnsi="Times New Roman" w:cs="Times New Roman"/>
+          <w:sz w:val="28"/>
+          <w:szCs w:val="28"/>
+        </w:rPr>
+        <w:t>User logins with username and password and then a token is generated.</w:t>
+      </w:r>
+    </w:p>
+    <w:p>
+      <w:pPr>
+        <w:pStyle w:val="ListParagraph"/>
+        <w:numPr>
+          <w:ilvl w:val="2"/>
+          <w:numId w:val="5"/>
+        </w:numPr>
+        <w:rPr>
+          <w:rFonts w:ascii="Times New Roman" w:hAnsi="Times New Roman" w:cs="Times New Roman"/>
+          <w:sz w:val="28"/>
+          <w:szCs w:val="28"/>
+        </w:rPr>
+      </w:pPr>
+      <w:r>
+        <w:rPr>
+          <w:rFonts w:ascii="Times New Roman" w:hAnsi="Times New Roman" w:cs="Times New Roman"/>
+          <w:sz w:val="28"/>
+          <w:szCs w:val="28"/>
+        </w:rPr>
+        <w:t>The token is used to interact with API.</w:t>
+      </w:r>
+    </w:p>
+    <w:p>
+      <w:pPr>
+        <w:pStyle w:val="ListParagraph"/>
+        <w:numPr>
+          <w:ilvl w:val="2"/>
+          <w:numId w:val="5"/>
+        </w:numPr>
+        <w:rPr>
+          <w:rFonts w:ascii="Times New Roman" w:hAnsi="Times New Roman" w:cs="Times New Roman"/>
+          <w:sz w:val="28"/>
+          <w:szCs w:val="28"/>
+        </w:rPr>
+      </w:pPr>
+      <w:r>
+        <w:rPr>
+          <w:rFonts w:ascii="Times New Roman" w:hAnsi="Times New Roman" w:cs="Times New Roman"/>
+          <w:sz w:val="28"/>
+          <w:szCs w:val="28"/>
+        </w:rPr>
+        <w:t>OAuth is used for token-based authorisation.</w:t>
+      </w:r>
+    </w:p>
+    <w:p>
+      <w:pPr>
+        <w:shd w:val="clear" w:color="auto" w:fill="1F1F1F"/>
+        <w:spacing w:after="0" w:line="360" w:lineRule="atLeast"/>
+        <w:rPr>
+          <w:rFonts w:ascii="Consolas" w:eastAsia="Times New Roman" w:hAnsi="Consolas" w:cs="Times New Roman"/>
+          <w:color w:val="CCCCCC"/>
+          <w:kern w:val="0"/>
+          <w:sz w:val="27"/>
+          <w:szCs w:val="27"/>
+          <w:lang w:eastAsia="en-IN"/>
+          <w14:ligatures w14:val="none"/>
+        </w:rPr>
+      </w:pPr>
+      <w:proofErr w:type="spellStart"/>
+      <w:r>
+        <w:rPr>
+          <w:rFonts w:ascii="Consolas" w:eastAsia="Times New Roman" w:hAnsi="Consolas" w:cs="Times New Roman"/>
+          <w:color w:val="569CD6"/>
+          <w:kern w:val="0"/>
+          <w:sz w:val="27"/>
+          <w:szCs w:val="27"/>
+          <w:lang w:eastAsia="en-IN"/>
+          <w14:ligatures w14:val="none"/>
+        </w:rPr>
+        <w:t>const</w:t>
+      </w:r>
+      <w:proofErr w:type="spellEnd"/>
+      <w:r>
+        <w:rPr>
+          <w:rFonts w:ascii="Consolas" w:eastAsia="Times New Roman" w:hAnsi="Consolas" w:cs="Times New Roman"/>
+          <w:color w:val="CCCCCC"/>
+          <w:kern w:val="0"/>
+          <w:sz w:val="27"/>
+          <w:szCs w:val="27"/>
+          <w:lang w:eastAsia="en-IN"/>
+          <w14:ligatures w14:val="none"/>
+        </w:rPr>
+        <w:t xml:space="preserve"> </w:t>
+      </w:r>
+      <w:r>
+        <w:rPr>
+          <w:rFonts w:ascii="Consolas" w:eastAsia="Times New Roman" w:hAnsi="Consolas" w:cs="Times New Roman"/>
+          <w:color w:val="4FC1FF"/>
+          <w:kern w:val="0"/>
+          <w:sz w:val="27"/>
+          <w:szCs w:val="27"/>
+          <w:lang w:eastAsia="en-IN"/>
+          <w14:ligatures w14:val="none"/>
+        </w:rPr>
+        <w:t>result</w:t>
+      </w:r>
+      <w:r>
+        <w:rPr>
+          <w:rFonts w:ascii="Consolas" w:eastAsia="Times New Roman" w:hAnsi="Consolas" w:cs="Times New Roman"/>
+          <w:color w:val="CCCCCC"/>
+          <w:kern w:val="0"/>
+          <w:sz w:val="27"/>
+          <w:szCs w:val="27"/>
+          <w:lang w:eastAsia="en-IN"/>
+          <w14:ligatures w14:val="none"/>
+        </w:rPr>
+        <w:t xml:space="preserve"> </w:t>
+      </w:r>
+      <w:r>
+        <w:rPr>
+          <w:rFonts w:ascii="Consolas" w:eastAsia="Times New Roman" w:hAnsi="Consolas" w:cs="Times New Roman"/>
+          <w:color w:val="D4D4D4"/>
+          <w:kern w:val="0"/>
+          <w:sz w:val="27"/>
+          <w:szCs w:val="27"/>
+          <w:lang w:eastAsia="en-IN"/>
+          <w14:ligatures w14:val="none"/>
+        </w:rPr>
+        <w:t>=</w:t>
+      </w:r>
+      <w:r>
+        <w:rPr>
+          <w:rFonts w:ascii="Consolas" w:eastAsia="Times New Roman" w:hAnsi="Consolas" w:cs="Times New Roman"/>
+          <w:color w:val="CCCCCC"/>
+          <w:kern w:val="0"/>
+          <w:sz w:val="27"/>
+          <w:szCs w:val="27"/>
+          <w:lang w:eastAsia="en-IN"/>
+          <w14:ligatures w14:val="none"/>
+        </w:rPr>
+        <w:t xml:space="preserve"> </w:t>
+      </w:r>
+      <w:r>
+        <w:rPr>
+          <w:rFonts w:ascii="Consolas" w:eastAsia="Times New Roman" w:hAnsi="Consolas" w:cs="Times New Roman"/>
+          <w:color w:val="C586C0"/>
+          <w:kern w:val="0"/>
+          <w:sz w:val="27"/>
+          <w:szCs w:val="27"/>
+          <w:lang w:eastAsia="en-IN"/>
+          <w14:ligatures w14:val="none"/>
+        </w:rPr>
+        <w:t>await</w:t>
+      </w:r>
+      <w:r>
+        <w:rPr>
+          <w:rFonts w:ascii="Consolas" w:eastAsia="Times New Roman" w:hAnsi="Consolas" w:cs="Times New Roman"/>
+          <w:color w:val="CCCCCC"/>
+          <w:kern w:val="0"/>
+          <w:sz w:val="27"/>
+          <w:szCs w:val="27"/>
+          <w:lang w:eastAsia="en-IN"/>
+          <w14:ligatures w14:val="none"/>
+        </w:rPr>
+        <w:t xml:space="preserve"> </w:t>
+      </w:r>
+      <w:proofErr w:type="spellStart"/>
+      <w:r>
+        <w:rPr>
+          <w:rFonts w:ascii="Consolas" w:eastAsia="Times New Roman" w:hAnsi="Consolas" w:cs="Times New Roman"/>
+          <w:color w:val="4FC1FF"/>
+          <w:kern w:val="0"/>
+          <w:sz w:val="27"/>
+          <w:szCs w:val="27"/>
+          <w:lang w:eastAsia="en-IN"/>
+          <w14:ligatures w14:val="none"/>
+        </w:rPr>
+        <w:t>axios</w:t>
+      </w:r>
+      <w:r>
+        <w:rPr>
+          <w:rFonts w:ascii="Consolas" w:eastAsia="Times New Roman" w:hAnsi="Consolas" w:cs="Times New Roman"/>
+          <w:color w:val="CCCCCC"/>
+          <w:kern w:val="0"/>
+          <w:sz w:val="27"/>
+          <w:szCs w:val="27"/>
+          <w:lang w:eastAsia="en-IN"/>
+          <w14:ligatures w14:val="none"/>
+        </w:rPr>
+        <w:t>.</w:t>
+      </w:r>
+      <w:r>
+        <w:rPr>
+          <w:rFonts w:ascii="Consolas" w:eastAsia="Times New Roman" w:hAnsi="Consolas" w:cs="Times New Roman"/>
+          <w:color w:val="DCDCAA"/>
+          <w:kern w:val="0"/>
+          <w:sz w:val="27"/>
+          <w:szCs w:val="27"/>
+          <w:lang w:eastAsia="en-IN"/>
+          <w14:ligatures w14:val="none"/>
+        </w:rPr>
+        <w:t>get</w:t>
+      </w:r>
+      <w:proofErr w:type="spellEnd"/>
+      <w:r>
+        <w:rPr>
+          <w:rFonts w:ascii="Consolas" w:eastAsia="Times New Roman" w:hAnsi="Consolas" w:cs="Times New Roman"/>
+          <w:color w:val="CCCCCC"/>
+          <w:kern w:val="0"/>
+          <w:sz w:val="27"/>
+          <w:szCs w:val="27"/>
+          <w:lang w:eastAsia="en-IN"/>
+          <w14:ligatures w14:val="none"/>
+        </w:rPr>
+        <w:t>(</w:t>
+      </w:r>
+      <w:r>
+        <w:rPr>
+          <w:rFonts w:ascii="Consolas" w:eastAsia="Times New Roman" w:hAnsi="Consolas" w:cs="Times New Roman"/>
+          <w:color w:val="CE9178"/>
+          <w:kern w:val="0"/>
+          <w:sz w:val="27"/>
+          <w:szCs w:val="27"/>
+          <w:lang w:eastAsia="en-IN"/>
+          <w14:ligatures w14:val="none"/>
+        </w:rPr>
+        <w:t>`</w:t>
+      </w:r>
+      <w:r>
+        <w:rPr>
+          <w:rFonts w:ascii="Consolas" w:eastAsia="Times New Roman" w:hAnsi="Consolas" w:cs="Times New Roman"/>
+          <w:color w:val="569CD6"/>
+          <w:kern w:val="0"/>
+          <w:sz w:val="27"/>
+          <w:szCs w:val="27"/>
+          <w:lang w:eastAsia="en-IN"/>
+          <w14:ligatures w14:val="none"/>
+        </w:rPr>
+        <w:t>${</w:t>
+      </w:r>
+      <w:r>
+        <w:rPr>
+          <w:rFonts w:ascii="Consolas" w:eastAsia="Times New Roman" w:hAnsi="Consolas" w:cs="Times New Roman"/>
+          <w:color w:val="4FC1FF"/>
+          <w:kern w:val="0"/>
+          <w:sz w:val="27"/>
+          <w:szCs w:val="27"/>
+          <w:lang w:eastAsia="en-IN"/>
+          <w14:ligatures w14:val="none"/>
+        </w:rPr>
+        <w:t>API_URL</w:t>
+      </w:r>
+      <w:r>
+        <w:rPr>
+          <w:rFonts w:ascii="Consolas" w:eastAsia="Times New Roman" w:hAnsi="Consolas" w:cs="Times New Roman"/>
+          <w:color w:val="569CD6"/>
+          <w:kern w:val="0"/>
+          <w:sz w:val="27"/>
+          <w:szCs w:val="27"/>
+          <w:lang w:eastAsia="en-IN"/>
+          <w14:ligatures w14:val="none"/>
+        </w:rPr>
+        <w:t>}</w:t>
+      </w:r>
+      <w:r>
+        <w:rPr>
+          <w:rFonts w:ascii="Consolas" w:eastAsia="Times New Roman" w:hAnsi="Consolas" w:cs="Times New Roman"/>
+          <w:color w:val="CE9178"/>
+          <w:kern w:val="0"/>
+          <w:sz w:val="27"/>
+          <w:szCs w:val="27"/>
+          <w:lang w:eastAsia="en-IN"/>
+          <w14:ligatures w14:val="none"/>
+        </w:rPr>
+        <w:t>/secrets/42`</w:t>
+      </w:r>
+      <w:r>
+        <w:rPr>
+          <w:rFonts w:ascii="Consolas" w:eastAsia="Times New Roman" w:hAnsi="Consolas" w:cs="Times New Roman"/>
+          <w:color w:val="CCCCCC"/>
+          <w:kern w:val="0"/>
+          <w:sz w:val="27"/>
+          <w:szCs w:val="27"/>
+          <w:lang w:eastAsia="en-IN"/>
+          <w14:ligatures w14:val="none"/>
+        </w:rPr>
+        <w:t>, {</w:t>
+      </w:r>
+    </w:p>
+    <w:p>
+      <w:pPr>
+        <w:shd w:val="clear" w:color="auto" w:fill="1F1F1F"/>
+        <w:spacing w:after="0" w:line="360" w:lineRule="atLeast"/>
+        <w:rPr>
+          <w:rFonts w:ascii="Consolas" w:eastAsia="Times New Roman" w:hAnsi="Consolas" w:cs="Times New Roman"/>
+          <w:color w:val="CCCCCC"/>
+          <w:kern w:val="0"/>
+          <w:sz w:val="27"/>
+          <w:szCs w:val="27"/>
+          <w:lang w:eastAsia="en-IN"/>
+          <w14:ligatures w14:val="none"/>
+        </w:rPr>
+      </w:pPr>
+      <w:r>
+        <w:rPr>
+          <w:rFonts w:ascii="Consolas" w:eastAsia="Times New Roman" w:hAnsi="Consolas" w:cs="Times New Roman"/>
+          <w:color w:val="CCCCCC"/>
+          <w:kern w:val="0"/>
+          <w:sz w:val="27"/>
+          <w:szCs w:val="27"/>
+          <w:lang w:eastAsia="en-IN"/>
+          <w14:ligatures w14:val="none"/>
+        </w:rPr>
+        <w:t xml:space="preserve">    </w:t>
+      </w:r>
+      <w:r>
+        <w:rPr>
+          <w:rFonts w:ascii="Consolas" w:eastAsia="Times New Roman" w:hAnsi="Consolas" w:cs="Times New Roman"/>
+          <w:color w:val="9CDCFE"/>
+          <w:kern w:val="0"/>
+          <w:sz w:val="27"/>
+          <w:szCs w:val="27"/>
+          <w:lang w:eastAsia="en-IN"/>
+          <w14:ligatures w14:val="none"/>
+        </w:rPr>
+        <w:t>headers:</w:t>
+      </w:r>
+      <w:r>
+        <w:rPr>
+          <w:rFonts w:ascii="Consolas" w:eastAsia="Times New Roman" w:hAnsi="Consolas" w:cs="Times New Roman"/>
+          <w:color w:val="CCCCCC"/>
+          <w:kern w:val="0"/>
+          <w:sz w:val="27"/>
+          <w:szCs w:val="27"/>
+          <w:lang w:eastAsia="en-IN"/>
+          <w14:ligatures w14:val="none"/>
+        </w:rPr>
+        <w:t xml:space="preserve"> { </w:t>
+      </w:r>
+    </w:p>
+    <w:p>
+      <w:pPr>
+        <w:shd w:val="clear" w:color="auto" w:fill="1F1F1F"/>
+        <w:spacing w:after="0" w:line="360" w:lineRule="atLeast"/>
+        <w:rPr>
+          <w:rFonts w:ascii="Consolas" w:eastAsia="Times New Roman" w:hAnsi="Consolas" w:cs="Times New Roman"/>
+          <w:color w:val="CCCCCC"/>
+          <w:kern w:val="0"/>
+          <w:sz w:val="27"/>
+          <w:szCs w:val="27"/>
+          <w:lang w:eastAsia="en-IN"/>
+          <w14:ligatures w14:val="none"/>
+        </w:rPr>
+      </w:pPr>
+      <w:r>
+        <w:rPr>
+          <w:rFonts w:ascii="Consolas" w:eastAsia="Times New Roman" w:hAnsi="Consolas" w:cs="Times New Roman"/>
+          <w:color w:val="CCCCCC"/>
+          <w:kern w:val="0"/>
+          <w:sz w:val="27"/>
+          <w:szCs w:val="27"/>
+          <w:lang w:eastAsia="en-IN"/>
+          <w14:ligatures w14:val="none"/>
+        </w:rPr>
+        <w:t xml:space="preserve">    </w:t>
+      </w:r>
+      <w:r>
+        <w:rPr>
+          <w:rFonts w:ascii="Consolas" w:eastAsia="Times New Roman" w:hAnsi="Consolas" w:cs="Times New Roman"/>
+          <w:color w:val="CCCCCC"/>
+          <w:kern w:val="0"/>
+          <w:sz w:val="27"/>
+          <w:szCs w:val="27"/>
+          <w:lang w:eastAsia="en-IN"/>
+          <w14:ligatures w14:val="none"/>
+        </w:rPr>
+        <w:t xml:space="preserve">    </w:t>
+      </w:r>
+      <w:r>
+        <w:rPr>
+          <w:rFonts w:ascii="Consolas" w:eastAsia="Times New Roman" w:hAnsi="Consolas" w:cs="Times New Roman"/>
+          <w:color w:val="9CDCFE"/>
+          <w:kern w:val="0"/>
+          <w:sz w:val="27"/>
+          <w:szCs w:val="27"/>
+          <w:lang w:eastAsia="en-IN"/>
+          <w14:ligatures w14:val="none"/>
+        </w:rPr>
+        <w:t>Authorization:</w:t>
+      </w:r>
+      <w:r>
+        <w:rPr>
+          <w:rFonts w:ascii="Consolas" w:eastAsia="Times New Roman" w:hAnsi="Consolas" w:cs="Times New Roman"/>
+          <w:color w:val="CCCCCC"/>
+          <w:kern w:val="0"/>
+          <w:sz w:val="27"/>
+          <w:szCs w:val="27"/>
+          <w:lang w:eastAsia="en-IN"/>
+          <w14:ligatures w14:val="none"/>
+        </w:rPr>
+        <w:t xml:space="preserve"> </w:t>
+      </w:r>
+      <w:r>
+        <w:rPr>
+          <w:rFonts w:ascii="Consolas" w:eastAsia="Times New Roman" w:hAnsi="Consolas" w:cs="Times New Roman"/>
+          <w:color w:val="CE9178"/>
+          <w:kern w:val="0"/>
+          <w:sz w:val="27"/>
+          <w:szCs w:val="27"/>
+          <w:lang w:eastAsia="en-IN"/>
+          <w14:ligatures w14:val="none"/>
+        </w:rPr>
+        <w:t xml:space="preserve">`Bearer </w:t>
+      </w:r>
+      <w:r>
+        <w:rPr>
+          <w:rFonts w:ascii="Consolas" w:eastAsia="Times New Roman" w:hAnsi="Consolas" w:cs="Times New Roman"/>
+          <w:color w:val="569CD6"/>
+          <w:kern w:val="0"/>
+          <w:sz w:val="27"/>
+          <w:szCs w:val="27"/>
+          <w:lang w:eastAsia="en-IN"/>
+          <w14:ligatures w14:val="none"/>
+        </w:rPr>
+        <w:t>${</w:t>
+      </w:r>
+      <w:proofErr w:type="spellStart"/>
+      <w:r>
+        <w:rPr>
+          <w:rFonts w:ascii="Consolas" w:eastAsia="Times New Roman" w:hAnsi="Consolas" w:cs="Times New Roman"/>
+          <w:color w:val="4FC1FF"/>
+          <w:kern w:val="0"/>
+          <w:sz w:val="27"/>
+          <w:szCs w:val="27"/>
+          <w:lang w:eastAsia="en-IN"/>
+          <w14:ligatures w14:val="none"/>
+        </w:rPr>
+        <w:t>yourBearerToken</w:t>
+      </w:r>
+      <w:proofErr w:type="spellEnd"/>
+      <w:r>
+        <w:rPr>
+          <w:rFonts w:ascii="Consolas" w:eastAsia="Times New Roman" w:hAnsi="Consolas" w:cs="Times New Roman"/>
+          <w:color w:val="569CD6"/>
+          <w:kern w:val="0"/>
+          <w:sz w:val="27"/>
+          <w:szCs w:val="27"/>
+          <w:lang w:eastAsia="en-IN"/>
+          <w14:ligatures w14:val="none"/>
+        </w:rPr>
+        <w:t>}</w:t>
+      </w:r>
+      <w:r>
+        <w:rPr>
+          <w:rFonts w:ascii="Consolas" w:eastAsia="Times New Roman" w:hAnsi="Consolas" w:cs="Times New Roman"/>
+          <w:color w:val="CE9178"/>
+          <w:kern w:val="0"/>
+          <w:sz w:val="27"/>
+          <w:szCs w:val="27"/>
+          <w:lang w:eastAsia="en-IN"/>
+          <w14:ligatures w14:val="none"/>
+        </w:rPr>
+        <w:t>`</w:t>
+      </w:r>
+      <w:r>
+        <w:rPr>
+          <w:rFonts w:ascii="Consolas" w:eastAsia="Times New Roman" w:hAnsi="Consolas" w:cs="Times New Roman"/>
+          <w:color w:val="CCCCCC"/>
+          <w:kern w:val="0"/>
+          <w:sz w:val="27"/>
+          <w:szCs w:val="27"/>
+          <w:lang w:eastAsia="en-IN"/>
+          <w14:ligatures w14:val="none"/>
+        </w:rPr>
+        <w:t xml:space="preserve"> </w:t>
+      </w:r>
+    </w:p>
+    <w:p>
+      <w:pPr>
+        <w:shd w:val="clear" w:color="auto" w:fill="1F1F1F"/>
+        <w:spacing w:after="0" w:line="360" w:lineRule="atLeast"/>
+        <w:rPr>
+          <w:rFonts w:ascii="Consolas" w:eastAsia="Times New Roman" w:hAnsi="Consolas" w:cs="Times New Roman"/>
+          <w:color w:val="CCCCCC"/>
+          <w:kern w:val="0"/>
+          <w:sz w:val="27"/>
+          <w:szCs w:val="27"/>
+          <w:lang w:eastAsia="en-IN"/>
+          <w14:ligatures w14:val="none"/>
+        </w:rPr>
+      </w:pPr>
+      <w:r>
+        <w:rPr>
+          <w:rFonts w:ascii="Consolas" w:eastAsia="Times New Roman" w:hAnsi="Consolas" w:cs="Times New Roman"/>
+          <w:color w:val="CCCCCC"/>
+          <w:kern w:val="0"/>
+          <w:sz w:val="27"/>
+          <w:szCs w:val="27"/>
+          <w:lang w:eastAsia="en-IN"/>
+          <w14:ligatures w14:val="none"/>
+        </w:rPr>
+        <w:t>    }</w:t>
+      </w:r>
+    </w:p>
+    <w:p>
+      <w:pPr>
+        <w:shd w:val="clear" w:color="auto" w:fill="1F1F1F"/>
+        <w:spacing w:after="0" w:line="360" w:lineRule="atLeast"/>
+        <w:rPr>
+          <w:rFonts w:ascii="Consolas" w:eastAsia="Times New Roman" w:hAnsi="Consolas" w:cs="Times New Roman"/>
+          <w:color w:val="CCCCCC"/>
+          <w:kern w:val="0"/>
+          <w:sz w:val="27"/>
+          <w:szCs w:val="27"/>
+          <w:lang w:eastAsia="en-IN"/>
+          <w14:ligatures w14:val="none"/>
+        </w:rPr>
+      </w:pPr>
+      <w:r>
+        <w:rPr>
+          <w:rFonts w:ascii="Consolas" w:eastAsia="Times New Roman" w:hAnsi="Consolas" w:cs="Times New Roman"/>
+          <w:color w:val="CCCCCC"/>
+          <w:kern w:val="0"/>
+          <w:sz w:val="27"/>
+          <w:szCs w:val="27"/>
+          <w:lang w:eastAsia="en-IN"/>
+          <w14:ligatures w14:val="none"/>
+        </w:rPr>
+        <w:t>});</w:t>
+      </w:r>
+    </w:p>
+    <w:p>
+      <w:pPr>
+        <w:rPr>
+          <w:rFonts w:ascii="Times New Roman" w:hAnsi="Times New Roman" w:cs="Times New Roman"/>
           <w:sz w:val="28"/>
           <w:szCs w:val="28"/>
         </w:rPr>
@@ -6005,16 +8394,16 @@
     </w:lvl>
   </w:abstractNum>
   <w:abstractNum w:abstractNumId="2" w15:restartNumberingAfterBreak="0">
-    <w:nsid w:val="422547C4"/>
+    <w:nsid w:val="33F46773"/>
     <w:multiLevelType w:val="hybridMultilevel"/>
-    <w:tmpl w:val="F71217C4"/>
+    <w:tmpl w:val="054EE412"/>
     <w:lvl w:ilvl="0" w:tplc="40090001">
       <w:start w:val="1"/>
       <w:numFmt w:val="bullet"/>
       <w:lvlText w:val=""/>
       <w:lvlJc w:val="left"/>
       <w:pPr>
-        <w:ind w:left="720" w:hanging="360"/>
+        <w:ind w:left="2520" w:hanging="360"/>
       </w:pPr>
       <w:rPr>
         <w:rFonts w:ascii="Symbol" w:hAnsi="Symbol" w:hint="default"/>
@@ -6026,7 +8415,7 @@
       <w:lvlText w:val="o"/>
       <w:lvlJc w:val="left"/>
       <w:pPr>
-        <w:ind w:left="1440" w:hanging="360"/>
+        <w:ind w:left="3240" w:hanging="360"/>
       </w:pPr>
       <w:rPr>
         <w:rFonts w:ascii="Courier New" w:hAnsi="Courier New" w:cs="Courier New" w:hint="default"/>
@@ -6038,7 +8427,7 @@
       <w:lvlText w:val=""/>
       <w:lvlJc w:val="left"/>
       <w:pPr>
-        <w:ind w:left="2160" w:hanging="360"/>
+        <w:ind w:left="3960" w:hanging="360"/>
       </w:pPr>
       <w:rPr>
         <w:rFonts w:ascii="Wingdings" w:hAnsi="Wingdings" w:hint="default"/>
@@ -6050,7 +8439,7 @@
       <w:lvlText w:val=""/>
       <w:lvlJc w:val="left"/>
       <w:pPr>
-        <w:ind w:left="2880" w:hanging="360"/>
+        <w:ind w:left="4680" w:hanging="360"/>
       </w:pPr>
       <w:rPr>
         <w:rFonts w:ascii="Symbol" w:hAnsi="Symbol" w:hint="default"/>
@@ -6062,7 +8451,7 @@
       <w:lvlText w:val="o"/>
       <w:lvlJc w:val="left"/>
       <w:pPr>
-        <w:ind w:left="3600" w:hanging="360"/>
+        <w:ind w:left="5400" w:hanging="360"/>
       </w:pPr>
       <w:rPr>
         <w:rFonts w:ascii="Courier New" w:hAnsi="Courier New" w:cs="Courier New" w:hint="default"/>
@@ -6074,7 +8463,7 @@
       <w:lvlText w:val=""/>
       <w:lvlJc w:val="left"/>
       <w:pPr>
-        <w:ind w:left="4320" w:hanging="360"/>
+        <w:ind w:left="6120" w:hanging="360"/>
       </w:pPr>
       <w:rPr>
         <w:rFonts w:ascii="Wingdings" w:hAnsi="Wingdings" w:hint="default"/>
@@ -6086,7 +8475,7 @@
       <w:lvlText w:val=""/>
       <w:lvlJc w:val="left"/>
       <w:pPr>
-        <w:ind w:left="5040" w:hanging="360"/>
+        <w:ind w:left="6840" w:hanging="360"/>
       </w:pPr>
       <w:rPr>
         <w:rFonts w:ascii="Symbol" w:hAnsi="Symbol" w:hint="default"/>
@@ -6098,7 +8487,7 @@
       <w:lvlText w:val="o"/>
       <w:lvlJc w:val="left"/>
       <w:pPr>
-        <w:ind w:left="5760" w:hanging="360"/>
+        <w:ind w:left="7560" w:hanging="360"/>
       </w:pPr>
       <w:rPr>
         <w:rFonts w:ascii="Courier New" w:hAnsi="Courier New" w:cs="Courier New" w:hint="default"/>
@@ -6110,7 +8499,7 @@
       <w:lvlText w:val=""/>
       <w:lvlJc w:val="left"/>
       <w:pPr>
-        <w:ind w:left="6480" w:hanging="360"/>
+        <w:ind w:left="8280" w:hanging="360"/>
       </w:pPr>
       <w:rPr>
         <w:rFonts w:ascii="Wingdings" w:hAnsi="Wingdings" w:hint="default"/>
@@ -6118,9 +8507,122 @@
     </w:lvl>
   </w:abstractNum>
   <w:abstractNum w:abstractNumId="3" w15:restartNumberingAfterBreak="0">
-    <w:nsid w:val="7F2B7108"/>
+    <w:nsid w:val="422547C4"/>
     <w:multiLevelType w:val="hybridMultilevel"/>
-    <w:tmpl w:val="3D3A4710"/>
+    <w:tmpl w:val="F71217C4"/>
+    <w:lvl w:ilvl="0" w:tplc="40090001">
+      <w:start w:val="1"/>
+      <w:numFmt w:val="bullet"/>
+      <w:lvlText w:val=""/>
+      <w:lvlJc w:val="left"/>
+      <w:pPr>
+        <w:ind w:left="720" w:hanging="360"/>
+      </w:pPr>
+      <w:rPr>
+        <w:rFonts w:ascii="Symbol" w:hAnsi="Symbol" w:hint="default"/>
+      </w:rPr>
+    </w:lvl>
+    <w:lvl w:ilvl="1" w:tplc="40090003" w:tentative="1">
+      <w:start w:val="1"/>
+      <w:numFmt w:val="bullet"/>
+      <w:lvlText w:val="o"/>
+      <w:lvlJc w:val="left"/>
+      <w:pPr>
+        <w:ind w:left="1440" w:hanging="360"/>
+      </w:pPr>
+      <w:rPr>
+        <w:rFonts w:ascii="Courier New" w:hAnsi="Courier New" w:cs="Courier New" w:hint="default"/>
+      </w:rPr>
+    </w:lvl>
+    <w:lvl w:ilvl="2" w:tplc="40090005" w:tentative="1">
+      <w:start w:val="1"/>
+      <w:numFmt w:val="bullet"/>
+      <w:lvlText w:val=""/>
+      <w:lvlJc w:val="left"/>
+      <w:pPr>
+        <w:ind w:left="2160" w:hanging="360"/>
+      </w:pPr>
+      <w:rPr>
+        <w:rFonts w:ascii="Wingdings" w:hAnsi="Wingdings" w:hint="default"/>
+      </w:rPr>
+    </w:lvl>
+    <w:lvl w:ilvl="3" w:tplc="40090001" w:tentative="1">
+      <w:start w:val="1"/>
+      <w:numFmt w:val="bullet"/>
+      <w:lvlText w:val=""/>
+      <w:lvlJc w:val="left"/>
+      <w:pPr>
+        <w:ind w:left="2880" w:hanging="360"/>
+      </w:pPr>
+      <w:rPr>
+        <w:rFonts w:ascii="Symbol" w:hAnsi="Symbol" w:hint="default"/>
+      </w:rPr>
+    </w:lvl>
+    <w:lvl w:ilvl="4" w:tplc="40090003" w:tentative="1">
+      <w:start w:val="1"/>
+      <w:numFmt w:val="bullet"/>
+      <w:lvlText w:val="o"/>
+      <w:lvlJc w:val="left"/>
+      <w:pPr>
+        <w:ind w:left="3600" w:hanging="360"/>
+      </w:pPr>
+      <w:rPr>
+        <w:rFonts w:ascii="Courier New" w:hAnsi="Courier New" w:cs="Courier New" w:hint="default"/>
+      </w:rPr>
+    </w:lvl>
+    <w:lvl w:ilvl="5" w:tplc="40090005" w:tentative="1">
+      <w:start w:val="1"/>
+      <w:numFmt w:val="bullet"/>
+      <w:lvlText w:val=""/>
+      <w:lvlJc w:val="left"/>
+      <w:pPr>
+        <w:ind w:left="4320" w:hanging="360"/>
+      </w:pPr>
+      <w:rPr>
+        <w:rFonts w:ascii="Wingdings" w:hAnsi="Wingdings" w:hint="default"/>
+      </w:rPr>
+    </w:lvl>
+    <w:lvl w:ilvl="6" w:tplc="40090001" w:tentative="1">
+      <w:start w:val="1"/>
+      <w:numFmt w:val="bullet"/>
+      <w:lvlText w:val=""/>
+      <w:lvlJc w:val="left"/>
+      <w:pPr>
+        <w:ind w:left="5040" w:hanging="360"/>
+      </w:pPr>
+      <w:rPr>
+        <w:rFonts w:ascii="Symbol" w:hAnsi="Symbol" w:hint="default"/>
+      </w:rPr>
+    </w:lvl>
+    <w:lvl w:ilvl="7" w:tplc="40090003" w:tentative="1">
+      <w:start w:val="1"/>
+      <w:numFmt w:val="bullet"/>
+      <w:lvlText w:val="o"/>
+      <w:lvlJc w:val="left"/>
+      <w:pPr>
+        <w:ind w:left="5760" w:hanging="360"/>
+      </w:pPr>
+      <w:rPr>
+        <w:rFonts w:ascii="Courier New" w:hAnsi="Courier New" w:cs="Courier New" w:hint="default"/>
+      </w:rPr>
+    </w:lvl>
+    <w:lvl w:ilvl="8" w:tplc="40090005" w:tentative="1">
+      <w:start w:val="1"/>
+      <w:numFmt w:val="bullet"/>
+      <w:lvlText w:val=""/>
+      <w:lvlJc w:val="left"/>
+      <w:pPr>
+        <w:ind w:left="6480" w:hanging="360"/>
+      </w:pPr>
+      <w:rPr>
+        <w:rFonts w:ascii="Wingdings" w:hAnsi="Wingdings" w:hint="default"/>
+      </w:rPr>
+    </w:lvl>
+  </w:abstractNum>
+  <w:abstractNum w:abstractNumId="4" w15:restartNumberingAfterBreak="0">
+    <w:nsid w:val="58882618"/>
+    <w:multiLevelType w:val="hybridMultilevel"/>
+    <w:tmpl w:val="26F88210"/>
     <w:lvl w:ilvl="0" w:tplc="40090001">
       <w:start w:val="1"/>
       <w:numFmt w:val="bullet"/>
@@ -6145,7 +8647,7 @@
         <w:rFonts w:ascii="Courier New" w:hAnsi="Courier New" w:cs="Courier New" w:hint="default"/>
       </w:rPr>
     </w:lvl>
-    <w:lvl w:ilvl="2" w:tplc="40090005" w:tentative="1">
+    <w:lvl w:ilvl="2" w:tplc="40090005">
       <w:start w:val="1"/>
       <w:numFmt w:val="bullet"/>
       <w:lvlText w:val=""/>
@@ -6230,16 +8732,135 @@
       </w:rPr>
     </w:lvl>
   </w:abstractNum>
+  <w:abstractNum w:abstractNumId="5" w15:restartNumberingAfterBreak="0">
+    <w:nsid w:val="7F2B7108"/>
+    <w:multiLevelType w:val="hybridMultilevel"/>
+    <w:tmpl w:val="3D3A4710"/>
+    <w:lvl w:ilvl="0" w:tplc="40090001">
+      <w:start w:val="1"/>
+      <w:numFmt w:val="bullet"/>
+      <w:lvlText w:val=""/>
+      <w:lvlJc w:val="left"/>
+      <w:pPr>
+        <w:ind w:left="720" w:hanging="360"/>
+      </w:pPr>
+      <w:rPr>
+        <w:rFonts w:ascii="Symbol" w:hAnsi="Symbol" w:hint="default"/>
+      </w:rPr>
+    </w:lvl>
+    <w:lvl w:ilvl="1" w:tplc="40090003">
+      <w:start w:val="1"/>
+      <w:numFmt w:val="bullet"/>
+      <w:lvlText w:val="o"/>
+      <w:lvlJc w:val="left"/>
+      <w:pPr>
+        <w:ind w:left="1440" w:hanging="360"/>
+      </w:pPr>
+      <w:rPr>
+        <w:rFonts w:ascii="Courier New" w:hAnsi="Courier New" w:cs="Courier New" w:hint="default"/>
+      </w:rPr>
+    </w:lvl>
+    <w:lvl w:ilvl="2" w:tplc="40090005" w:tentative="1">
+      <w:start w:val="1"/>
+      <w:numFmt w:val="bullet"/>
+      <w:lvlText w:val=""/>
+      <w:lvlJc w:val="left"/>
+      <w:pPr>
+        <w:ind w:left="2160" w:hanging="360"/>
+      </w:pPr>
+      <w:rPr>
+        <w:rFonts w:ascii="Wingdings" w:hAnsi="Wingdings" w:hint="default"/>
+      </w:rPr>
+    </w:lvl>
+    <w:lvl w:ilvl="3" w:tplc="40090001" w:tentative="1">
+      <w:start w:val="1"/>
+      <w:numFmt w:val="bullet"/>
+      <w:lvlText w:val=""/>
+      <w:lvlJc w:val="left"/>
+      <w:pPr>
+        <w:ind w:left="2880" w:hanging="360"/>
+      </w:pPr>
+      <w:rPr>
+        <w:rFonts w:ascii="Symbol" w:hAnsi="Symbol" w:hint="default"/>
+      </w:rPr>
+    </w:lvl>
+    <w:lvl w:ilvl="4" w:tplc="40090003" w:tentative="1">
+      <w:start w:val="1"/>
+      <w:numFmt w:val="bullet"/>
+      <w:lvlText w:val="o"/>
+      <w:lvlJc w:val="left"/>
+      <w:pPr>
+        <w:ind w:left="3600" w:hanging="360"/>
+      </w:pPr>
+      <w:rPr>
+        <w:rFonts w:ascii="Courier New" w:hAnsi="Courier New" w:cs="Courier New" w:hint="default"/>
+      </w:rPr>
+    </w:lvl>
+    <w:lvl w:ilvl="5" w:tplc="40090005" w:tentative="1">
+      <w:start w:val="1"/>
+      <w:numFmt w:val="bullet"/>
+      <w:lvlText w:val=""/>
+      <w:lvlJc w:val="left"/>
+      <w:pPr>
+        <w:ind w:left="4320" w:hanging="360"/>
+      </w:pPr>
+      <w:rPr>
+        <w:rFonts w:ascii="Wingdings" w:hAnsi="Wingdings" w:hint="default"/>
+      </w:rPr>
+    </w:lvl>
+    <w:lvl w:ilvl="6" w:tplc="40090001" w:tentative="1">
+      <w:start w:val="1"/>
+      <w:numFmt w:val="bullet"/>
+      <w:lvlText w:val=""/>
+      <w:lvlJc w:val="left"/>
+      <w:pPr>
+        <w:ind w:left="5040" w:hanging="360"/>
+      </w:pPr>
+      <w:rPr>
+        <w:rFonts w:ascii="Symbol" w:hAnsi="Symbol" w:hint="default"/>
+      </w:rPr>
+    </w:lvl>
+    <w:lvl w:ilvl="7" w:tplc="40090003" w:tentative="1">
+      <w:start w:val="1"/>
+      <w:numFmt w:val="bullet"/>
+      <w:lvlText w:val="o"/>
+      <w:lvlJc w:val="left"/>
+      <w:pPr>
+        <w:ind w:left="5760" w:hanging="360"/>
+      </w:pPr>
+      <w:rPr>
+        <w:rFonts w:ascii="Courier New" w:hAnsi="Courier New" w:cs="Courier New" w:hint="default"/>
+      </w:rPr>
+    </w:lvl>
+    <w:lvl w:ilvl="8" w:tplc="40090005" w:tentative="1">
+      <w:start w:val="1"/>
+      <w:numFmt w:val="bullet"/>
+      <w:lvlText w:val=""/>
+      <w:lvlJc w:val="left"/>
+      <w:pPr>
+        <w:ind w:left="6480" w:hanging="360"/>
+      </w:pPr>
+      <w:rPr>
+        <w:rFonts w:ascii="Wingdings" w:hAnsi="Wingdings" w:hint="default"/>
+      </w:rPr>
+    </w:lvl>
+  </w:abstractNum>
   <w:num w:numId="1" w16cid:durableId="841706306">
     <w:abstractNumId w:val="0"/>
   </w:num>
   <w:num w:numId="2" w16cid:durableId="1449620020">
-    <w:abstractNumId w:val="3"/>
+    <w:abstractNumId w:val="5"/>
   </w:num>
   <w:num w:numId="3" w16cid:durableId="1833835701">
     <w:abstractNumId w:val="1"/>
   </w:num>
   <w:num w:numId="4" w16cid:durableId="1628658768">
+    <w:abstractNumId w:val="3"/>
+  </w:num>
+  <w:num w:numId="5" w16cid:durableId="348023977">
+    <w:abstractNumId w:val="4"/>
+  </w:num>
+  <w:num w:numId="6" w16cid:durableId="1829830663">
     <w:abstractNumId w:val="2"/>
   </w:num>
 </w:numbering>

</xml_diff>

<commit_message>
Make notes for 28/229
</commit_message>
<xml_diff>
--- a/section28_applicationProgrammingInterfaces/section28_APINotes.docx
+++ b/section28_applicationProgrammingInterfaces/section28_APINotes.docx
@@ -1231,7 +1231,6 @@
         </w:rPr>
         <w:t xml:space="preserve"> </w:t>
       </w:r>
-      <w:proofErr w:type="spellStart"/>
       <w:r>
         <w:rPr>
           <w:rFonts w:ascii="Consolas" w:eastAsia="Times New Roman" w:hAnsi="Consolas" w:cs="Times New Roman"/>
@@ -1244,7 +1243,6 @@
         </w:rPr>
         <w:t>axios</w:t>
       </w:r>
-      <w:proofErr w:type="spellEnd"/>
       <w:r>
         <w:rPr>
           <w:rFonts w:ascii="Consolas" w:eastAsia="Times New Roman" w:hAnsi="Consolas" w:cs="Times New Roman"/>
@@ -1291,33 +1289,7 @@
           <w:lang w:eastAsia="en-IN"/>
           <w14:ligatures w14:val="none"/>
         </w:rPr>
-        <w:t>"</w:t>
-      </w:r>
-      <w:proofErr w:type="spellStart"/>
-      <w:r>
-        <w:rPr>
-          <w:rFonts w:ascii="Consolas" w:eastAsia="Times New Roman" w:hAnsi="Consolas" w:cs="Times New Roman"/>
-          <w:color w:val="CE9178"/>
-          <w:kern w:val="0"/>
-          <w:sz w:val="27"/>
-          <w:szCs w:val="27"/>
-          <w:lang w:eastAsia="en-IN"/>
-          <w14:ligatures w14:val="none"/>
-        </w:rPr>
-        <w:t>axios</w:t>
-      </w:r>
-      <w:proofErr w:type="spellEnd"/>
-      <w:r>
-        <w:rPr>
-          <w:rFonts w:ascii="Consolas" w:eastAsia="Times New Roman" w:hAnsi="Consolas" w:cs="Times New Roman"/>
-          <w:color w:val="CE9178"/>
-          <w:kern w:val="0"/>
-          <w:sz w:val="27"/>
-          <w:szCs w:val="27"/>
-          <w:lang w:eastAsia="en-IN"/>
-          <w14:ligatures w14:val="none"/>
-        </w:rPr>
-        <w:t>"</w:t>
+        <w:t>"axios"</w:t>
       </w:r>
       <w:r>
         <w:rPr>
@@ -8154,6 +8126,2755 @@
           <w:szCs w:val="28"/>
         </w:rPr>
       </w:pPr>
+    </w:p>
+    <w:p>
+      <w:pPr>
+        <w:rPr>
+          <w:rFonts w:ascii="Times New Roman" w:hAnsi="Times New Roman" w:cs="Times New Roman"/>
+          <w:b/>
+          <w:bCs/>
+          <w:sz w:val="28"/>
+          <w:szCs w:val="28"/>
+        </w:rPr>
+      </w:pPr>
+      <w:r>
+        <w:rPr>
+          <w:rFonts w:ascii="Times New Roman" w:hAnsi="Times New Roman" w:cs="Times New Roman"/>
+          <w:b/>
+          <w:bCs/>
+          <w:sz w:val="28"/>
+          <w:szCs w:val="28"/>
+        </w:rPr>
+        <w:t>229. REST APIs</w:t>
+      </w:r>
+    </w:p>
+    <w:p>
+      <w:pPr>
+        <w:pStyle w:val="ListParagraph"/>
+        <w:numPr>
+          <w:ilvl w:val="0"/>
+          <w:numId w:val="7"/>
+        </w:numPr>
+        <w:rPr>
+          <w:rFonts w:ascii="Times New Roman" w:hAnsi="Times New Roman" w:cs="Times New Roman"/>
+          <w:sz w:val="28"/>
+          <w:szCs w:val="28"/>
+        </w:rPr>
+      </w:pPr>
+      <w:r>
+        <w:rPr>
+          <w:rFonts w:ascii="Times New Roman" w:hAnsi="Times New Roman" w:cs="Times New Roman"/>
+          <w:sz w:val="28"/>
+          <w:szCs w:val="28"/>
+        </w:rPr>
+        <w:t xml:space="preserve">There is an alternative way of calling axios where we chain .then, .catch and even .finally; </w:t>
+      </w:r>
+      <w:r>
+        <w:rPr>
+          <w:rFonts w:ascii="Times New Roman" w:hAnsi="Times New Roman" w:cs="Times New Roman"/>
+          <w:sz w:val="28"/>
+          <w:szCs w:val="28"/>
+        </w:rPr>
+        <w:t>.then gets triggered only when a promise is fulfilled.</w:t>
+      </w:r>
+      <w:r>
+        <w:rPr>
+          <w:rFonts w:ascii="Times New Roman" w:hAnsi="Times New Roman" w:cs="Times New Roman"/>
+          <w:sz w:val="28"/>
+          <w:szCs w:val="28"/>
+        </w:rPr>
+        <w:t xml:space="preserve"> This is an old way and not in use now.</w:t>
+      </w:r>
+    </w:p>
+    <w:p>
+      <w:pPr>
+        <w:pStyle w:val="ListParagraph"/>
+        <w:numPr>
+          <w:ilvl w:val="0"/>
+          <w:numId w:val="7"/>
+        </w:numPr>
+        <w:rPr>
+          <w:rFonts w:ascii="Times New Roman" w:hAnsi="Times New Roman" w:cs="Times New Roman"/>
+          <w:sz w:val="28"/>
+          <w:szCs w:val="28"/>
+        </w:rPr>
+      </w:pPr>
+      <w:r>
+        <w:rPr>
+          <w:rFonts w:ascii="Times New Roman" w:hAnsi="Times New Roman" w:cs="Times New Roman"/>
+          <w:sz w:val="28"/>
+          <w:szCs w:val="28"/>
+        </w:rPr>
+        <w:t xml:space="preserve">`async` </w:t>
+      </w:r>
+      <w:r>
+        <w:rPr>
+          <w:rFonts w:ascii="Times New Roman" w:hAnsi="Times New Roman" w:cs="Times New Roman"/>
+          <w:sz w:val="28"/>
+          <w:szCs w:val="28"/>
+        </w:rPr>
+        <w:t>allows the function to operate asynchronously, meaning it can perform non-blocking operations. Inside an async function, you can use the await keyword to wait for asynchronous operations to complete.</w:t>
+      </w:r>
+    </w:p>
+    <w:p>
+      <w:pPr>
+        <w:pStyle w:val="ListParagraph"/>
+        <w:numPr>
+          <w:ilvl w:val="0"/>
+          <w:numId w:val="7"/>
+        </w:numPr>
+        <w:rPr>
+          <w:rFonts w:ascii="Times New Roman" w:hAnsi="Times New Roman" w:cs="Times New Roman"/>
+          <w:sz w:val="28"/>
+          <w:szCs w:val="28"/>
+        </w:rPr>
+      </w:pPr>
+      <w:r>
+        <w:rPr>
+          <w:rFonts w:ascii="Times New Roman" w:hAnsi="Times New Roman" w:cs="Times New Roman"/>
+          <w:sz w:val="28"/>
+          <w:szCs w:val="28"/>
+        </w:rPr>
+        <w:t xml:space="preserve">`await` </w:t>
+      </w:r>
+      <w:r>
+        <w:rPr>
+          <w:rFonts w:ascii="Times New Roman" w:hAnsi="Times New Roman" w:cs="Times New Roman"/>
+          <w:sz w:val="28"/>
+          <w:szCs w:val="28"/>
+        </w:rPr>
+        <w:t>makes the code wait for the promise to resolve and returns the resolved value. If the promise is rejected, it throws an error which can be caught using try...catch.</w:t>
+      </w:r>
+    </w:p>
+    <w:p>
+      <w:pPr>
+        <w:pStyle w:val="ListParagraph"/>
+        <w:numPr>
+          <w:ilvl w:val="0"/>
+          <w:numId w:val="7"/>
+        </w:numPr>
+        <w:rPr>
+          <w:rFonts w:ascii="Times New Roman" w:hAnsi="Times New Roman" w:cs="Times New Roman"/>
+          <w:sz w:val="28"/>
+          <w:szCs w:val="28"/>
+        </w:rPr>
+      </w:pPr>
+      <w:r>
+        <w:rPr>
+          <w:rFonts w:ascii="Times New Roman" w:hAnsi="Times New Roman" w:cs="Times New Roman"/>
+          <w:sz w:val="28"/>
+          <w:szCs w:val="28"/>
+        </w:rPr>
+        <w:t>HTTP protocols supported by axios (REST architectural design):</w:t>
+      </w:r>
+    </w:p>
+    <w:p>
+      <w:pPr>
+        <w:pStyle w:val="ListParagraph"/>
+        <w:numPr>
+          <w:ilvl w:val="1"/>
+          <w:numId w:val="7"/>
+        </w:numPr>
+        <w:rPr>
+          <w:rFonts w:ascii="Times New Roman" w:hAnsi="Times New Roman" w:cs="Times New Roman"/>
+          <w:sz w:val="28"/>
+          <w:szCs w:val="28"/>
+        </w:rPr>
+      </w:pPr>
+      <w:proofErr w:type="spellStart"/>
+      <w:r>
+        <w:rPr>
+          <w:rFonts w:ascii="Consolas" w:hAnsi="Consolas" w:cs="Times New Roman"/>
+          <w:b/>
+          <w:bCs/>
+          <w:sz w:val="28"/>
+          <w:szCs w:val="28"/>
+        </w:rPr>
+        <w:t>axios.get</w:t>
+      </w:r>
+      <w:proofErr w:type="spellEnd"/>
+      <w:r>
+        <w:rPr>
+          <w:rFonts w:ascii="Consolas" w:hAnsi="Consolas" w:cs="Times New Roman"/>
+          <w:b/>
+          <w:bCs/>
+          <w:sz w:val="28"/>
+          <w:szCs w:val="28"/>
+        </w:rPr>
+        <w:t>(</w:t>
+      </w:r>
+      <w:proofErr w:type="spellStart"/>
+      <w:r>
+        <w:rPr>
+          <w:rFonts w:ascii="Consolas" w:hAnsi="Consolas" w:cs="Times New Roman"/>
+          <w:b/>
+          <w:bCs/>
+          <w:sz w:val="28"/>
+          <w:szCs w:val="28"/>
+        </w:rPr>
+        <w:t>url</w:t>
+      </w:r>
+      <w:proofErr w:type="spellEnd"/>
+      <w:r>
+        <w:rPr>
+          <w:rFonts w:ascii="Consolas" w:hAnsi="Consolas" w:cs="Times New Roman"/>
+          <w:b/>
+          <w:bCs/>
+          <w:sz w:val="28"/>
+          <w:szCs w:val="28"/>
+        </w:rPr>
+        <w:t>[, config])</w:t>
+      </w:r>
+      <w:r>
+        <w:rPr>
+          <w:rFonts w:ascii="Consolas" w:hAnsi="Consolas" w:cs="Times New Roman"/>
+          <w:sz w:val="28"/>
+          <w:szCs w:val="28"/>
+        </w:rPr>
+        <w:t>:</w:t>
+      </w:r>
+      <w:r>
+        <w:rPr>
+          <w:rFonts w:ascii="Times New Roman" w:hAnsi="Times New Roman" w:cs="Times New Roman"/>
+          <w:sz w:val="28"/>
+          <w:szCs w:val="28"/>
+        </w:rPr>
+        <w:t xml:space="preserve"> Sends a GET request to the specified URL to retrieve data.</w:t>
+      </w:r>
+    </w:p>
+    <w:p>
+      <w:pPr>
+        <w:shd w:val="clear" w:color="auto" w:fill="1F1F1F"/>
+        <w:spacing w:after="0" w:line="360" w:lineRule="atLeast"/>
+        <w:rPr>
+          <w:rFonts w:ascii="Consolas" w:eastAsia="Times New Roman" w:hAnsi="Consolas" w:cs="Times New Roman"/>
+          <w:color w:val="CCCCCC"/>
+          <w:kern w:val="0"/>
+          <w:sz w:val="27"/>
+          <w:szCs w:val="27"/>
+          <w:lang w:eastAsia="en-IN"/>
+          <w14:ligatures w14:val="none"/>
+        </w:rPr>
+      </w:pPr>
+      <w:proofErr w:type="spellStart"/>
+      <w:r>
+        <w:rPr>
+          <w:rFonts w:ascii="Consolas" w:eastAsia="Times New Roman" w:hAnsi="Consolas" w:cs="Times New Roman"/>
+          <w:color w:val="569CD6"/>
+          <w:kern w:val="0"/>
+          <w:sz w:val="27"/>
+          <w:szCs w:val="27"/>
+          <w:lang w:eastAsia="en-IN"/>
+          <w14:ligatures w14:val="none"/>
+        </w:rPr>
+        <w:t>const</w:t>
+      </w:r>
+      <w:proofErr w:type="spellEnd"/>
+      <w:r>
+        <w:rPr>
+          <w:rFonts w:ascii="Consolas" w:eastAsia="Times New Roman" w:hAnsi="Consolas" w:cs="Times New Roman"/>
+          <w:color w:val="CCCCCC"/>
+          <w:kern w:val="0"/>
+          <w:sz w:val="27"/>
+          <w:szCs w:val="27"/>
+          <w:lang w:eastAsia="en-IN"/>
+          <w14:ligatures w14:val="none"/>
+        </w:rPr>
+        <w:t xml:space="preserve"> </w:t>
+      </w:r>
+      <w:r>
+        <w:rPr>
+          <w:rFonts w:ascii="Consolas" w:eastAsia="Times New Roman" w:hAnsi="Consolas" w:cs="Times New Roman"/>
+          <w:color w:val="4FC1FF"/>
+          <w:kern w:val="0"/>
+          <w:sz w:val="27"/>
+          <w:szCs w:val="27"/>
+          <w:lang w:eastAsia="en-IN"/>
+          <w14:ligatures w14:val="none"/>
+        </w:rPr>
+        <w:t>result</w:t>
+      </w:r>
+      <w:r>
+        <w:rPr>
+          <w:rFonts w:ascii="Consolas" w:eastAsia="Times New Roman" w:hAnsi="Consolas" w:cs="Times New Roman"/>
+          <w:color w:val="CCCCCC"/>
+          <w:kern w:val="0"/>
+          <w:sz w:val="27"/>
+          <w:szCs w:val="27"/>
+          <w:lang w:eastAsia="en-IN"/>
+          <w14:ligatures w14:val="none"/>
+        </w:rPr>
+        <w:t xml:space="preserve"> </w:t>
+      </w:r>
+      <w:r>
+        <w:rPr>
+          <w:rFonts w:ascii="Consolas" w:eastAsia="Times New Roman" w:hAnsi="Consolas" w:cs="Times New Roman"/>
+          <w:color w:val="D4D4D4"/>
+          <w:kern w:val="0"/>
+          <w:sz w:val="27"/>
+          <w:szCs w:val="27"/>
+          <w:lang w:eastAsia="en-IN"/>
+          <w14:ligatures w14:val="none"/>
+        </w:rPr>
+        <w:t>=</w:t>
+      </w:r>
+      <w:r>
+        <w:rPr>
+          <w:rFonts w:ascii="Consolas" w:eastAsia="Times New Roman" w:hAnsi="Consolas" w:cs="Times New Roman"/>
+          <w:color w:val="CCCCCC"/>
+          <w:kern w:val="0"/>
+          <w:sz w:val="27"/>
+          <w:szCs w:val="27"/>
+          <w:lang w:eastAsia="en-IN"/>
+          <w14:ligatures w14:val="none"/>
+        </w:rPr>
+        <w:t xml:space="preserve"> </w:t>
+      </w:r>
+      <w:r>
+        <w:rPr>
+          <w:rFonts w:ascii="Consolas" w:eastAsia="Times New Roman" w:hAnsi="Consolas" w:cs="Times New Roman"/>
+          <w:color w:val="C586C0"/>
+          <w:kern w:val="0"/>
+          <w:sz w:val="27"/>
+          <w:szCs w:val="27"/>
+          <w:lang w:eastAsia="en-IN"/>
+          <w14:ligatures w14:val="none"/>
+        </w:rPr>
+        <w:t>await</w:t>
+      </w:r>
+      <w:r>
+        <w:rPr>
+          <w:rFonts w:ascii="Consolas" w:eastAsia="Times New Roman" w:hAnsi="Consolas" w:cs="Times New Roman"/>
+          <w:color w:val="CCCCCC"/>
+          <w:kern w:val="0"/>
+          <w:sz w:val="27"/>
+          <w:szCs w:val="27"/>
+          <w:lang w:eastAsia="en-IN"/>
+          <w14:ligatures w14:val="none"/>
+        </w:rPr>
+        <w:t xml:space="preserve"> </w:t>
+      </w:r>
+      <w:proofErr w:type="spellStart"/>
+      <w:r>
+        <w:rPr>
+          <w:rFonts w:ascii="Consolas" w:eastAsia="Times New Roman" w:hAnsi="Consolas" w:cs="Times New Roman"/>
+          <w:color w:val="4FC1FF"/>
+          <w:kern w:val="0"/>
+          <w:sz w:val="27"/>
+          <w:szCs w:val="27"/>
+          <w:lang w:eastAsia="en-IN"/>
+          <w14:ligatures w14:val="none"/>
+        </w:rPr>
+        <w:t>axios</w:t>
+      </w:r>
+      <w:r>
+        <w:rPr>
+          <w:rFonts w:ascii="Consolas" w:eastAsia="Times New Roman" w:hAnsi="Consolas" w:cs="Times New Roman"/>
+          <w:color w:val="CCCCCC"/>
+          <w:kern w:val="0"/>
+          <w:sz w:val="27"/>
+          <w:szCs w:val="27"/>
+          <w:lang w:eastAsia="en-IN"/>
+          <w14:ligatures w14:val="none"/>
+        </w:rPr>
+        <w:t>.</w:t>
+      </w:r>
+      <w:r>
+        <w:rPr>
+          <w:rFonts w:ascii="Consolas" w:eastAsia="Times New Roman" w:hAnsi="Consolas" w:cs="Times New Roman"/>
+          <w:color w:val="DCDCAA"/>
+          <w:kern w:val="0"/>
+          <w:sz w:val="27"/>
+          <w:szCs w:val="27"/>
+          <w:lang w:eastAsia="en-IN"/>
+          <w14:ligatures w14:val="none"/>
+        </w:rPr>
+        <w:t>get</w:t>
+      </w:r>
+      <w:proofErr w:type="spellEnd"/>
+      <w:r>
+        <w:rPr>
+          <w:rFonts w:ascii="Consolas" w:eastAsia="Times New Roman" w:hAnsi="Consolas" w:cs="Times New Roman"/>
+          <w:color w:val="CCCCCC"/>
+          <w:kern w:val="0"/>
+          <w:sz w:val="27"/>
+          <w:szCs w:val="27"/>
+          <w:lang w:eastAsia="en-IN"/>
+          <w14:ligatures w14:val="none"/>
+        </w:rPr>
+        <w:t>(</w:t>
+      </w:r>
+      <w:r>
+        <w:rPr>
+          <w:rFonts w:ascii="Consolas" w:eastAsia="Times New Roman" w:hAnsi="Consolas" w:cs="Times New Roman"/>
+          <w:color w:val="CE9178"/>
+          <w:kern w:val="0"/>
+          <w:sz w:val="27"/>
+          <w:szCs w:val="27"/>
+          <w:lang w:eastAsia="en-IN"/>
+          <w14:ligatures w14:val="none"/>
+        </w:rPr>
+        <w:t>`</w:t>
+      </w:r>
+      <w:r>
+        <w:rPr>
+          <w:rFonts w:ascii="Consolas" w:eastAsia="Times New Roman" w:hAnsi="Consolas" w:cs="Times New Roman"/>
+          <w:color w:val="569CD6"/>
+          <w:kern w:val="0"/>
+          <w:sz w:val="27"/>
+          <w:szCs w:val="27"/>
+          <w:lang w:eastAsia="en-IN"/>
+          <w14:ligatures w14:val="none"/>
+        </w:rPr>
+        <w:t>${</w:t>
+      </w:r>
+      <w:r>
+        <w:rPr>
+          <w:rFonts w:ascii="Consolas" w:eastAsia="Times New Roman" w:hAnsi="Consolas" w:cs="Times New Roman"/>
+          <w:color w:val="4FC1FF"/>
+          <w:kern w:val="0"/>
+          <w:sz w:val="27"/>
+          <w:szCs w:val="27"/>
+          <w:lang w:eastAsia="en-IN"/>
+          <w14:ligatures w14:val="none"/>
+        </w:rPr>
+        <w:t>API_URL</w:t>
+      </w:r>
+      <w:r>
+        <w:rPr>
+          <w:rFonts w:ascii="Consolas" w:eastAsia="Times New Roman" w:hAnsi="Consolas" w:cs="Times New Roman"/>
+          <w:color w:val="569CD6"/>
+          <w:kern w:val="0"/>
+          <w:sz w:val="27"/>
+          <w:szCs w:val="27"/>
+          <w:lang w:eastAsia="en-IN"/>
+          <w14:ligatures w14:val="none"/>
+        </w:rPr>
+        <w:t>}</w:t>
+      </w:r>
+      <w:r>
+        <w:rPr>
+          <w:rFonts w:ascii="Consolas" w:eastAsia="Times New Roman" w:hAnsi="Consolas" w:cs="Times New Roman"/>
+          <w:color w:val="CE9178"/>
+          <w:kern w:val="0"/>
+          <w:sz w:val="27"/>
+          <w:szCs w:val="27"/>
+          <w:lang w:eastAsia="en-IN"/>
+          <w14:ligatures w14:val="none"/>
+        </w:rPr>
+        <w:t>/secrets/</w:t>
+      </w:r>
+      <w:r>
+        <w:rPr>
+          <w:rFonts w:ascii="Consolas" w:eastAsia="Times New Roman" w:hAnsi="Consolas" w:cs="Times New Roman"/>
+          <w:color w:val="569CD6"/>
+          <w:kern w:val="0"/>
+          <w:sz w:val="27"/>
+          <w:szCs w:val="27"/>
+          <w:lang w:eastAsia="en-IN"/>
+          <w14:ligatures w14:val="none"/>
+        </w:rPr>
+        <w:t>${</w:t>
+      </w:r>
+      <w:proofErr w:type="spellStart"/>
+      <w:r>
+        <w:rPr>
+          <w:rFonts w:ascii="Consolas" w:eastAsia="Times New Roman" w:hAnsi="Consolas" w:cs="Times New Roman"/>
+          <w:color w:val="4FC1FF"/>
+          <w:kern w:val="0"/>
+          <w:sz w:val="27"/>
+          <w:szCs w:val="27"/>
+          <w:lang w:eastAsia="en-IN"/>
+          <w14:ligatures w14:val="none"/>
+        </w:rPr>
+        <w:t>searchId</w:t>
+      </w:r>
+      <w:proofErr w:type="spellEnd"/>
+      <w:r>
+        <w:rPr>
+          <w:rFonts w:ascii="Consolas" w:eastAsia="Times New Roman" w:hAnsi="Consolas" w:cs="Times New Roman"/>
+          <w:color w:val="569CD6"/>
+          <w:kern w:val="0"/>
+          <w:sz w:val="27"/>
+          <w:szCs w:val="27"/>
+          <w:lang w:eastAsia="en-IN"/>
+          <w14:ligatures w14:val="none"/>
+        </w:rPr>
+        <w:t>}</w:t>
+      </w:r>
+      <w:r>
+        <w:rPr>
+          <w:rFonts w:ascii="Consolas" w:eastAsia="Times New Roman" w:hAnsi="Consolas" w:cs="Times New Roman"/>
+          <w:color w:val="CE9178"/>
+          <w:kern w:val="0"/>
+          <w:sz w:val="27"/>
+          <w:szCs w:val="27"/>
+          <w:lang w:eastAsia="en-IN"/>
+          <w14:ligatures w14:val="none"/>
+        </w:rPr>
+        <w:t>`</w:t>
+      </w:r>
+      <w:r>
+        <w:rPr>
+          <w:rFonts w:ascii="Consolas" w:eastAsia="Times New Roman" w:hAnsi="Consolas" w:cs="Times New Roman"/>
+          <w:color w:val="CCCCCC"/>
+          <w:kern w:val="0"/>
+          <w:sz w:val="27"/>
+          <w:szCs w:val="27"/>
+          <w:lang w:eastAsia="en-IN"/>
+          <w14:ligatures w14:val="none"/>
+        </w:rPr>
+        <w:t xml:space="preserve">, </w:t>
+      </w:r>
+      <w:r>
+        <w:rPr>
+          <w:rFonts w:ascii="Consolas" w:eastAsia="Times New Roman" w:hAnsi="Consolas" w:cs="Times New Roman"/>
+          <w:color w:val="4FC1FF"/>
+          <w:kern w:val="0"/>
+          <w:sz w:val="27"/>
+          <w:szCs w:val="27"/>
+          <w:lang w:eastAsia="en-IN"/>
+          <w14:ligatures w14:val="none"/>
+        </w:rPr>
+        <w:t>config</w:t>
+      </w:r>
+      <w:r>
+        <w:rPr>
+          <w:rFonts w:ascii="Consolas" w:eastAsia="Times New Roman" w:hAnsi="Consolas" w:cs="Times New Roman"/>
+          <w:color w:val="CCCCCC"/>
+          <w:kern w:val="0"/>
+          <w:sz w:val="27"/>
+          <w:szCs w:val="27"/>
+          <w:lang w:eastAsia="en-IN"/>
+          <w14:ligatures w14:val="none"/>
+        </w:rPr>
+        <w:t>);</w:t>
+      </w:r>
+    </w:p>
+    <w:p>
+      <w:pPr>
+        <w:pStyle w:val="ListParagraph"/>
+        <w:numPr>
+          <w:ilvl w:val="1"/>
+          <w:numId w:val="7"/>
+        </w:numPr>
+        <w:rPr>
+          <w:rFonts w:ascii="Times New Roman" w:hAnsi="Times New Roman" w:cs="Times New Roman"/>
+          <w:sz w:val="28"/>
+          <w:szCs w:val="28"/>
+        </w:rPr>
+      </w:pPr>
+      <w:proofErr w:type="spellStart"/>
+      <w:r>
+        <w:rPr>
+          <w:rFonts w:ascii="Consolas" w:hAnsi="Consolas" w:cs="Times New Roman"/>
+          <w:b/>
+          <w:bCs/>
+          <w:sz w:val="28"/>
+          <w:szCs w:val="28"/>
+        </w:rPr>
+        <w:lastRenderedPageBreak/>
+        <w:t>axios.post</w:t>
+      </w:r>
+      <w:proofErr w:type="spellEnd"/>
+      <w:r>
+        <w:rPr>
+          <w:rFonts w:ascii="Consolas" w:hAnsi="Consolas" w:cs="Times New Roman"/>
+          <w:b/>
+          <w:bCs/>
+          <w:sz w:val="28"/>
+          <w:szCs w:val="28"/>
+        </w:rPr>
+        <w:t>(</w:t>
+      </w:r>
+      <w:proofErr w:type="spellStart"/>
+      <w:r>
+        <w:rPr>
+          <w:rFonts w:ascii="Consolas" w:hAnsi="Consolas" w:cs="Times New Roman"/>
+          <w:b/>
+          <w:bCs/>
+          <w:sz w:val="28"/>
+          <w:szCs w:val="28"/>
+        </w:rPr>
+        <w:t>url</w:t>
+      </w:r>
+      <w:proofErr w:type="spellEnd"/>
+      <w:r>
+        <w:rPr>
+          <w:rFonts w:ascii="Consolas" w:hAnsi="Consolas" w:cs="Times New Roman"/>
+          <w:b/>
+          <w:bCs/>
+          <w:sz w:val="28"/>
+          <w:szCs w:val="28"/>
+        </w:rPr>
+        <w:t>, data[, config])</w:t>
+      </w:r>
+      <w:r>
+        <w:rPr>
+          <w:rFonts w:ascii="Consolas" w:hAnsi="Consolas" w:cs="Times New Roman"/>
+          <w:sz w:val="28"/>
+          <w:szCs w:val="28"/>
+        </w:rPr>
+        <w:t>:</w:t>
+      </w:r>
+      <w:r>
+        <w:rPr>
+          <w:rFonts w:ascii="Times New Roman" w:hAnsi="Times New Roman" w:cs="Times New Roman"/>
+          <w:sz w:val="28"/>
+          <w:szCs w:val="28"/>
+        </w:rPr>
+        <w:t xml:space="preserve"> Sends a POST request to the specified URL with the provided data to create a new resource.</w:t>
+      </w:r>
+    </w:p>
+    <w:p>
+      <w:pPr>
+        <w:shd w:val="clear" w:color="auto" w:fill="1F1F1F"/>
+        <w:spacing w:after="0" w:line="360" w:lineRule="atLeast"/>
+        <w:rPr>
+          <w:rFonts w:ascii="Consolas" w:eastAsia="Times New Roman" w:hAnsi="Consolas" w:cs="Times New Roman"/>
+          <w:color w:val="CCCCCC"/>
+          <w:kern w:val="0"/>
+          <w:sz w:val="27"/>
+          <w:szCs w:val="27"/>
+          <w:lang w:eastAsia="en-IN"/>
+          <w14:ligatures w14:val="none"/>
+        </w:rPr>
+      </w:pPr>
+      <w:proofErr w:type="spellStart"/>
+      <w:r>
+        <w:rPr>
+          <w:rFonts w:ascii="Consolas" w:eastAsia="Times New Roman" w:hAnsi="Consolas" w:cs="Times New Roman"/>
+          <w:color w:val="569CD6"/>
+          <w:kern w:val="0"/>
+          <w:sz w:val="27"/>
+          <w:szCs w:val="27"/>
+          <w:lang w:eastAsia="en-IN"/>
+          <w14:ligatures w14:val="none"/>
+        </w:rPr>
+        <w:t>const</w:t>
+      </w:r>
+      <w:proofErr w:type="spellEnd"/>
+      <w:r>
+        <w:rPr>
+          <w:rFonts w:ascii="Consolas" w:eastAsia="Times New Roman" w:hAnsi="Consolas" w:cs="Times New Roman"/>
+          <w:color w:val="CCCCCC"/>
+          <w:kern w:val="0"/>
+          <w:sz w:val="27"/>
+          <w:szCs w:val="27"/>
+          <w:lang w:eastAsia="en-IN"/>
+          <w14:ligatures w14:val="none"/>
+        </w:rPr>
+        <w:t xml:space="preserve"> </w:t>
+      </w:r>
+      <w:r>
+        <w:rPr>
+          <w:rFonts w:ascii="Consolas" w:eastAsia="Times New Roman" w:hAnsi="Consolas" w:cs="Times New Roman"/>
+          <w:color w:val="4FC1FF"/>
+          <w:kern w:val="0"/>
+          <w:sz w:val="27"/>
+          <w:szCs w:val="27"/>
+          <w:lang w:eastAsia="en-IN"/>
+          <w14:ligatures w14:val="none"/>
+        </w:rPr>
+        <w:t>result</w:t>
+      </w:r>
+      <w:r>
+        <w:rPr>
+          <w:rFonts w:ascii="Consolas" w:eastAsia="Times New Roman" w:hAnsi="Consolas" w:cs="Times New Roman"/>
+          <w:color w:val="CCCCCC"/>
+          <w:kern w:val="0"/>
+          <w:sz w:val="27"/>
+          <w:szCs w:val="27"/>
+          <w:lang w:eastAsia="en-IN"/>
+          <w14:ligatures w14:val="none"/>
+        </w:rPr>
+        <w:t xml:space="preserve"> </w:t>
+      </w:r>
+      <w:r>
+        <w:rPr>
+          <w:rFonts w:ascii="Consolas" w:eastAsia="Times New Roman" w:hAnsi="Consolas" w:cs="Times New Roman"/>
+          <w:color w:val="D4D4D4"/>
+          <w:kern w:val="0"/>
+          <w:sz w:val="27"/>
+          <w:szCs w:val="27"/>
+          <w:lang w:eastAsia="en-IN"/>
+          <w14:ligatures w14:val="none"/>
+        </w:rPr>
+        <w:t>=</w:t>
+      </w:r>
+      <w:r>
+        <w:rPr>
+          <w:rFonts w:ascii="Consolas" w:eastAsia="Times New Roman" w:hAnsi="Consolas" w:cs="Times New Roman"/>
+          <w:color w:val="CCCCCC"/>
+          <w:kern w:val="0"/>
+          <w:sz w:val="27"/>
+          <w:szCs w:val="27"/>
+          <w:lang w:eastAsia="en-IN"/>
+          <w14:ligatures w14:val="none"/>
+        </w:rPr>
+        <w:t xml:space="preserve"> </w:t>
+      </w:r>
+      <w:r>
+        <w:rPr>
+          <w:rFonts w:ascii="Consolas" w:eastAsia="Times New Roman" w:hAnsi="Consolas" w:cs="Times New Roman"/>
+          <w:color w:val="C586C0"/>
+          <w:kern w:val="0"/>
+          <w:sz w:val="27"/>
+          <w:szCs w:val="27"/>
+          <w:lang w:eastAsia="en-IN"/>
+          <w14:ligatures w14:val="none"/>
+        </w:rPr>
+        <w:t>await</w:t>
+      </w:r>
+      <w:r>
+        <w:rPr>
+          <w:rFonts w:ascii="Consolas" w:eastAsia="Times New Roman" w:hAnsi="Consolas" w:cs="Times New Roman"/>
+          <w:color w:val="CCCCCC"/>
+          <w:kern w:val="0"/>
+          <w:sz w:val="27"/>
+          <w:szCs w:val="27"/>
+          <w:lang w:eastAsia="en-IN"/>
+          <w14:ligatures w14:val="none"/>
+        </w:rPr>
+        <w:t xml:space="preserve"> </w:t>
+      </w:r>
+      <w:proofErr w:type="spellStart"/>
+      <w:r>
+        <w:rPr>
+          <w:rFonts w:ascii="Consolas" w:eastAsia="Times New Roman" w:hAnsi="Consolas" w:cs="Times New Roman"/>
+          <w:color w:val="4FC1FF"/>
+          <w:kern w:val="0"/>
+          <w:sz w:val="27"/>
+          <w:szCs w:val="27"/>
+          <w:lang w:eastAsia="en-IN"/>
+          <w14:ligatures w14:val="none"/>
+        </w:rPr>
+        <w:t>axios</w:t>
+      </w:r>
+      <w:r>
+        <w:rPr>
+          <w:rFonts w:ascii="Consolas" w:eastAsia="Times New Roman" w:hAnsi="Consolas" w:cs="Times New Roman"/>
+          <w:color w:val="CCCCCC"/>
+          <w:kern w:val="0"/>
+          <w:sz w:val="27"/>
+          <w:szCs w:val="27"/>
+          <w:lang w:eastAsia="en-IN"/>
+          <w14:ligatures w14:val="none"/>
+        </w:rPr>
+        <w:t>.</w:t>
+      </w:r>
+      <w:r>
+        <w:rPr>
+          <w:rFonts w:ascii="Consolas" w:eastAsia="Times New Roman" w:hAnsi="Consolas" w:cs="Times New Roman"/>
+          <w:color w:val="DCDCAA"/>
+          <w:kern w:val="0"/>
+          <w:sz w:val="27"/>
+          <w:szCs w:val="27"/>
+          <w:lang w:eastAsia="en-IN"/>
+          <w14:ligatures w14:val="none"/>
+        </w:rPr>
+        <w:t>post</w:t>
+      </w:r>
+      <w:proofErr w:type="spellEnd"/>
+      <w:r>
+        <w:rPr>
+          <w:rFonts w:ascii="Consolas" w:eastAsia="Times New Roman" w:hAnsi="Consolas" w:cs="Times New Roman"/>
+          <w:color w:val="CCCCCC"/>
+          <w:kern w:val="0"/>
+          <w:sz w:val="27"/>
+          <w:szCs w:val="27"/>
+          <w:lang w:eastAsia="en-IN"/>
+          <w14:ligatures w14:val="none"/>
+        </w:rPr>
+        <w:t>(</w:t>
+      </w:r>
+      <w:r>
+        <w:rPr>
+          <w:rFonts w:ascii="Consolas" w:eastAsia="Times New Roman" w:hAnsi="Consolas" w:cs="Times New Roman"/>
+          <w:color w:val="CE9178"/>
+          <w:kern w:val="0"/>
+          <w:sz w:val="27"/>
+          <w:szCs w:val="27"/>
+          <w:lang w:eastAsia="en-IN"/>
+          <w14:ligatures w14:val="none"/>
+        </w:rPr>
+        <w:t>`</w:t>
+      </w:r>
+      <w:r>
+        <w:rPr>
+          <w:rFonts w:ascii="Consolas" w:eastAsia="Times New Roman" w:hAnsi="Consolas" w:cs="Times New Roman"/>
+          <w:color w:val="569CD6"/>
+          <w:kern w:val="0"/>
+          <w:sz w:val="27"/>
+          <w:szCs w:val="27"/>
+          <w:lang w:eastAsia="en-IN"/>
+          <w14:ligatures w14:val="none"/>
+        </w:rPr>
+        <w:t>${</w:t>
+      </w:r>
+      <w:r>
+        <w:rPr>
+          <w:rFonts w:ascii="Consolas" w:eastAsia="Times New Roman" w:hAnsi="Consolas" w:cs="Times New Roman"/>
+          <w:color w:val="4FC1FF"/>
+          <w:kern w:val="0"/>
+          <w:sz w:val="27"/>
+          <w:szCs w:val="27"/>
+          <w:lang w:eastAsia="en-IN"/>
+          <w14:ligatures w14:val="none"/>
+        </w:rPr>
+        <w:t>API_URL</w:t>
+      </w:r>
+      <w:r>
+        <w:rPr>
+          <w:rFonts w:ascii="Consolas" w:eastAsia="Times New Roman" w:hAnsi="Consolas" w:cs="Times New Roman"/>
+          <w:color w:val="569CD6"/>
+          <w:kern w:val="0"/>
+          <w:sz w:val="27"/>
+          <w:szCs w:val="27"/>
+          <w:lang w:eastAsia="en-IN"/>
+          <w14:ligatures w14:val="none"/>
+        </w:rPr>
+        <w:t>}</w:t>
+      </w:r>
+      <w:r>
+        <w:rPr>
+          <w:rFonts w:ascii="Consolas" w:eastAsia="Times New Roman" w:hAnsi="Consolas" w:cs="Times New Roman"/>
+          <w:color w:val="CE9178"/>
+          <w:kern w:val="0"/>
+          <w:sz w:val="27"/>
+          <w:szCs w:val="27"/>
+          <w:lang w:eastAsia="en-IN"/>
+          <w14:ligatures w14:val="none"/>
+        </w:rPr>
+        <w:t>/secrets`</w:t>
+      </w:r>
+      <w:r>
+        <w:rPr>
+          <w:rFonts w:ascii="Consolas" w:eastAsia="Times New Roman" w:hAnsi="Consolas" w:cs="Times New Roman"/>
+          <w:color w:val="CCCCCC"/>
+          <w:kern w:val="0"/>
+          <w:sz w:val="27"/>
+          <w:szCs w:val="27"/>
+          <w:lang w:eastAsia="en-IN"/>
+          <w14:ligatures w14:val="none"/>
+        </w:rPr>
+        <w:t xml:space="preserve">, </w:t>
+      </w:r>
+      <w:proofErr w:type="spellStart"/>
+      <w:r>
+        <w:rPr>
+          <w:rFonts w:ascii="Consolas" w:eastAsia="Times New Roman" w:hAnsi="Consolas" w:cs="Times New Roman"/>
+          <w:color w:val="9CDCFE"/>
+          <w:kern w:val="0"/>
+          <w:sz w:val="27"/>
+          <w:szCs w:val="27"/>
+          <w:lang w:eastAsia="en-IN"/>
+          <w14:ligatures w14:val="none"/>
+        </w:rPr>
+        <w:t>req</w:t>
+      </w:r>
+      <w:r>
+        <w:rPr>
+          <w:rFonts w:ascii="Consolas" w:eastAsia="Times New Roman" w:hAnsi="Consolas" w:cs="Times New Roman"/>
+          <w:color w:val="CCCCCC"/>
+          <w:kern w:val="0"/>
+          <w:sz w:val="27"/>
+          <w:szCs w:val="27"/>
+          <w:lang w:eastAsia="en-IN"/>
+          <w14:ligatures w14:val="none"/>
+        </w:rPr>
+        <w:t>.</w:t>
+      </w:r>
+      <w:r>
+        <w:rPr>
+          <w:rFonts w:ascii="Consolas" w:eastAsia="Times New Roman" w:hAnsi="Consolas" w:cs="Times New Roman"/>
+          <w:color w:val="9CDCFE"/>
+          <w:kern w:val="0"/>
+          <w:sz w:val="27"/>
+          <w:szCs w:val="27"/>
+          <w:lang w:eastAsia="en-IN"/>
+          <w14:ligatures w14:val="none"/>
+        </w:rPr>
+        <w:t>body</w:t>
+      </w:r>
+      <w:proofErr w:type="spellEnd"/>
+      <w:r>
+        <w:rPr>
+          <w:rFonts w:ascii="Consolas" w:eastAsia="Times New Roman" w:hAnsi="Consolas" w:cs="Times New Roman"/>
+          <w:color w:val="CCCCCC"/>
+          <w:kern w:val="0"/>
+          <w:sz w:val="27"/>
+          <w:szCs w:val="27"/>
+          <w:lang w:eastAsia="en-IN"/>
+          <w14:ligatures w14:val="none"/>
+        </w:rPr>
+        <w:t xml:space="preserve">, </w:t>
+      </w:r>
+      <w:r>
+        <w:rPr>
+          <w:rFonts w:ascii="Consolas" w:eastAsia="Times New Roman" w:hAnsi="Consolas" w:cs="Times New Roman"/>
+          <w:color w:val="4FC1FF"/>
+          <w:kern w:val="0"/>
+          <w:sz w:val="27"/>
+          <w:szCs w:val="27"/>
+          <w:lang w:eastAsia="en-IN"/>
+          <w14:ligatures w14:val="none"/>
+        </w:rPr>
+        <w:t>config</w:t>
+      </w:r>
+      <w:r>
+        <w:rPr>
+          <w:rFonts w:ascii="Consolas" w:eastAsia="Times New Roman" w:hAnsi="Consolas" w:cs="Times New Roman"/>
+          <w:color w:val="CCCCCC"/>
+          <w:kern w:val="0"/>
+          <w:sz w:val="27"/>
+          <w:szCs w:val="27"/>
+          <w:lang w:eastAsia="en-IN"/>
+          <w14:ligatures w14:val="none"/>
+        </w:rPr>
+        <w:t>)</w:t>
+      </w:r>
+    </w:p>
+    <w:p>
+      <w:pPr>
+        <w:pStyle w:val="ListParagraph"/>
+        <w:numPr>
+          <w:ilvl w:val="1"/>
+          <w:numId w:val="7"/>
+        </w:numPr>
+        <w:rPr>
+          <w:rFonts w:ascii="Times New Roman" w:hAnsi="Times New Roman" w:cs="Times New Roman"/>
+          <w:sz w:val="28"/>
+          <w:szCs w:val="28"/>
+        </w:rPr>
+      </w:pPr>
+      <w:proofErr w:type="spellStart"/>
+      <w:r>
+        <w:rPr>
+          <w:rFonts w:ascii="Courier New" w:hAnsi="Courier New" w:cs="Courier New"/>
+          <w:b/>
+          <w:bCs/>
+          <w:sz w:val="28"/>
+          <w:szCs w:val="28"/>
+        </w:rPr>
+        <w:t>axios.put</w:t>
+      </w:r>
+      <w:proofErr w:type="spellEnd"/>
+      <w:r>
+        <w:rPr>
+          <w:rFonts w:ascii="Courier New" w:hAnsi="Courier New" w:cs="Courier New"/>
+          <w:b/>
+          <w:bCs/>
+          <w:sz w:val="28"/>
+          <w:szCs w:val="28"/>
+        </w:rPr>
+        <w:t>(</w:t>
+      </w:r>
+      <w:proofErr w:type="spellStart"/>
+      <w:r>
+        <w:rPr>
+          <w:rFonts w:ascii="Courier New" w:hAnsi="Courier New" w:cs="Courier New"/>
+          <w:b/>
+          <w:bCs/>
+          <w:sz w:val="28"/>
+          <w:szCs w:val="28"/>
+        </w:rPr>
+        <w:t>url</w:t>
+      </w:r>
+      <w:proofErr w:type="spellEnd"/>
+      <w:r>
+        <w:rPr>
+          <w:rFonts w:ascii="Courier New" w:hAnsi="Courier New" w:cs="Courier New"/>
+          <w:b/>
+          <w:bCs/>
+          <w:sz w:val="28"/>
+          <w:szCs w:val="28"/>
+        </w:rPr>
+        <w:t>, data[, config])</w:t>
+      </w:r>
+      <w:r>
+        <w:rPr>
+          <w:rFonts w:ascii="Courier New" w:hAnsi="Courier New" w:cs="Courier New"/>
+          <w:sz w:val="28"/>
+          <w:szCs w:val="28"/>
+        </w:rPr>
+        <w:t>:</w:t>
+      </w:r>
+      <w:r>
+        <w:rPr>
+          <w:rFonts w:ascii="Times New Roman" w:hAnsi="Times New Roman" w:cs="Times New Roman"/>
+          <w:sz w:val="28"/>
+          <w:szCs w:val="28"/>
+        </w:rPr>
+        <w:t xml:space="preserve"> Sends a PUT request to the specified URL with the provided data to completely update an existing resource</w:t>
+      </w:r>
+      <w:r>
+        <w:rPr>
+          <w:rFonts w:ascii="Times New Roman" w:hAnsi="Times New Roman" w:cs="Times New Roman"/>
+          <w:sz w:val="28"/>
+          <w:szCs w:val="28"/>
+        </w:rPr>
+        <w:t>.</w:t>
+      </w:r>
+    </w:p>
+    <w:p>
+      <w:pPr>
+        <w:shd w:val="clear" w:color="auto" w:fill="1F1F1F"/>
+        <w:spacing w:after="0" w:line="360" w:lineRule="atLeast"/>
+        <w:rPr>
+          <w:rFonts w:ascii="Consolas" w:eastAsia="Times New Roman" w:hAnsi="Consolas" w:cs="Times New Roman"/>
+          <w:color w:val="CCCCCC"/>
+          <w:kern w:val="0"/>
+          <w:sz w:val="27"/>
+          <w:szCs w:val="27"/>
+          <w:lang w:eastAsia="en-IN"/>
+          <w14:ligatures w14:val="none"/>
+        </w:rPr>
+      </w:pPr>
+      <w:proofErr w:type="spellStart"/>
+      <w:r>
+        <w:rPr>
+          <w:rFonts w:ascii="Consolas" w:eastAsia="Times New Roman" w:hAnsi="Consolas" w:cs="Times New Roman"/>
+          <w:color w:val="569CD6"/>
+          <w:kern w:val="0"/>
+          <w:sz w:val="27"/>
+          <w:szCs w:val="27"/>
+          <w:lang w:eastAsia="en-IN"/>
+          <w14:ligatures w14:val="none"/>
+        </w:rPr>
+        <w:t>const</w:t>
+      </w:r>
+      <w:proofErr w:type="spellEnd"/>
+      <w:r>
+        <w:rPr>
+          <w:rFonts w:ascii="Consolas" w:eastAsia="Times New Roman" w:hAnsi="Consolas" w:cs="Times New Roman"/>
+          <w:color w:val="CCCCCC"/>
+          <w:kern w:val="0"/>
+          <w:sz w:val="27"/>
+          <w:szCs w:val="27"/>
+          <w:lang w:eastAsia="en-IN"/>
+          <w14:ligatures w14:val="none"/>
+        </w:rPr>
+        <w:t xml:space="preserve"> </w:t>
+      </w:r>
+      <w:r>
+        <w:rPr>
+          <w:rFonts w:ascii="Consolas" w:eastAsia="Times New Roman" w:hAnsi="Consolas" w:cs="Times New Roman"/>
+          <w:color w:val="4FC1FF"/>
+          <w:kern w:val="0"/>
+          <w:sz w:val="27"/>
+          <w:szCs w:val="27"/>
+          <w:lang w:eastAsia="en-IN"/>
+          <w14:ligatures w14:val="none"/>
+        </w:rPr>
+        <w:t>result</w:t>
+      </w:r>
+      <w:r>
+        <w:rPr>
+          <w:rFonts w:ascii="Consolas" w:eastAsia="Times New Roman" w:hAnsi="Consolas" w:cs="Times New Roman"/>
+          <w:color w:val="CCCCCC"/>
+          <w:kern w:val="0"/>
+          <w:sz w:val="27"/>
+          <w:szCs w:val="27"/>
+          <w:lang w:eastAsia="en-IN"/>
+          <w14:ligatures w14:val="none"/>
+        </w:rPr>
+        <w:t xml:space="preserve"> </w:t>
+      </w:r>
+      <w:r>
+        <w:rPr>
+          <w:rFonts w:ascii="Consolas" w:eastAsia="Times New Roman" w:hAnsi="Consolas" w:cs="Times New Roman"/>
+          <w:color w:val="D4D4D4"/>
+          <w:kern w:val="0"/>
+          <w:sz w:val="27"/>
+          <w:szCs w:val="27"/>
+          <w:lang w:eastAsia="en-IN"/>
+          <w14:ligatures w14:val="none"/>
+        </w:rPr>
+        <w:t>=</w:t>
+      </w:r>
+      <w:r>
+        <w:rPr>
+          <w:rFonts w:ascii="Consolas" w:eastAsia="Times New Roman" w:hAnsi="Consolas" w:cs="Times New Roman"/>
+          <w:color w:val="CCCCCC"/>
+          <w:kern w:val="0"/>
+          <w:sz w:val="27"/>
+          <w:szCs w:val="27"/>
+          <w:lang w:eastAsia="en-IN"/>
+          <w14:ligatures w14:val="none"/>
+        </w:rPr>
+        <w:t xml:space="preserve"> </w:t>
+      </w:r>
+      <w:r>
+        <w:rPr>
+          <w:rFonts w:ascii="Consolas" w:eastAsia="Times New Roman" w:hAnsi="Consolas" w:cs="Times New Roman"/>
+          <w:color w:val="C586C0"/>
+          <w:kern w:val="0"/>
+          <w:sz w:val="27"/>
+          <w:szCs w:val="27"/>
+          <w:lang w:eastAsia="en-IN"/>
+          <w14:ligatures w14:val="none"/>
+        </w:rPr>
+        <w:t>await</w:t>
+      </w:r>
+      <w:r>
+        <w:rPr>
+          <w:rFonts w:ascii="Consolas" w:eastAsia="Times New Roman" w:hAnsi="Consolas" w:cs="Times New Roman"/>
+          <w:color w:val="CCCCCC"/>
+          <w:kern w:val="0"/>
+          <w:sz w:val="27"/>
+          <w:szCs w:val="27"/>
+          <w:lang w:eastAsia="en-IN"/>
+          <w14:ligatures w14:val="none"/>
+        </w:rPr>
+        <w:t xml:space="preserve"> </w:t>
+      </w:r>
+      <w:proofErr w:type="spellStart"/>
+      <w:r>
+        <w:rPr>
+          <w:rFonts w:ascii="Consolas" w:eastAsia="Times New Roman" w:hAnsi="Consolas" w:cs="Times New Roman"/>
+          <w:color w:val="4FC1FF"/>
+          <w:kern w:val="0"/>
+          <w:sz w:val="27"/>
+          <w:szCs w:val="27"/>
+          <w:lang w:eastAsia="en-IN"/>
+          <w14:ligatures w14:val="none"/>
+        </w:rPr>
+        <w:t>axios</w:t>
+      </w:r>
+      <w:r>
+        <w:rPr>
+          <w:rFonts w:ascii="Consolas" w:eastAsia="Times New Roman" w:hAnsi="Consolas" w:cs="Times New Roman"/>
+          <w:color w:val="CCCCCC"/>
+          <w:kern w:val="0"/>
+          <w:sz w:val="27"/>
+          <w:szCs w:val="27"/>
+          <w:lang w:eastAsia="en-IN"/>
+          <w14:ligatures w14:val="none"/>
+        </w:rPr>
+        <w:t>.</w:t>
+      </w:r>
+      <w:r>
+        <w:rPr>
+          <w:rFonts w:ascii="Consolas" w:eastAsia="Times New Roman" w:hAnsi="Consolas" w:cs="Times New Roman"/>
+          <w:color w:val="DCDCAA"/>
+          <w:kern w:val="0"/>
+          <w:sz w:val="27"/>
+          <w:szCs w:val="27"/>
+          <w:lang w:eastAsia="en-IN"/>
+          <w14:ligatures w14:val="none"/>
+        </w:rPr>
+        <w:t>put</w:t>
+      </w:r>
+      <w:proofErr w:type="spellEnd"/>
+      <w:r>
+        <w:rPr>
+          <w:rFonts w:ascii="Consolas" w:eastAsia="Times New Roman" w:hAnsi="Consolas" w:cs="Times New Roman"/>
+          <w:color w:val="CCCCCC"/>
+          <w:kern w:val="0"/>
+          <w:sz w:val="27"/>
+          <w:szCs w:val="27"/>
+          <w:lang w:eastAsia="en-IN"/>
+          <w14:ligatures w14:val="none"/>
+        </w:rPr>
+        <w:t>(</w:t>
+      </w:r>
+      <w:r>
+        <w:rPr>
+          <w:rFonts w:ascii="Consolas" w:eastAsia="Times New Roman" w:hAnsi="Consolas" w:cs="Times New Roman"/>
+          <w:color w:val="CE9178"/>
+          <w:kern w:val="0"/>
+          <w:sz w:val="27"/>
+          <w:szCs w:val="27"/>
+          <w:lang w:eastAsia="en-IN"/>
+          <w14:ligatures w14:val="none"/>
+        </w:rPr>
+        <w:t>`</w:t>
+      </w:r>
+      <w:r>
+        <w:rPr>
+          <w:rFonts w:ascii="Consolas" w:eastAsia="Times New Roman" w:hAnsi="Consolas" w:cs="Times New Roman"/>
+          <w:color w:val="569CD6"/>
+          <w:kern w:val="0"/>
+          <w:sz w:val="27"/>
+          <w:szCs w:val="27"/>
+          <w:lang w:eastAsia="en-IN"/>
+          <w14:ligatures w14:val="none"/>
+        </w:rPr>
+        <w:t>${</w:t>
+      </w:r>
+      <w:r>
+        <w:rPr>
+          <w:rFonts w:ascii="Consolas" w:eastAsia="Times New Roman" w:hAnsi="Consolas" w:cs="Times New Roman"/>
+          <w:color w:val="4FC1FF"/>
+          <w:kern w:val="0"/>
+          <w:sz w:val="27"/>
+          <w:szCs w:val="27"/>
+          <w:lang w:eastAsia="en-IN"/>
+          <w14:ligatures w14:val="none"/>
+        </w:rPr>
+        <w:t>API_URL</w:t>
+      </w:r>
+      <w:r>
+        <w:rPr>
+          <w:rFonts w:ascii="Consolas" w:eastAsia="Times New Roman" w:hAnsi="Consolas" w:cs="Times New Roman"/>
+          <w:color w:val="569CD6"/>
+          <w:kern w:val="0"/>
+          <w:sz w:val="27"/>
+          <w:szCs w:val="27"/>
+          <w:lang w:eastAsia="en-IN"/>
+          <w14:ligatures w14:val="none"/>
+        </w:rPr>
+        <w:t>}</w:t>
+      </w:r>
+      <w:r>
+        <w:rPr>
+          <w:rFonts w:ascii="Consolas" w:eastAsia="Times New Roman" w:hAnsi="Consolas" w:cs="Times New Roman"/>
+          <w:color w:val="CE9178"/>
+          <w:kern w:val="0"/>
+          <w:sz w:val="27"/>
+          <w:szCs w:val="27"/>
+          <w:lang w:eastAsia="en-IN"/>
+          <w14:ligatures w14:val="none"/>
+        </w:rPr>
+        <w:t>/secrets/</w:t>
+      </w:r>
+      <w:r>
+        <w:rPr>
+          <w:rFonts w:ascii="Consolas" w:eastAsia="Times New Roman" w:hAnsi="Consolas" w:cs="Times New Roman"/>
+          <w:color w:val="569CD6"/>
+          <w:kern w:val="0"/>
+          <w:sz w:val="27"/>
+          <w:szCs w:val="27"/>
+          <w:lang w:eastAsia="en-IN"/>
+          <w14:ligatures w14:val="none"/>
+        </w:rPr>
+        <w:t>${</w:t>
+      </w:r>
+      <w:proofErr w:type="spellStart"/>
+      <w:r>
+        <w:rPr>
+          <w:rFonts w:ascii="Consolas" w:eastAsia="Times New Roman" w:hAnsi="Consolas" w:cs="Times New Roman"/>
+          <w:color w:val="4FC1FF"/>
+          <w:kern w:val="0"/>
+          <w:sz w:val="27"/>
+          <w:szCs w:val="27"/>
+          <w:lang w:eastAsia="en-IN"/>
+          <w14:ligatures w14:val="none"/>
+        </w:rPr>
+        <w:t>searchId</w:t>
+      </w:r>
+      <w:proofErr w:type="spellEnd"/>
+      <w:r>
+        <w:rPr>
+          <w:rFonts w:ascii="Consolas" w:eastAsia="Times New Roman" w:hAnsi="Consolas" w:cs="Times New Roman"/>
+          <w:color w:val="569CD6"/>
+          <w:kern w:val="0"/>
+          <w:sz w:val="27"/>
+          <w:szCs w:val="27"/>
+          <w:lang w:eastAsia="en-IN"/>
+          <w14:ligatures w14:val="none"/>
+        </w:rPr>
+        <w:t>}</w:t>
+      </w:r>
+      <w:r>
+        <w:rPr>
+          <w:rFonts w:ascii="Consolas" w:eastAsia="Times New Roman" w:hAnsi="Consolas" w:cs="Times New Roman"/>
+          <w:color w:val="CE9178"/>
+          <w:kern w:val="0"/>
+          <w:sz w:val="27"/>
+          <w:szCs w:val="27"/>
+          <w:lang w:eastAsia="en-IN"/>
+          <w14:ligatures w14:val="none"/>
+        </w:rPr>
+        <w:t>`</w:t>
+      </w:r>
+      <w:r>
+        <w:rPr>
+          <w:rFonts w:ascii="Consolas" w:eastAsia="Times New Roman" w:hAnsi="Consolas" w:cs="Times New Roman"/>
+          <w:color w:val="CCCCCC"/>
+          <w:kern w:val="0"/>
+          <w:sz w:val="27"/>
+          <w:szCs w:val="27"/>
+          <w:lang w:eastAsia="en-IN"/>
+          <w14:ligatures w14:val="none"/>
+        </w:rPr>
+        <w:t xml:space="preserve">, </w:t>
+      </w:r>
+      <w:proofErr w:type="spellStart"/>
+      <w:r>
+        <w:rPr>
+          <w:rFonts w:ascii="Consolas" w:eastAsia="Times New Roman" w:hAnsi="Consolas" w:cs="Times New Roman"/>
+          <w:color w:val="9CDCFE"/>
+          <w:kern w:val="0"/>
+          <w:sz w:val="27"/>
+          <w:szCs w:val="27"/>
+          <w:lang w:eastAsia="en-IN"/>
+          <w14:ligatures w14:val="none"/>
+        </w:rPr>
+        <w:t>req</w:t>
+      </w:r>
+      <w:r>
+        <w:rPr>
+          <w:rFonts w:ascii="Consolas" w:eastAsia="Times New Roman" w:hAnsi="Consolas" w:cs="Times New Roman"/>
+          <w:color w:val="CCCCCC"/>
+          <w:kern w:val="0"/>
+          <w:sz w:val="27"/>
+          <w:szCs w:val="27"/>
+          <w:lang w:eastAsia="en-IN"/>
+          <w14:ligatures w14:val="none"/>
+        </w:rPr>
+        <w:t>.</w:t>
+      </w:r>
+      <w:r>
+        <w:rPr>
+          <w:rFonts w:ascii="Consolas" w:eastAsia="Times New Roman" w:hAnsi="Consolas" w:cs="Times New Roman"/>
+          <w:color w:val="9CDCFE"/>
+          <w:kern w:val="0"/>
+          <w:sz w:val="27"/>
+          <w:szCs w:val="27"/>
+          <w:lang w:eastAsia="en-IN"/>
+          <w14:ligatures w14:val="none"/>
+        </w:rPr>
+        <w:t>body</w:t>
+      </w:r>
+      <w:proofErr w:type="spellEnd"/>
+      <w:r>
+        <w:rPr>
+          <w:rFonts w:ascii="Consolas" w:eastAsia="Times New Roman" w:hAnsi="Consolas" w:cs="Times New Roman"/>
+          <w:color w:val="CCCCCC"/>
+          <w:kern w:val="0"/>
+          <w:sz w:val="27"/>
+          <w:szCs w:val="27"/>
+          <w:lang w:eastAsia="en-IN"/>
+          <w14:ligatures w14:val="none"/>
+        </w:rPr>
+        <w:t xml:space="preserve">, </w:t>
+      </w:r>
+      <w:r>
+        <w:rPr>
+          <w:rFonts w:ascii="Consolas" w:eastAsia="Times New Roman" w:hAnsi="Consolas" w:cs="Times New Roman"/>
+          <w:color w:val="4FC1FF"/>
+          <w:kern w:val="0"/>
+          <w:sz w:val="27"/>
+          <w:szCs w:val="27"/>
+          <w:lang w:eastAsia="en-IN"/>
+          <w14:ligatures w14:val="none"/>
+        </w:rPr>
+        <w:t>config</w:t>
+      </w:r>
+      <w:r>
+        <w:rPr>
+          <w:rFonts w:ascii="Consolas" w:eastAsia="Times New Roman" w:hAnsi="Consolas" w:cs="Times New Roman"/>
+          <w:color w:val="CCCCCC"/>
+          <w:kern w:val="0"/>
+          <w:sz w:val="27"/>
+          <w:szCs w:val="27"/>
+          <w:lang w:eastAsia="en-IN"/>
+          <w14:ligatures w14:val="none"/>
+        </w:rPr>
+        <w:t>)</w:t>
+      </w:r>
+    </w:p>
+    <w:p>
+      <w:pPr>
+        <w:pStyle w:val="ListParagraph"/>
+        <w:numPr>
+          <w:ilvl w:val="1"/>
+          <w:numId w:val="7"/>
+        </w:numPr>
+        <w:rPr>
+          <w:rFonts w:ascii="Times New Roman" w:hAnsi="Times New Roman" w:cs="Times New Roman"/>
+          <w:sz w:val="28"/>
+          <w:szCs w:val="28"/>
+        </w:rPr>
+      </w:pPr>
+      <w:proofErr w:type="spellStart"/>
+      <w:r>
+        <w:rPr>
+          <w:rFonts w:ascii="Consolas" w:hAnsi="Consolas" w:cs="Times New Roman"/>
+          <w:b/>
+          <w:bCs/>
+          <w:sz w:val="28"/>
+          <w:szCs w:val="28"/>
+        </w:rPr>
+        <w:t>axios.patch</w:t>
+      </w:r>
+      <w:proofErr w:type="spellEnd"/>
+      <w:r>
+        <w:rPr>
+          <w:rFonts w:ascii="Consolas" w:hAnsi="Consolas" w:cs="Times New Roman"/>
+          <w:b/>
+          <w:bCs/>
+          <w:sz w:val="28"/>
+          <w:szCs w:val="28"/>
+        </w:rPr>
+        <w:t>(</w:t>
+      </w:r>
+      <w:proofErr w:type="spellStart"/>
+      <w:r>
+        <w:rPr>
+          <w:rFonts w:ascii="Consolas" w:hAnsi="Consolas" w:cs="Times New Roman"/>
+          <w:b/>
+          <w:bCs/>
+          <w:sz w:val="28"/>
+          <w:szCs w:val="28"/>
+        </w:rPr>
+        <w:t>url</w:t>
+      </w:r>
+      <w:proofErr w:type="spellEnd"/>
+      <w:r>
+        <w:rPr>
+          <w:rFonts w:ascii="Consolas" w:hAnsi="Consolas" w:cs="Times New Roman"/>
+          <w:b/>
+          <w:bCs/>
+          <w:sz w:val="28"/>
+          <w:szCs w:val="28"/>
+        </w:rPr>
+        <w:t>, data[, config])</w:t>
+      </w:r>
+      <w:r>
+        <w:rPr>
+          <w:rFonts w:ascii="Consolas" w:hAnsi="Consolas" w:cs="Times New Roman"/>
+          <w:sz w:val="28"/>
+          <w:szCs w:val="28"/>
+        </w:rPr>
+        <w:t xml:space="preserve">: </w:t>
+      </w:r>
+      <w:r>
+        <w:rPr>
+          <w:rFonts w:ascii="Times New Roman" w:hAnsi="Times New Roman" w:cs="Times New Roman"/>
+          <w:sz w:val="28"/>
+          <w:szCs w:val="28"/>
+        </w:rPr>
+        <w:t>Sends a PATCH request to the specified URL with the provided data to partially update an existing resource</w:t>
+      </w:r>
+      <w:r>
+        <w:rPr>
+          <w:rFonts w:ascii="Times New Roman" w:hAnsi="Times New Roman" w:cs="Times New Roman"/>
+          <w:sz w:val="28"/>
+          <w:szCs w:val="28"/>
+        </w:rPr>
+        <w:t>.</w:t>
+      </w:r>
+    </w:p>
+    <w:p>
+      <w:pPr>
+        <w:shd w:val="clear" w:color="auto" w:fill="1F1F1F"/>
+        <w:spacing w:after="0" w:line="360" w:lineRule="atLeast"/>
+        <w:rPr>
+          <w:rFonts w:ascii="Consolas" w:eastAsia="Times New Roman" w:hAnsi="Consolas" w:cs="Times New Roman"/>
+          <w:color w:val="CCCCCC"/>
+          <w:kern w:val="0"/>
+          <w:sz w:val="27"/>
+          <w:szCs w:val="27"/>
+          <w:lang w:eastAsia="en-IN"/>
+          <w14:ligatures w14:val="none"/>
+        </w:rPr>
+      </w:pPr>
+      <w:proofErr w:type="spellStart"/>
+      <w:r>
+        <w:rPr>
+          <w:rFonts w:ascii="Consolas" w:eastAsia="Times New Roman" w:hAnsi="Consolas" w:cs="Times New Roman"/>
+          <w:color w:val="569CD6"/>
+          <w:kern w:val="0"/>
+          <w:sz w:val="27"/>
+          <w:szCs w:val="27"/>
+          <w:lang w:eastAsia="en-IN"/>
+          <w14:ligatures w14:val="none"/>
+        </w:rPr>
+        <w:t>const</w:t>
+      </w:r>
+      <w:proofErr w:type="spellEnd"/>
+      <w:r>
+        <w:rPr>
+          <w:rFonts w:ascii="Consolas" w:eastAsia="Times New Roman" w:hAnsi="Consolas" w:cs="Times New Roman"/>
+          <w:color w:val="CCCCCC"/>
+          <w:kern w:val="0"/>
+          <w:sz w:val="27"/>
+          <w:szCs w:val="27"/>
+          <w:lang w:eastAsia="en-IN"/>
+          <w14:ligatures w14:val="none"/>
+        </w:rPr>
+        <w:t xml:space="preserve"> </w:t>
+      </w:r>
+      <w:r>
+        <w:rPr>
+          <w:rFonts w:ascii="Consolas" w:eastAsia="Times New Roman" w:hAnsi="Consolas" w:cs="Times New Roman"/>
+          <w:color w:val="4FC1FF"/>
+          <w:kern w:val="0"/>
+          <w:sz w:val="27"/>
+          <w:szCs w:val="27"/>
+          <w:lang w:eastAsia="en-IN"/>
+          <w14:ligatures w14:val="none"/>
+        </w:rPr>
+        <w:t>result</w:t>
+      </w:r>
+      <w:r>
+        <w:rPr>
+          <w:rFonts w:ascii="Consolas" w:eastAsia="Times New Roman" w:hAnsi="Consolas" w:cs="Times New Roman"/>
+          <w:color w:val="CCCCCC"/>
+          <w:kern w:val="0"/>
+          <w:sz w:val="27"/>
+          <w:szCs w:val="27"/>
+          <w:lang w:eastAsia="en-IN"/>
+          <w14:ligatures w14:val="none"/>
+        </w:rPr>
+        <w:t xml:space="preserve"> </w:t>
+      </w:r>
+      <w:r>
+        <w:rPr>
+          <w:rFonts w:ascii="Consolas" w:eastAsia="Times New Roman" w:hAnsi="Consolas" w:cs="Times New Roman"/>
+          <w:color w:val="D4D4D4"/>
+          <w:kern w:val="0"/>
+          <w:sz w:val="27"/>
+          <w:szCs w:val="27"/>
+          <w:lang w:eastAsia="en-IN"/>
+          <w14:ligatures w14:val="none"/>
+        </w:rPr>
+        <w:t>=</w:t>
+      </w:r>
+      <w:r>
+        <w:rPr>
+          <w:rFonts w:ascii="Consolas" w:eastAsia="Times New Roman" w:hAnsi="Consolas" w:cs="Times New Roman"/>
+          <w:color w:val="CCCCCC"/>
+          <w:kern w:val="0"/>
+          <w:sz w:val="27"/>
+          <w:szCs w:val="27"/>
+          <w:lang w:eastAsia="en-IN"/>
+          <w14:ligatures w14:val="none"/>
+        </w:rPr>
+        <w:t xml:space="preserve"> </w:t>
+      </w:r>
+      <w:r>
+        <w:rPr>
+          <w:rFonts w:ascii="Consolas" w:eastAsia="Times New Roman" w:hAnsi="Consolas" w:cs="Times New Roman"/>
+          <w:color w:val="C586C0"/>
+          <w:kern w:val="0"/>
+          <w:sz w:val="27"/>
+          <w:szCs w:val="27"/>
+          <w:lang w:eastAsia="en-IN"/>
+          <w14:ligatures w14:val="none"/>
+        </w:rPr>
+        <w:t>await</w:t>
+      </w:r>
+      <w:r>
+        <w:rPr>
+          <w:rFonts w:ascii="Consolas" w:eastAsia="Times New Roman" w:hAnsi="Consolas" w:cs="Times New Roman"/>
+          <w:color w:val="CCCCCC"/>
+          <w:kern w:val="0"/>
+          <w:sz w:val="27"/>
+          <w:szCs w:val="27"/>
+          <w:lang w:eastAsia="en-IN"/>
+          <w14:ligatures w14:val="none"/>
+        </w:rPr>
+        <w:t xml:space="preserve"> </w:t>
+      </w:r>
+      <w:proofErr w:type="spellStart"/>
+      <w:r>
+        <w:rPr>
+          <w:rFonts w:ascii="Consolas" w:eastAsia="Times New Roman" w:hAnsi="Consolas" w:cs="Times New Roman"/>
+          <w:color w:val="4FC1FF"/>
+          <w:kern w:val="0"/>
+          <w:sz w:val="27"/>
+          <w:szCs w:val="27"/>
+          <w:lang w:eastAsia="en-IN"/>
+          <w14:ligatures w14:val="none"/>
+        </w:rPr>
+        <w:t>axios</w:t>
+      </w:r>
+      <w:r>
+        <w:rPr>
+          <w:rFonts w:ascii="Consolas" w:eastAsia="Times New Roman" w:hAnsi="Consolas" w:cs="Times New Roman"/>
+          <w:color w:val="CCCCCC"/>
+          <w:kern w:val="0"/>
+          <w:sz w:val="27"/>
+          <w:szCs w:val="27"/>
+          <w:lang w:eastAsia="en-IN"/>
+          <w14:ligatures w14:val="none"/>
+        </w:rPr>
+        <w:t>.</w:t>
+      </w:r>
+      <w:r>
+        <w:rPr>
+          <w:rFonts w:ascii="Consolas" w:eastAsia="Times New Roman" w:hAnsi="Consolas" w:cs="Times New Roman"/>
+          <w:color w:val="DCDCAA"/>
+          <w:kern w:val="0"/>
+          <w:sz w:val="27"/>
+          <w:szCs w:val="27"/>
+          <w:lang w:eastAsia="en-IN"/>
+          <w14:ligatures w14:val="none"/>
+        </w:rPr>
+        <w:t>patch</w:t>
+      </w:r>
+      <w:proofErr w:type="spellEnd"/>
+      <w:r>
+        <w:rPr>
+          <w:rFonts w:ascii="Consolas" w:eastAsia="Times New Roman" w:hAnsi="Consolas" w:cs="Times New Roman"/>
+          <w:color w:val="CCCCCC"/>
+          <w:kern w:val="0"/>
+          <w:sz w:val="27"/>
+          <w:szCs w:val="27"/>
+          <w:lang w:eastAsia="en-IN"/>
+          <w14:ligatures w14:val="none"/>
+        </w:rPr>
+        <w:t>(</w:t>
+      </w:r>
+      <w:r>
+        <w:rPr>
+          <w:rFonts w:ascii="Consolas" w:eastAsia="Times New Roman" w:hAnsi="Consolas" w:cs="Times New Roman"/>
+          <w:color w:val="CE9178"/>
+          <w:kern w:val="0"/>
+          <w:sz w:val="27"/>
+          <w:szCs w:val="27"/>
+          <w:lang w:eastAsia="en-IN"/>
+          <w14:ligatures w14:val="none"/>
+        </w:rPr>
+        <w:t>`</w:t>
+      </w:r>
+      <w:r>
+        <w:rPr>
+          <w:rFonts w:ascii="Consolas" w:eastAsia="Times New Roman" w:hAnsi="Consolas" w:cs="Times New Roman"/>
+          <w:color w:val="569CD6"/>
+          <w:kern w:val="0"/>
+          <w:sz w:val="27"/>
+          <w:szCs w:val="27"/>
+          <w:lang w:eastAsia="en-IN"/>
+          <w14:ligatures w14:val="none"/>
+        </w:rPr>
+        <w:t>${</w:t>
+      </w:r>
+      <w:r>
+        <w:rPr>
+          <w:rFonts w:ascii="Consolas" w:eastAsia="Times New Roman" w:hAnsi="Consolas" w:cs="Times New Roman"/>
+          <w:color w:val="4FC1FF"/>
+          <w:kern w:val="0"/>
+          <w:sz w:val="27"/>
+          <w:szCs w:val="27"/>
+          <w:lang w:eastAsia="en-IN"/>
+          <w14:ligatures w14:val="none"/>
+        </w:rPr>
+        <w:t>API_URL</w:t>
+      </w:r>
+      <w:r>
+        <w:rPr>
+          <w:rFonts w:ascii="Consolas" w:eastAsia="Times New Roman" w:hAnsi="Consolas" w:cs="Times New Roman"/>
+          <w:color w:val="569CD6"/>
+          <w:kern w:val="0"/>
+          <w:sz w:val="27"/>
+          <w:szCs w:val="27"/>
+          <w:lang w:eastAsia="en-IN"/>
+          <w14:ligatures w14:val="none"/>
+        </w:rPr>
+        <w:t>}</w:t>
+      </w:r>
+      <w:r>
+        <w:rPr>
+          <w:rFonts w:ascii="Consolas" w:eastAsia="Times New Roman" w:hAnsi="Consolas" w:cs="Times New Roman"/>
+          <w:color w:val="CE9178"/>
+          <w:kern w:val="0"/>
+          <w:sz w:val="27"/>
+          <w:szCs w:val="27"/>
+          <w:lang w:eastAsia="en-IN"/>
+          <w14:ligatures w14:val="none"/>
+        </w:rPr>
+        <w:t>/secrets/</w:t>
+      </w:r>
+      <w:r>
+        <w:rPr>
+          <w:rFonts w:ascii="Consolas" w:eastAsia="Times New Roman" w:hAnsi="Consolas" w:cs="Times New Roman"/>
+          <w:color w:val="569CD6"/>
+          <w:kern w:val="0"/>
+          <w:sz w:val="27"/>
+          <w:szCs w:val="27"/>
+          <w:lang w:eastAsia="en-IN"/>
+          <w14:ligatures w14:val="none"/>
+        </w:rPr>
+        <w:t>${</w:t>
+      </w:r>
+      <w:proofErr w:type="spellStart"/>
+      <w:r>
+        <w:rPr>
+          <w:rFonts w:ascii="Consolas" w:eastAsia="Times New Roman" w:hAnsi="Consolas" w:cs="Times New Roman"/>
+          <w:color w:val="4FC1FF"/>
+          <w:kern w:val="0"/>
+          <w:sz w:val="27"/>
+          <w:szCs w:val="27"/>
+          <w:lang w:eastAsia="en-IN"/>
+          <w14:ligatures w14:val="none"/>
+        </w:rPr>
+        <w:t>searchId</w:t>
+      </w:r>
+      <w:proofErr w:type="spellEnd"/>
+      <w:r>
+        <w:rPr>
+          <w:rFonts w:ascii="Consolas" w:eastAsia="Times New Roman" w:hAnsi="Consolas" w:cs="Times New Roman"/>
+          <w:color w:val="569CD6"/>
+          <w:kern w:val="0"/>
+          <w:sz w:val="27"/>
+          <w:szCs w:val="27"/>
+          <w:lang w:eastAsia="en-IN"/>
+          <w14:ligatures w14:val="none"/>
+        </w:rPr>
+        <w:t>}</w:t>
+      </w:r>
+      <w:r>
+        <w:rPr>
+          <w:rFonts w:ascii="Consolas" w:eastAsia="Times New Roman" w:hAnsi="Consolas" w:cs="Times New Roman"/>
+          <w:color w:val="CE9178"/>
+          <w:kern w:val="0"/>
+          <w:sz w:val="27"/>
+          <w:szCs w:val="27"/>
+          <w:lang w:eastAsia="en-IN"/>
+          <w14:ligatures w14:val="none"/>
+        </w:rPr>
+        <w:t>`</w:t>
+      </w:r>
+      <w:r>
+        <w:rPr>
+          <w:rFonts w:ascii="Consolas" w:eastAsia="Times New Roman" w:hAnsi="Consolas" w:cs="Times New Roman"/>
+          <w:color w:val="CCCCCC"/>
+          <w:kern w:val="0"/>
+          <w:sz w:val="27"/>
+          <w:szCs w:val="27"/>
+          <w:lang w:eastAsia="en-IN"/>
+          <w14:ligatures w14:val="none"/>
+        </w:rPr>
+        <w:t xml:space="preserve">, </w:t>
+      </w:r>
+      <w:proofErr w:type="spellStart"/>
+      <w:r>
+        <w:rPr>
+          <w:rFonts w:ascii="Consolas" w:eastAsia="Times New Roman" w:hAnsi="Consolas" w:cs="Times New Roman"/>
+          <w:color w:val="9CDCFE"/>
+          <w:kern w:val="0"/>
+          <w:sz w:val="27"/>
+          <w:szCs w:val="27"/>
+          <w:lang w:eastAsia="en-IN"/>
+          <w14:ligatures w14:val="none"/>
+        </w:rPr>
+        <w:t>req</w:t>
+      </w:r>
+      <w:r>
+        <w:rPr>
+          <w:rFonts w:ascii="Consolas" w:eastAsia="Times New Roman" w:hAnsi="Consolas" w:cs="Times New Roman"/>
+          <w:color w:val="CCCCCC"/>
+          <w:kern w:val="0"/>
+          <w:sz w:val="27"/>
+          <w:szCs w:val="27"/>
+          <w:lang w:eastAsia="en-IN"/>
+          <w14:ligatures w14:val="none"/>
+        </w:rPr>
+        <w:t>.</w:t>
+      </w:r>
+      <w:r>
+        <w:rPr>
+          <w:rFonts w:ascii="Consolas" w:eastAsia="Times New Roman" w:hAnsi="Consolas" w:cs="Times New Roman"/>
+          <w:color w:val="9CDCFE"/>
+          <w:kern w:val="0"/>
+          <w:sz w:val="27"/>
+          <w:szCs w:val="27"/>
+          <w:lang w:eastAsia="en-IN"/>
+          <w14:ligatures w14:val="none"/>
+        </w:rPr>
+        <w:t>body</w:t>
+      </w:r>
+      <w:proofErr w:type="spellEnd"/>
+      <w:r>
+        <w:rPr>
+          <w:rFonts w:ascii="Consolas" w:eastAsia="Times New Roman" w:hAnsi="Consolas" w:cs="Times New Roman"/>
+          <w:color w:val="CCCCCC"/>
+          <w:kern w:val="0"/>
+          <w:sz w:val="27"/>
+          <w:szCs w:val="27"/>
+          <w:lang w:eastAsia="en-IN"/>
+          <w14:ligatures w14:val="none"/>
+        </w:rPr>
+        <w:t xml:space="preserve">, </w:t>
+      </w:r>
+      <w:r>
+        <w:rPr>
+          <w:rFonts w:ascii="Consolas" w:eastAsia="Times New Roman" w:hAnsi="Consolas" w:cs="Times New Roman"/>
+          <w:color w:val="4FC1FF"/>
+          <w:kern w:val="0"/>
+          <w:sz w:val="27"/>
+          <w:szCs w:val="27"/>
+          <w:lang w:eastAsia="en-IN"/>
+          <w14:ligatures w14:val="none"/>
+        </w:rPr>
+        <w:t>config</w:t>
+      </w:r>
+      <w:r>
+        <w:rPr>
+          <w:rFonts w:ascii="Consolas" w:eastAsia="Times New Roman" w:hAnsi="Consolas" w:cs="Times New Roman"/>
+          <w:color w:val="CCCCCC"/>
+          <w:kern w:val="0"/>
+          <w:sz w:val="27"/>
+          <w:szCs w:val="27"/>
+          <w:lang w:eastAsia="en-IN"/>
+          <w14:ligatures w14:val="none"/>
+        </w:rPr>
+        <w:t>)</w:t>
+      </w:r>
+    </w:p>
+    <w:p>
+      <w:pPr>
+        <w:pStyle w:val="ListParagraph"/>
+        <w:numPr>
+          <w:ilvl w:val="1"/>
+          <w:numId w:val="7"/>
+        </w:numPr>
+        <w:rPr>
+          <w:rFonts w:ascii="Times New Roman" w:hAnsi="Times New Roman" w:cs="Times New Roman"/>
+          <w:sz w:val="28"/>
+          <w:szCs w:val="28"/>
+        </w:rPr>
+      </w:pPr>
+      <w:proofErr w:type="spellStart"/>
+      <w:r>
+        <w:rPr>
+          <w:rFonts w:ascii="Consolas" w:hAnsi="Consolas" w:cs="Times New Roman"/>
+          <w:b/>
+          <w:bCs/>
+          <w:sz w:val="28"/>
+          <w:szCs w:val="28"/>
+        </w:rPr>
+        <w:t>axios.delete</w:t>
+      </w:r>
+      <w:proofErr w:type="spellEnd"/>
+      <w:r>
+        <w:rPr>
+          <w:rFonts w:ascii="Consolas" w:hAnsi="Consolas" w:cs="Times New Roman"/>
+          <w:b/>
+          <w:bCs/>
+          <w:sz w:val="28"/>
+          <w:szCs w:val="28"/>
+        </w:rPr>
+        <w:t>(</w:t>
+      </w:r>
+      <w:proofErr w:type="spellStart"/>
+      <w:r>
+        <w:rPr>
+          <w:rFonts w:ascii="Consolas" w:hAnsi="Consolas" w:cs="Times New Roman"/>
+          <w:b/>
+          <w:bCs/>
+          <w:sz w:val="28"/>
+          <w:szCs w:val="28"/>
+        </w:rPr>
+        <w:t>url</w:t>
+      </w:r>
+      <w:proofErr w:type="spellEnd"/>
+      <w:r>
+        <w:rPr>
+          <w:rFonts w:ascii="Consolas" w:hAnsi="Consolas" w:cs="Times New Roman"/>
+          <w:b/>
+          <w:bCs/>
+          <w:sz w:val="28"/>
+          <w:szCs w:val="28"/>
+        </w:rPr>
+        <w:t>[, config])</w:t>
+      </w:r>
+      <w:r>
+        <w:rPr>
+          <w:rFonts w:ascii="Consolas" w:hAnsi="Consolas" w:cs="Times New Roman"/>
+          <w:sz w:val="28"/>
+          <w:szCs w:val="28"/>
+        </w:rPr>
+        <w:t>:</w:t>
+      </w:r>
+      <w:r>
+        <w:rPr>
+          <w:rFonts w:ascii="Times New Roman" w:hAnsi="Times New Roman" w:cs="Times New Roman"/>
+          <w:sz w:val="28"/>
+          <w:szCs w:val="28"/>
+        </w:rPr>
+        <w:t xml:space="preserve"> Sends a DELETE request to the specified URL to remove a resource.</w:t>
+      </w:r>
+    </w:p>
+    <w:p>
+      <w:pPr>
+        <w:shd w:val="clear" w:color="auto" w:fill="1F1F1F"/>
+        <w:spacing w:after="0" w:line="360" w:lineRule="atLeast"/>
+        <w:rPr>
+          <w:rFonts w:ascii="Consolas" w:eastAsia="Times New Roman" w:hAnsi="Consolas" w:cs="Times New Roman"/>
+          <w:color w:val="CCCCCC"/>
+          <w:kern w:val="0"/>
+          <w:sz w:val="27"/>
+          <w:szCs w:val="27"/>
+          <w:lang w:eastAsia="en-IN"/>
+          <w14:ligatures w14:val="none"/>
+        </w:rPr>
+      </w:pPr>
+      <w:proofErr w:type="spellStart"/>
+      <w:r>
+        <w:rPr>
+          <w:rFonts w:ascii="Consolas" w:eastAsia="Times New Roman" w:hAnsi="Consolas" w:cs="Times New Roman"/>
+          <w:color w:val="569CD6"/>
+          <w:kern w:val="0"/>
+          <w:sz w:val="27"/>
+          <w:szCs w:val="27"/>
+          <w:lang w:eastAsia="en-IN"/>
+          <w14:ligatures w14:val="none"/>
+        </w:rPr>
+        <w:t>const</w:t>
+      </w:r>
+      <w:proofErr w:type="spellEnd"/>
+      <w:r>
+        <w:rPr>
+          <w:rFonts w:ascii="Consolas" w:eastAsia="Times New Roman" w:hAnsi="Consolas" w:cs="Times New Roman"/>
+          <w:color w:val="CCCCCC"/>
+          <w:kern w:val="0"/>
+          <w:sz w:val="27"/>
+          <w:szCs w:val="27"/>
+          <w:lang w:eastAsia="en-IN"/>
+          <w14:ligatures w14:val="none"/>
+        </w:rPr>
+        <w:t xml:space="preserve"> </w:t>
+      </w:r>
+      <w:r>
+        <w:rPr>
+          <w:rFonts w:ascii="Consolas" w:eastAsia="Times New Roman" w:hAnsi="Consolas" w:cs="Times New Roman"/>
+          <w:color w:val="4FC1FF"/>
+          <w:kern w:val="0"/>
+          <w:sz w:val="27"/>
+          <w:szCs w:val="27"/>
+          <w:lang w:eastAsia="en-IN"/>
+          <w14:ligatures w14:val="none"/>
+        </w:rPr>
+        <w:t>result</w:t>
+      </w:r>
+      <w:r>
+        <w:rPr>
+          <w:rFonts w:ascii="Consolas" w:eastAsia="Times New Roman" w:hAnsi="Consolas" w:cs="Times New Roman"/>
+          <w:color w:val="CCCCCC"/>
+          <w:kern w:val="0"/>
+          <w:sz w:val="27"/>
+          <w:szCs w:val="27"/>
+          <w:lang w:eastAsia="en-IN"/>
+          <w14:ligatures w14:val="none"/>
+        </w:rPr>
+        <w:t xml:space="preserve"> </w:t>
+      </w:r>
+      <w:r>
+        <w:rPr>
+          <w:rFonts w:ascii="Consolas" w:eastAsia="Times New Roman" w:hAnsi="Consolas" w:cs="Times New Roman"/>
+          <w:color w:val="D4D4D4"/>
+          <w:kern w:val="0"/>
+          <w:sz w:val="27"/>
+          <w:szCs w:val="27"/>
+          <w:lang w:eastAsia="en-IN"/>
+          <w14:ligatures w14:val="none"/>
+        </w:rPr>
+        <w:t>=</w:t>
+      </w:r>
+      <w:r>
+        <w:rPr>
+          <w:rFonts w:ascii="Consolas" w:eastAsia="Times New Roman" w:hAnsi="Consolas" w:cs="Times New Roman"/>
+          <w:color w:val="CCCCCC"/>
+          <w:kern w:val="0"/>
+          <w:sz w:val="27"/>
+          <w:szCs w:val="27"/>
+          <w:lang w:eastAsia="en-IN"/>
+          <w14:ligatures w14:val="none"/>
+        </w:rPr>
+        <w:t xml:space="preserve"> </w:t>
+      </w:r>
+      <w:r>
+        <w:rPr>
+          <w:rFonts w:ascii="Consolas" w:eastAsia="Times New Roman" w:hAnsi="Consolas" w:cs="Times New Roman"/>
+          <w:color w:val="C586C0"/>
+          <w:kern w:val="0"/>
+          <w:sz w:val="27"/>
+          <w:szCs w:val="27"/>
+          <w:lang w:eastAsia="en-IN"/>
+          <w14:ligatures w14:val="none"/>
+        </w:rPr>
+        <w:t>await</w:t>
+      </w:r>
+      <w:r>
+        <w:rPr>
+          <w:rFonts w:ascii="Consolas" w:eastAsia="Times New Roman" w:hAnsi="Consolas" w:cs="Times New Roman"/>
+          <w:color w:val="CCCCCC"/>
+          <w:kern w:val="0"/>
+          <w:sz w:val="27"/>
+          <w:szCs w:val="27"/>
+          <w:lang w:eastAsia="en-IN"/>
+          <w14:ligatures w14:val="none"/>
+        </w:rPr>
+        <w:t xml:space="preserve"> </w:t>
+      </w:r>
+      <w:proofErr w:type="spellStart"/>
+      <w:r>
+        <w:rPr>
+          <w:rFonts w:ascii="Consolas" w:eastAsia="Times New Roman" w:hAnsi="Consolas" w:cs="Times New Roman"/>
+          <w:color w:val="4FC1FF"/>
+          <w:kern w:val="0"/>
+          <w:sz w:val="27"/>
+          <w:szCs w:val="27"/>
+          <w:lang w:eastAsia="en-IN"/>
+          <w14:ligatures w14:val="none"/>
+        </w:rPr>
+        <w:t>axios</w:t>
+      </w:r>
+      <w:r>
+        <w:rPr>
+          <w:rFonts w:ascii="Consolas" w:eastAsia="Times New Roman" w:hAnsi="Consolas" w:cs="Times New Roman"/>
+          <w:color w:val="CCCCCC"/>
+          <w:kern w:val="0"/>
+          <w:sz w:val="27"/>
+          <w:szCs w:val="27"/>
+          <w:lang w:eastAsia="en-IN"/>
+          <w14:ligatures w14:val="none"/>
+        </w:rPr>
+        <w:t>.</w:t>
+      </w:r>
+      <w:r>
+        <w:rPr>
+          <w:rFonts w:ascii="Consolas" w:eastAsia="Times New Roman" w:hAnsi="Consolas" w:cs="Times New Roman"/>
+          <w:color w:val="DCDCAA"/>
+          <w:kern w:val="0"/>
+          <w:sz w:val="27"/>
+          <w:szCs w:val="27"/>
+          <w:lang w:eastAsia="en-IN"/>
+          <w14:ligatures w14:val="none"/>
+        </w:rPr>
+        <w:t>delete</w:t>
+      </w:r>
+      <w:proofErr w:type="spellEnd"/>
+      <w:r>
+        <w:rPr>
+          <w:rFonts w:ascii="Consolas" w:eastAsia="Times New Roman" w:hAnsi="Consolas" w:cs="Times New Roman"/>
+          <w:color w:val="CCCCCC"/>
+          <w:kern w:val="0"/>
+          <w:sz w:val="27"/>
+          <w:szCs w:val="27"/>
+          <w:lang w:eastAsia="en-IN"/>
+          <w14:ligatures w14:val="none"/>
+        </w:rPr>
+        <w:t>(</w:t>
+      </w:r>
+      <w:r>
+        <w:rPr>
+          <w:rFonts w:ascii="Consolas" w:eastAsia="Times New Roman" w:hAnsi="Consolas" w:cs="Times New Roman"/>
+          <w:color w:val="CE9178"/>
+          <w:kern w:val="0"/>
+          <w:sz w:val="27"/>
+          <w:szCs w:val="27"/>
+          <w:lang w:eastAsia="en-IN"/>
+          <w14:ligatures w14:val="none"/>
+        </w:rPr>
+        <w:t>`</w:t>
+      </w:r>
+      <w:r>
+        <w:rPr>
+          <w:rFonts w:ascii="Consolas" w:eastAsia="Times New Roman" w:hAnsi="Consolas" w:cs="Times New Roman"/>
+          <w:color w:val="569CD6"/>
+          <w:kern w:val="0"/>
+          <w:sz w:val="27"/>
+          <w:szCs w:val="27"/>
+          <w:lang w:eastAsia="en-IN"/>
+          <w14:ligatures w14:val="none"/>
+        </w:rPr>
+        <w:t>${</w:t>
+      </w:r>
+      <w:r>
+        <w:rPr>
+          <w:rFonts w:ascii="Consolas" w:eastAsia="Times New Roman" w:hAnsi="Consolas" w:cs="Times New Roman"/>
+          <w:color w:val="4FC1FF"/>
+          <w:kern w:val="0"/>
+          <w:sz w:val="27"/>
+          <w:szCs w:val="27"/>
+          <w:lang w:eastAsia="en-IN"/>
+          <w14:ligatures w14:val="none"/>
+        </w:rPr>
+        <w:t>API_URL</w:t>
+      </w:r>
+      <w:r>
+        <w:rPr>
+          <w:rFonts w:ascii="Consolas" w:eastAsia="Times New Roman" w:hAnsi="Consolas" w:cs="Times New Roman"/>
+          <w:color w:val="569CD6"/>
+          <w:kern w:val="0"/>
+          <w:sz w:val="27"/>
+          <w:szCs w:val="27"/>
+          <w:lang w:eastAsia="en-IN"/>
+          <w14:ligatures w14:val="none"/>
+        </w:rPr>
+        <w:t>}</w:t>
+      </w:r>
+      <w:r>
+        <w:rPr>
+          <w:rFonts w:ascii="Consolas" w:eastAsia="Times New Roman" w:hAnsi="Consolas" w:cs="Times New Roman"/>
+          <w:color w:val="CE9178"/>
+          <w:kern w:val="0"/>
+          <w:sz w:val="27"/>
+          <w:szCs w:val="27"/>
+          <w:lang w:eastAsia="en-IN"/>
+          <w14:ligatures w14:val="none"/>
+        </w:rPr>
+        <w:t>/secrets/</w:t>
+      </w:r>
+      <w:r>
+        <w:rPr>
+          <w:rFonts w:ascii="Consolas" w:eastAsia="Times New Roman" w:hAnsi="Consolas" w:cs="Times New Roman"/>
+          <w:color w:val="569CD6"/>
+          <w:kern w:val="0"/>
+          <w:sz w:val="27"/>
+          <w:szCs w:val="27"/>
+          <w:lang w:eastAsia="en-IN"/>
+          <w14:ligatures w14:val="none"/>
+        </w:rPr>
+        <w:t>${</w:t>
+      </w:r>
+      <w:proofErr w:type="spellStart"/>
+      <w:r>
+        <w:rPr>
+          <w:rFonts w:ascii="Consolas" w:eastAsia="Times New Roman" w:hAnsi="Consolas" w:cs="Times New Roman"/>
+          <w:color w:val="4FC1FF"/>
+          <w:kern w:val="0"/>
+          <w:sz w:val="27"/>
+          <w:szCs w:val="27"/>
+          <w:lang w:eastAsia="en-IN"/>
+          <w14:ligatures w14:val="none"/>
+        </w:rPr>
+        <w:t>searchId</w:t>
+      </w:r>
+      <w:proofErr w:type="spellEnd"/>
+      <w:r>
+        <w:rPr>
+          <w:rFonts w:ascii="Consolas" w:eastAsia="Times New Roman" w:hAnsi="Consolas" w:cs="Times New Roman"/>
+          <w:color w:val="569CD6"/>
+          <w:kern w:val="0"/>
+          <w:sz w:val="27"/>
+          <w:szCs w:val="27"/>
+          <w:lang w:eastAsia="en-IN"/>
+          <w14:ligatures w14:val="none"/>
+        </w:rPr>
+        <w:t>}</w:t>
+      </w:r>
+      <w:r>
+        <w:rPr>
+          <w:rFonts w:ascii="Consolas" w:eastAsia="Times New Roman" w:hAnsi="Consolas" w:cs="Times New Roman"/>
+          <w:color w:val="CE9178"/>
+          <w:kern w:val="0"/>
+          <w:sz w:val="27"/>
+          <w:szCs w:val="27"/>
+          <w:lang w:eastAsia="en-IN"/>
+          <w14:ligatures w14:val="none"/>
+        </w:rPr>
+        <w:t>`</w:t>
+      </w:r>
+      <w:r>
+        <w:rPr>
+          <w:rFonts w:ascii="Consolas" w:eastAsia="Times New Roman" w:hAnsi="Consolas" w:cs="Times New Roman"/>
+          <w:color w:val="CCCCCC"/>
+          <w:kern w:val="0"/>
+          <w:sz w:val="27"/>
+          <w:szCs w:val="27"/>
+          <w:lang w:eastAsia="en-IN"/>
+          <w14:ligatures w14:val="none"/>
+        </w:rPr>
+        <w:t xml:space="preserve">, </w:t>
+      </w:r>
+      <w:r>
+        <w:rPr>
+          <w:rFonts w:ascii="Consolas" w:eastAsia="Times New Roman" w:hAnsi="Consolas" w:cs="Times New Roman"/>
+          <w:color w:val="4FC1FF"/>
+          <w:kern w:val="0"/>
+          <w:sz w:val="27"/>
+          <w:szCs w:val="27"/>
+          <w:lang w:eastAsia="en-IN"/>
+          <w14:ligatures w14:val="none"/>
+        </w:rPr>
+        <w:t>config</w:t>
+      </w:r>
+      <w:r>
+        <w:rPr>
+          <w:rFonts w:ascii="Consolas" w:eastAsia="Times New Roman" w:hAnsi="Consolas" w:cs="Times New Roman"/>
+          <w:color w:val="CCCCCC"/>
+          <w:kern w:val="0"/>
+          <w:sz w:val="27"/>
+          <w:szCs w:val="27"/>
+          <w:lang w:eastAsia="en-IN"/>
+          <w14:ligatures w14:val="none"/>
+        </w:rPr>
+        <w:t>)</w:t>
+      </w:r>
+    </w:p>
+    <w:p>
+      <w:pPr>
+        <w:pStyle w:val="ListParagraph"/>
+        <w:numPr>
+          <w:ilvl w:val="0"/>
+          <w:numId w:val="7"/>
+        </w:numPr>
+        <w:rPr>
+          <w:rFonts w:ascii="Times New Roman" w:hAnsi="Times New Roman" w:cs="Times New Roman"/>
+          <w:sz w:val="28"/>
+          <w:szCs w:val="28"/>
+        </w:rPr>
+      </w:pPr>
+      <w:r>
+        <w:rPr>
+          <w:rFonts w:ascii="Times New Roman" w:hAnsi="Times New Roman" w:cs="Times New Roman"/>
+          <w:sz w:val="28"/>
+          <w:szCs w:val="28"/>
+        </w:rPr>
+        <w:t>Request method aliases:</w:t>
+      </w:r>
+    </w:p>
+    <w:p>
+      <w:pPr>
+        <w:pStyle w:val="ListParagraph"/>
+        <w:numPr>
+          <w:ilvl w:val="1"/>
+          <w:numId w:val="7"/>
+        </w:numPr>
+        <w:rPr>
+          <w:rFonts w:ascii="Consolas" w:hAnsi="Consolas" w:cs="Courier New"/>
+          <w:sz w:val="28"/>
+          <w:szCs w:val="28"/>
+        </w:rPr>
+      </w:pPr>
+      <w:proofErr w:type="spellStart"/>
+      <w:r>
+        <w:rPr>
+          <w:rFonts w:ascii="Consolas" w:hAnsi="Consolas" w:cs="Courier New"/>
+          <w:sz w:val="28"/>
+          <w:szCs w:val="28"/>
+        </w:rPr>
+        <w:t>axios.request</w:t>
+      </w:r>
+      <w:proofErr w:type="spellEnd"/>
+      <w:r>
+        <w:rPr>
+          <w:rFonts w:ascii="Consolas" w:hAnsi="Consolas" w:cs="Courier New"/>
+          <w:sz w:val="28"/>
+          <w:szCs w:val="28"/>
+        </w:rPr>
+        <w:t>(config)</w:t>
+      </w:r>
+    </w:p>
+    <w:p>
+      <w:pPr>
+        <w:pStyle w:val="ListParagraph"/>
+        <w:numPr>
+          <w:ilvl w:val="1"/>
+          <w:numId w:val="7"/>
+        </w:numPr>
+        <w:rPr>
+          <w:rFonts w:ascii="Consolas" w:hAnsi="Consolas" w:cs="Courier New"/>
+          <w:sz w:val="28"/>
+          <w:szCs w:val="28"/>
+        </w:rPr>
+      </w:pPr>
+      <w:proofErr w:type="spellStart"/>
+      <w:r>
+        <w:rPr>
+          <w:rFonts w:ascii="Consolas" w:hAnsi="Consolas" w:cs="Courier New"/>
+          <w:sz w:val="28"/>
+          <w:szCs w:val="28"/>
+        </w:rPr>
+        <w:t>axios.get</w:t>
+      </w:r>
+      <w:proofErr w:type="spellEnd"/>
+      <w:r>
+        <w:rPr>
+          <w:rFonts w:ascii="Consolas" w:hAnsi="Consolas" w:cs="Courier New"/>
+          <w:sz w:val="28"/>
+          <w:szCs w:val="28"/>
+        </w:rPr>
+        <w:t>(</w:t>
+      </w:r>
+      <w:proofErr w:type="spellStart"/>
+      <w:r>
+        <w:rPr>
+          <w:rFonts w:ascii="Consolas" w:hAnsi="Consolas" w:cs="Courier New"/>
+          <w:sz w:val="28"/>
+          <w:szCs w:val="28"/>
+        </w:rPr>
+        <w:t>url</w:t>
+      </w:r>
+      <w:proofErr w:type="spellEnd"/>
+      <w:r>
+        <w:rPr>
+          <w:rFonts w:ascii="Consolas" w:hAnsi="Consolas" w:cs="Courier New"/>
+          <w:sz w:val="28"/>
+          <w:szCs w:val="28"/>
+        </w:rPr>
+        <w:t>[, config])</w:t>
+      </w:r>
+    </w:p>
+    <w:p>
+      <w:pPr>
+        <w:pStyle w:val="ListParagraph"/>
+        <w:numPr>
+          <w:ilvl w:val="1"/>
+          <w:numId w:val="7"/>
+        </w:numPr>
+        <w:rPr>
+          <w:rFonts w:ascii="Consolas" w:hAnsi="Consolas" w:cs="Courier New"/>
+          <w:sz w:val="28"/>
+          <w:szCs w:val="28"/>
+        </w:rPr>
+      </w:pPr>
+      <w:proofErr w:type="spellStart"/>
+      <w:r>
+        <w:rPr>
+          <w:rFonts w:ascii="Consolas" w:hAnsi="Consolas" w:cs="Courier New"/>
+          <w:sz w:val="28"/>
+          <w:szCs w:val="28"/>
+        </w:rPr>
+        <w:t>axios.delete</w:t>
+      </w:r>
+      <w:proofErr w:type="spellEnd"/>
+      <w:r>
+        <w:rPr>
+          <w:rFonts w:ascii="Consolas" w:hAnsi="Consolas" w:cs="Courier New"/>
+          <w:sz w:val="28"/>
+          <w:szCs w:val="28"/>
+        </w:rPr>
+        <w:t>(</w:t>
+      </w:r>
+      <w:proofErr w:type="spellStart"/>
+      <w:r>
+        <w:rPr>
+          <w:rFonts w:ascii="Consolas" w:hAnsi="Consolas" w:cs="Courier New"/>
+          <w:sz w:val="28"/>
+          <w:szCs w:val="28"/>
+        </w:rPr>
+        <w:t>url</w:t>
+      </w:r>
+      <w:proofErr w:type="spellEnd"/>
+      <w:r>
+        <w:rPr>
+          <w:rFonts w:ascii="Consolas" w:hAnsi="Consolas" w:cs="Courier New"/>
+          <w:sz w:val="28"/>
+          <w:szCs w:val="28"/>
+        </w:rPr>
+        <w:t>[, config])</w:t>
+      </w:r>
+    </w:p>
+    <w:p>
+      <w:pPr>
+        <w:pStyle w:val="ListParagraph"/>
+        <w:numPr>
+          <w:ilvl w:val="1"/>
+          <w:numId w:val="7"/>
+        </w:numPr>
+        <w:rPr>
+          <w:rFonts w:ascii="Consolas" w:hAnsi="Consolas" w:cs="Courier New"/>
+          <w:sz w:val="28"/>
+          <w:szCs w:val="28"/>
+        </w:rPr>
+      </w:pPr>
+      <w:proofErr w:type="spellStart"/>
+      <w:r>
+        <w:rPr>
+          <w:rFonts w:ascii="Consolas" w:hAnsi="Consolas" w:cs="Courier New"/>
+          <w:sz w:val="28"/>
+          <w:szCs w:val="28"/>
+        </w:rPr>
+        <w:t>axios.head</w:t>
+      </w:r>
+      <w:proofErr w:type="spellEnd"/>
+      <w:r>
+        <w:rPr>
+          <w:rFonts w:ascii="Consolas" w:hAnsi="Consolas" w:cs="Courier New"/>
+          <w:sz w:val="28"/>
+          <w:szCs w:val="28"/>
+        </w:rPr>
+        <w:t>(</w:t>
+      </w:r>
+      <w:proofErr w:type="spellStart"/>
+      <w:r>
+        <w:rPr>
+          <w:rFonts w:ascii="Consolas" w:hAnsi="Consolas" w:cs="Courier New"/>
+          <w:sz w:val="28"/>
+          <w:szCs w:val="28"/>
+        </w:rPr>
+        <w:t>url</w:t>
+      </w:r>
+      <w:proofErr w:type="spellEnd"/>
+      <w:r>
+        <w:rPr>
+          <w:rFonts w:ascii="Consolas" w:hAnsi="Consolas" w:cs="Courier New"/>
+          <w:sz w:val="28"/>
+          <w:szCs w:val="28"/>
+        </w:rPr>
+        <w:t>[, config])</w:t>
+      </w:r>
+    </w:p>
+    <w:p>
+      <w:pPr>
+        <w:pStyle w:val="ListParagraph"/>
+        <w:numPr>
+          <w:ilvl w:val="1"/>
+          <w:numId w:val="7"/>
+        </w:numPr>
+        <w:rPr>
+          <w:rFonts w:ascii="Consolas" w:hAnsi="Consolas" w:cs="Courier New"/>
+          <w:sz w:val="28"/>
+          <w:szCs w:val="28"/>
+        </w:rPr>
+      </w:pPr>
+      <w:proofErr w:type="spellStart"/>
+      <w:r>
+        <w:rPr>
+          <w:rFonts w:ascii="Consolas" w:hAnsi="Consolas" w:cs="Courier New"/>
+          <w:sz w:val="28"/>
+          <w:szCs w:val="28"/>
+        </w:rPr>
+        <w:t>axios.options</w:t>
+      </w:r>
+      <w:proofErr w:type="spellEnd"/>
+      <w:r>
+        <w:rPr>
+          <w:rFonts w:ascii="Consolas" w:hAnsi="Consolas" w:cs="Courier New"/>
+          <w:sz w:val="28"/>
+          <w:szCs w:val="28"/>
+        </w:rPr>
+        <w:t>(</w:t>
+      </w:r>
+      <w:proofErr w:type="spellStart"/>
+      <w:r>
+        <w:rPr>
+          <w:rFonts w:ascii="Consolas" w:hAnsi="Consolas" w:cs="Courier New"/>
+          <w:sz w:val="28"/>
+          <w:szCs w:val="28"/>
+        </w:rPr>
+        <w:t>url</w:t>
+      </w:r>
+      <w:proofErr w:type="spellEnd"/>
+      <w:r>
+        <w:rPr>
+          <w:rFonts w:ascii="Consolas" w:hAnsi="Consolas" w:cs="Courier New"/>
+          <w:sz w:val="28"/>
+          <w:szCs w:val="28"/>
+        </w:rPr>
+        <w:t>[, config])</w:t>
+      </w:r>
+    </w:p>
+    <w:p>
+      <w:pPr>
+        <w:pStyle w:val="ListParagraph"/>
+        <w:numPr>
+          <w:ilvl w:val="1"/>
+          <w:numId w:val="7"/>
+        </w:numPr>
+        <w:rPr>
+          <w:rFonts w:ascii="Consolas" w:hAnsi="Consolas" w:cs="Courier New"/>
+          <w:sz w:val="28"/>
+          <w:szCs w:val="28"/>
+        </w:rPr>
+      </w:pPr>
+      <w:proofErr w:type="spellStart"/>
+      <w:r>
+        <w:rPr>
+          <w:rFonts w:ascii="Consolas" w:hAnsi="Consolas" w:cs="Courier New"/>
+          <w:sz w:val="28"/>
+          <w:szCs w:val="28"/>
+        </w:rPr>
+        <w:t>axios.post</w:t>
+      </w:r>
+      <w:proofErr w:type="spellEnd"/>
+      <w:r>
+        <w:rPr>
+          <w:rFonts w:ascii="Consolas" w:hAnsi="Consolas" w:cs="Courier New"/>
+          <w:sz w:val="28"/>
+          <w:szCs w:val="28"/>
+        </w:rPr>
+        <w:t>(</w:t>
+      </w:r>
+      <w:proofErr w:type="spellStart"/>
+      <w:r>
+        <w:rPr>
+          <w:rFonts w:ascii="Consolas" w:hAnsi="Consolas" w:cs="Courier New"/>
+          <w:sz w:val="28"/>
+          <w:szCs w:val="28"/>
+        </w:rPr>
+        <w:t>url</w:t>
+      </w:r>
+      <w:proofErr w:type="spellEnd"/>
+      <w:r>
+        <w:rPr>
+          <w:rFonts w:ascii="Consolas" w:hAnsi="Consolas" w:cs="Courier New"/>
+          <w:sz w:val="28"/>
+          <w:szCs w:val="28"/>
+        </w:rPr>
+        <w:t>[, data[, config]])</w:t>
+      </w:r>
+    </w:p>
+    <w:p>
+      <w:pPr>
+        <w:pStyle w:val="ListParagraph"/>
+        <w:numPr>
+          <w:ilvl w:val="1"/>
+          <w:numId w:val="7"/>
+        </w:numPr>
+        <w:rPr>
+          <w:rFonts w:ascii="Consolas" w:hAnsi="Consolas" w:cs="Courier New"/>
+          <w:sz w:val="28"/>
+          <w:szCs w:val="28"/>
+        </w:rPr>
+      </w:pPr>
+      <w:proofErr w:type="spellStart"/>
+      <w:r>
+        <w:rPr>
+          <w:rFonts w:ascii="Consolas" w:hAnsi="Consolas" w:cs="Courier New"/>
+          <w:sz w:val="28"/>
+          <w:szCs w:val="28"/>
+        </w:rPr>
+        <w:t>axios.put</w:t>
+      </w:r>
+      <w:proofErr w:type="spellEnd"/>
+      <w:r>
+        <w:rPr>
+          <w:rFonts w:ascii="Consolas" w:hAnsi="Consolas" w:cs="Courier New"/>
+          <w:sz w:val="28"/>
+          <w:szCs w:val="28"/>
+        </w:rPr>
+        <w:t>(</w:t>
+      </w:r>
+      <w:proofErr w:type="spellStart"/>
+      <w:r>
+        <w:rPr>
+          <w:rFonts w:ascii="Consolas" w:hAnsi="Consolas" w:cs="Courier New"/>
+          <w:sz w:val="28"/>
+          <w:szCs w:val="28"/>
+        </w:rPr>
+        <w:t>url</w:t>
+      </w:r>
+      <w:proofErr w:type="spellEnd"/>
+      <w:r>
+        <w:rPr>
+          <w:rFonts w:ascii="Consolas" w:hAnsi="Consolas" w:cs="Courier New"/>
+          <w:sz w:val="28"/>
+          <w:szCs w:val="28"/>
+        </w:rPr>
+        <w:t>[, data[, config]])</w:t>
+      </w:r>
+    </w:p>
+    <w:p>
+      <w:pPr>
+        <w:pStyle w:val="ListParagraph"/>
+        <w:numPr>
+          <w:ilvl w:val="1"/>
+          <w:numId w:val="7"/>
+        </w:numPr>
+        <w:rPr>
+          <w:rFonts w:ascii="Consolas" w:hAnsi="Consolas" w:cs="Courier New"/>
+          <w:sz w:val="28"/>
+          <w:szCs w:val="28"/>
+        </w:rPr>
+      </w:pPr>
+      <w:proofErr w:type="spellStart"/>
+      <w:r>
+        <w:rPr>
+          <w:rFonts w:ascii="Consolas" w:hAnsi="Consolas" w:cs="Courier New"/>
+          <w:sz w:val="28"/>
+          <w:szCs w:val="28"/>
+        </w:rPr>
+        <w:t>axios.patch</w:t>
+      </w:r>
+      <w:proofErr w:type="spellEnd"/>
+      <w:r>
+        <w:rPr>
+          <w:rFonts w:ascii="Consolas" w:hAnsi="Consolas" w:cs="Courier New"/>
+          <w:sz w:val="28"/>
+          <w:szCs w:val="28"/>
+        </w:rPr>
+        <w:t>(</w:t>
+      </w:r>
+      <w:proofErr w:type="spellStart"/>
+      <w:r>
+        <w:rPr>
+          <w:rFonts w:ascii="Consolas" w:hAnsi="Consolas" w:cs="Courier New"/>
+          <w:sz w:val="28"/>
+          <w:szCs w:val="28"/>
+        </w:rPr>
+        <w:t>url</w:t>
+      </w:r>
+      <w:proofErr w:type="spellEnd"/>
+      <w:r>
+        <w:rPr>
+          <w:rFonts w:ascii="Consolas" w:hAnsi="Consolas" w:cs="Courier New"/>
+          <w:sz w:val="28"/>
+          <w:szCs w:val="28"/>
+        </w:rPr>
+        <w:t>[, data[, config]])</w:t>
+      </w:r>
+    </w:p>
+    <w:p>
+      <w:pPr>
+        <w:pStyle w:val="ListParagraph"/>
+        <w:numPr>
+          <w:ilvl w:val="1"/>
+          <w:numId w:val="7"/>
+        </w:numPr>
+        <w:rPr>
+          <w:rFonts w:ascii="Consolas" w:hAnsi="Consolas" w:cs="Courier New"/>
+          <w:sz w:val="28"/>
+          <w:szCs w:val="28"/>
+        </w:rPr>
+      </w:pPr>
+      <w:proofErr w:type="spellStart"/>
+      <w:r>
+        <w:rPr>
+          <w:rFonts w:ascii="Consolas" w:hAnsi="Consolas" w:cs="Courier New"/>
+          <w:sz w:val="28"/>
+          <w:szCs w:val="28"/>
+        </w:rPr>
+        <w:t>axios.postForm</w:t>
+      </w:r>
+      <w:proofErr w:type="spellEnd"/>
+      <w:r>
+        <w:rPr>
+          <w:rFonts w:ascii="Consolas" w:hAnsi="Consolas" w:cs="Courier New"/>
+          <w:sz w:val="28"/>
+          <w:szCs w:val="28"/>
+        </w:rPr>
+        <w:t>(</w:t>
+      </w:r>
+      <w:proofErr w:type="spellStart"/>
+      <w:r>
+        <w:rPr>
+          <w:rFonts w:ascii="Consolas" w:hAnsi="Consolas" w:cs="Courier New"/>
+          <w:sz w:val="28"/>
+          <w:szCs w:val="28"/>
+        </w:rPr>
+        <w:t>url</w:t>
+      </w:r>
+      <w:proofErr w:type="spellEnd"/>
+      <w:r>
+        <w:rPr>
+          <w:rFonts w:ascii="Consolas" w:hAnsi="Consolas" w:cs="Courier New"/>
+          <w:sz w:val="28"/>
+          <w:szCs w:val="28"/>
+        </w:rPr>
+        <w:t>[, data[, config]])</w:t>
+      </w:r>
+    </w:p>
+    <w:p>
+      <w:pPr>
+        <w:pStyle w:val="ListParagraph"/>
+        <w:numPr>
+          <w:ilvl w:val="1"/>
+          <w:numId w:val="7"/>
+        </w:numPr>
+        <w:rPr>
+          <w:rFonts w:ascii="Consolas" w:hAnsi="Consolas" w:cs="Courier New"/>
+          <w:sz w:val="28"/>
+          <w:szCs w:val="28"/>
+        </w:rPr>
+      </w:pPr>
+      <w:proofErr w:type="spellStart"/>
+      <w:r>
+        <w:rPr>
+          <w:rFonts w:ascii="Consolas" w:hAnsi="Consolas" w:cs="Courier New"/>
+          <w:sz w:val="28"/>
+          <w:szCs w:val="28"/>
+        </w:rPr>
+        <w:t>axios.putForm</w:t>
+      </w:r>
+      <w:proofErr w:type="spellEnd"/>
+      <w:r>
+        <w:rPr>
+          <w:rFonts w:ascii="Consolas" w:hAnsi="Consolas" w:cs="Courier New"/>
+          <w:sz w:val="28"/>
+          <w:szCs w:val="28"/>
+        </w:rPr>
+        <w:t>(</w:t>
+      </w:r>
+      <w:proofErr w:type="spellStart"/>
+      <w:r>
+        <w:rPr>
+          <w:rFonts w:ascii="Consolas" w:hAnsi="Consolas" w:cs="Courier New"/>
+          <w:sz w:val="28"/>
+          <w:szCs w:val="28"/>
+        </w:rPr>
+        <w:t>url</w:t>
+      </w:r>
+      <w:proofErr w:type="spellEnd"/>
+      <w:r>
+        <w:rPr>
+          <w:rFonts w:ascii="Consolas" w:hAnsi="Consolas" w:cs="Courier New"/>
+          <w:sz w:val="28"/>
+          <w:szCs w:val="28"/>
+        </w:rPr>
+        <w:t>[, data[, config]])</w:t>
+      </w:r>
+    </w:p>
+    <w:p>
+      <w:pPr>
+        <w:pStyle w:val="ListParagraph"/>
+        <w:numPr>
+          <w:ilvl w:val="1"/>
+          <w:numId w:val="7"/>
+        </w:numPr>
+        <w:rPr>
+          <w:rFonts w:ascii="Consolas" w:hAnsi="Consolas" w:cs="Courier New"/>
+          <w:sz w:val="28"/>
+          <w:szCs w:val="28"/>
+        </w:rPr>
+      </w:pPr>
+      <w:proofErr w:type="spellStart"/>
+      <w:r>
+        <w:rPr>
+          <w:rFonts w:ascii="Consolas" w:hAnsi="Consolas" w:cs="Courier New"/>
+          <w:sz w:val="28"/>
+          <w:szCs w:val="28"/>
+        </w:rPr>
+        <w:t>axios.patchForm</w:t>
+      </w:r>
+      <w:proofErr w:type="spellEnd"/>
+      <w:r>
+        <w:rPr>
+          <w:rFonts w:ascii="Consolas" w:hAnsi="Consolas" w:cs="Courier New"/>
+          <w:sz w:val="28"/>
+          <w:szCs w:val="28"/>
+        </w:rPr>
+        <w:t>(</w:t>
+      </w:r>
+      <w:proofErr w:type="spellStart"/>
+      <w:r>
+        <w:rPr>
+          <w:rFonts w:ascii="Consolas" w:hAnsi="Consolas" w:cs="Courier New"/>
+          <w:sz w:val="28"/>
+          <w:szCs w:val="28"/>
+        </w:rPr>
+        <w:t>url</w:t>
+      </w:r>
+      <w:proofErr w:type="spellEnd"/>
+      <w:r>
+        <w:rPr>
+          <w:rFonts w:ascii="Consolas" w:hAnsi="Consolas" w:cs="Courier New"/>
+          <w:sz w:val="28"/>
+          <w:szCs w:val="28"/>
+        </w:rPr>
+        <w:t>[, data[, config]])</w:t>
+      </w:r>
+    </w:p>
+    <w:p>
+      <w:pPr>
+        <w:pStyle w:val="ListParagraph"/>
+        <w:numPr>
+          <w:ilvl w:val="1"/>
+          <w:numId w:val="7"/>
+        </w:numPr>
+        <w:rPr>
+          <w:rFonts w:ascii="Times New Roman" w:hAnsi="Times New Roman" w:cs="Times New Roman"/>
+          <w:sz w:val="28"/>
+          <w:szCs w:val="28"/>
+        </w:rPr>
+      </w:pPr>
+      <w:r>
+        <w:rPr>
+          <w:rFonts w:ascii="Times New Roman" w:hAnsi="Times New Roman" w:cs="Times New Roman"/>
+          <w:sz w:val="28"/>
+          <w:szCs w:val="28"/>
+        </w:rPr>
+        <w:t>[] =&gt; Optional parameters.</w:t>
+      </w:r>
     </w:p>
     <w:sectPr>
       <w:pgSz w:w="11906" w:h="16838"/>
@@ -8394,6 +11115,119 @@
     </w:lvl>
   </w:abstractNum>
   <w:abstractNum w:abstractNumId="2" w15:restartNumberingAfterBreak="0">
+    <w:nsid w:val="23F94EF4"/>
+    <w:multiLevelType w:val="hybridMultilevel"/>
+    <w:tmpl w:val="74C89AA6"/>
+    <w:lvl w:ilvl="0" w:tplc="40090001">
+      <w:start w:val="1"/>
+      <w:numFmt w:val="bullet"/>
+      <w:lvlText w:val=""/>
+      <w:lvlJc w:val="left"/>
+      <w:pPr>
+        <w:ind w:left="720" w:hanging="360"/>
+      </w:pPr>
+      <w:rPr>
+        <w:rFonts w:ascii="Symbol" w:hAnsi="Symbol" w:hint="default"/>
+      </w:rPr>
+    </w:lvl>
+    <w:lvl w:ilvl="1" w:tplc="40090003">
+      <w:start w:val="1"/>
+      <w:numFmt w:val="bullet"/>
+      <w:lvlText w:val="o"/>
+      <w:lvlJc w:val="left"/>
+      <w:pPr>
+        <w:ind w:left="1440" w:hanging="360"/>
+      </w:pPr>
+      <w:rPr>
+        <w:rFonts w:ascii="Courier New" w:hAnsi="Courier New" w:cs="Courier New" w:hint="default"/>
+      </w:rPr>
+    </w:lvl>
+    <w:lvl w:ilvl="2" w:tplc="40090005">
+      <w:start w:val="1"/>
+      <w:numFmt w:val="bullet"/>
+      <w:lvlText w:val=""/>
+      <w:lvlJc w:val="left"/>
+      <w:pPr>
+        <w:ind w:left="2160" w:hanging="360"/>
+      </w:pPr>
+      <w:rPr>
+        <w:rFonts w:ascii="Wingdings" w:hAnsi="Wingdings" w:hint="default"/>
+      </w:rPr>
+    </w:lvl>
+    <w:lvl w:ilvl="3" w:tplc="40090001">
+      <w:start w:val="1"/>
+      <w:numFmt w:val="bullet"/>
+      <w:lvlText w:val=""/>
+      <w:lvlJc w:val="left"/>
+      <w:pPr>
+        <w:ind w:left="2880" w:hanging="360"/>
+      </w:pPr>
+      <w:rPr>
+        <w:rFonts w:ascii="Symbol" w:hAnsi="Symbol" w:hint="default"/>
+      </w:rPr>
+    </w:lvl>
+    <w:lvl w:ilvl="4" w:tplc="40090003" w:tentative="1">
+      <w:start w:val="1"/>
+      <w:numFmt w:val="bullet"/>
+      <w:lvlText w:val="o"/>
+      <w:lvlJc w:val="left"/>
+      <w:pPr>
+        <w:ind w:left="3600" w:hanging="360"/>
+      </w:pPr>
+      <w:rPr>
+        <w:rFonts w:ascii="Courier New" w:hAnsi="Courier New" w:cs="Courier New" w:hint="default"/>
+      </w:rPr>
+    </w:lvl>
+    <w:lvl w:ilvl="5" w:tplc="40090005" w:tentative="1">
+      <w:start w:val="1"/>
+      <w:numFmt w:val="bullet"/>
+      <w:lvlText w:val=""/>
+      <w:lvlJc w:val="left"/>
+      <w:pPr>
+        <w:ind w:left="4320" w:hanging="360"/>
+      </w:pPr>
+      <w:rPr>
+        <w:rFonts w:ascii="Wingdings" w:hAnsi="Wingdings" w:hint="default"/>
+      </w:rPr>
+    </w:lvl>
+    <w:lvl w:ilvl="6" w:tplc="40090001" w:tentative="1">
+      <w:start w:val="1"/>
+      <w:numFmt w:val="bullet"/>
+      <w:lvlText w:val=""/>
+      <w:lvlJc w:val="left"/>
+      <w:pPr>
+        <w:ind w:left="5040" w:hanging="360"/>
+      </w:pPr>
+      <w:rPr>
+        <w:rFonts w:ascii="Symbol" w:hAnsi="Symbol" w:hint="default"/>
+      </w:rPr>
+    </w:lvl>
+    <w:lvl w:ilvl="7" w:tplc="40090003" w:tentative="1">
+      <w:start w:val="1"/>
+      <w:numFmt w:val="bullet"/>
+      <w:lvlText w:val="o"/>
+      <w:lvlJc w:val="left"/>
+      <w:pPr>
+        <w:ind w:left="5760" w:hanging="360"/>
+      </w:pPr>
+      <w:rPr>
+        <w:rFonts w:ascii="Courier New" w:hAnsi="Courier New" w:cs="Courier New" w:hint="default"/>
+      </w:rPr>
+    </w:lvl>
+    <w:lvl w:ilvl="8" w:tplc="40090005" w:tentative="1">
+      <w:start w:val="1"/>
+      <w:numFmt w:val="bullet"/>
+      <w:lvlText w:val=""/>
+      <w:lvlJc w:val="left"/>
+      <w:pPr>
+        <w:ind w:left="6480" w:hanging="360"/>
+      </w:pPr>
+      <w:rPr>
+        <w:rFonts w:ascii="Wingdings" w:hAnsi="Wingdings" w:hint="default"/>
+      </w:rPr>
+    </w:lvl>
+  </w:abstractNum>
+  <w:abstractNum w:abstractNumId="3" w15:restartNumberingAfterBreak="0">
     <w:nsid w:val="33F46773"/>
     <w:multiLevelType w:val="hybridMultilevel"/>
     <w:tmpl w:val="054EE412"/>
@@ -8506,7 +11340,7 @@
       </w:rPr>
     </w:lvl>
   </w:abstractNum>
-  <w:abstractNum w:abstractNumId="3" w15:restartNumberingAfterBreak="0">
+  <w:abstractNum w:abstractNumId="4" w15:restartNumberingAfterBreak="0">
     <w:nsid w:val="422547C4"/>
     <w:multiLevelType w:val="hybridMultilevel"/>
     <w:tmpl w:val="F71217C4"/>
@@ -8619,7 +11453,7 @@
       </w:rPr>
     </w:lvl>
   </w:abstractNum>
-  <w:abstractNum w:abstractNumId="4" w15:restartNumberingAfterBreak="0">
+  <w:abstractNum w:abstractNumId="5" w15:restartNumberingAfterBreak="0">
     <w:nsid w:val="58882618"/>
     <w:multiLevelType w:val="hybridMultilevel"/>
     <w:tmpl w:val="26F88210"/>
@@ -8732,7 +11566,7 @@
       </w:rPr>
     </w:lvl>
   </w:abstractNum>
-  <w:abstractNum w:abstractNumId="5" w15:restartNumberingAfterBreak="0">
+  <w:abstractNum w:abstractNumId="6" w15:restartNumberingAfterBreak="0">
     <w:nsid w:val="7F2B7108"/>
     <w:multiLevelType w:val="hybridMultilevel"/>
     <w:tmpl w:val="3D3A4710"/>
@@ -8849,18 +11683,21 @@
     <w:abstractNumId w:val="0"/>
   </w:num>
   <w:num w:numId="2" w16cid:durableId="1449620020">
-    <w:abstractNumId w:val="5"/>
+    <w:abstractNumId w:val="6"/>
   </w:num>
   <w:num w:numId="3" w16cid:durableId="1833835701">
     <w:abstractNumId w:val="1"/>
   </w:num>
   <w:num w:numId="4" w16cid:durableId="1628658768">
+    <w:abstractNumId w:val="4"/>
+  </w:num>
+  <w:num w:numId="5" w16cid:durableId="348023977">
+    <w:abstractNumId w:val="5"/>
+  </w:num>
+  <w:num w:numId="6" w16cid:durableId="1829830663">
     <w:abstractNumId w:val="3"/>
   </w:num>
-  <w:num w:numId="5" w16cid:durableId="348023977">
-    <w:abstractNumId w:val="4"/>
-  </w:num>
-  <w:num w:numId="6" w16cid:durableId="1829830663">
+  <w:num w:numId="7" w16cid:durableId="520359720">
     <w:abstractNumId w:val="2"/>
   </w:num>
 </w:numbering>
@@ -9270,7 +12107,6 @@
   <w:style w:type="character" w:default="1" w:styleId="DefaultParagraphFont">
     <w:name w:val="Default Paragraph Font"/>
     <w:uiPriority w:val="1"/>
-    <w:semiHidden/>
     <w:unhideWhenUsed/>
   </w:style>
   <w:style w:type="table" w:default="1" w:styleId="TableNormal">

</xml_diff>